<commit_message>
Refresh durable project memory
</commit_message>
<xml_diff>
--- a/data/觀察版資料/13_專案記憶/專案記憶與討論摘要.docx
+++ b/data/觀察版資料/13_專案記憶/專案記憶與討論摘要.docx
@@ -9,7 +9,7 @@
       </w:pPr>
       <w:r>
         <w:rPr>
-          <w:rFonts w:ascii="PingFangTC-Regular" w:hAnsi="PingFangTC-Regular" w:eastAsia="PingFangTC-Regular" w:cs="PingFangTC-Regular"/>
+          <w:rFonts w:ascii="Heiti TC" w:hAnsi="Heiti TC" w:eastAsia="Heiti TC" w:cs="Heiti TC"/>
           <w:b w:val="0"/>
           <w:sz w:val="40"/>
         </w:rPr>
@@ -22,11 +22,11 @@
       </w:pPr>
       <w:r>
         <w:rPr>
-          <w:rFonts w:ascii="PingFangTC-Regular" w:hAnsi="PingFangTC-Regular" w:eastAsia="PingFangTC-Regular" w:cs="PingFangTC-Regular"/>
+          <w:rFonts w:ascii="Heiti TC" w:hAnsi="Heiti TC" w:eastAsia="Heiti TC" w:cs="Heiti TC"/>
           <w:b w:val="0"/>
           <w:sz w:val="20"/>
         </w:rPr>
-        <w:t>產生時間：2026-10-21 07:13 UTC｜來源：專案記憶資料夾</w:t>
+        <w:t>產生時間：2026-10-21 10:24 UTC｜來源：專案記憶資料夾</w:t>
       </w:r>
     </w:p>
     <w:p>
@@ -35,7 +35,7 @@
       </w:pPr>
       <w:r>
         <w:rPr>
-          <w:rFonts w:ascii="PingFangTC-Regular" w:hAnsi="PingFangTC-Regular" w:eastAsia="PingFangTC-Regular" w:cs="PingFangTC-Regular"/>
+          <w:rFonts w:ascii="Heiti TC" w:hAnsi="Heiti TC" w:eastAsia="Heiti TC" w:cs="Heiti TC"/>
           <w:b w:val="0"/>
           <w:sz w:val="22"/>
         </w:rPr>
@@ -48,7 +48,7 @@
       </w:pPr>
       <w:r>
         <w:rPr>
-          <w:rFonts w:ascii="PingFangTC-Regular" w:hAnsi="PingFangTC-Regular" w:eastAsia="PingFangTC-Regular" w:cs="PingFangTC-Regular"/>
+          <w:rFonts w:ascii="Heiti TC" w:hAnsi="Heiti TC" w:eastAsia="Heiti TC" w:cs="Heiti TC"/>
           <w:b w:val="0"/>
           <w:sz w:val="26"/>
         </w:rPr>
@@ -78,7 +78,7 @@
             </w:pPr>
             <w:r>
               <w:rPr>
-                <w:rFonts w:ascii="PingFangTC-Regular" w:hAnsi="PingFangTC-Regular" w:eastAsia="PingFangTC-Regular" w:cs="PingFangTC-Regular"/>
+                <w:rFonts w:ascii="Heiti TC" w:hAnsi="Heiti TC" w:eastAsia="Heiti TC" w:cs="Heiti TC"/>
                 <w:b/>
                 <w:sz w:val="20"/>
               </w:rPr>
@@ -96,7 +96,7 @@
             </w:pPr>
             <w:r>
               <w:rPr>
-                <w:rFonts w:ascii="PingFangTC-Regular" w:hAnsi="PingFangTC-Regular" w:eastAsia="PingFangTC-Regular" w:cs="PingFangTC-Regular"/>
+                <w:rFonts w:ascii="Heiti TC" w:hAnsi="Heiti TC" w:eastAsia="Heiti TC" w:cs="Heiti TC"/>
                 <w:b/>
                 <w:sz w:val="20"/>
               </w:rPr>
@@ -114,7 +114,7 @@
             </w:pPr>
             <w:r>
               <w:rPr>
-                <w:rFonts w:ascii="PingFangTC-Regular" w:hAnsi="PingFangTC-Regular" w:eastAsia="PingFangTC-Regular" w:cs="PingFangTC-Regular"/>
+                <w:rFonts w:ascii="Heiti TC" w:hAnsi="Heiti TC" w:eastAsia="Heiti TC" w:cs="Heiti TC"/>
                 <w:b/>
                 <w:sz w:val="20"/>
               </w:rPr>
@@ -134,7 +134,7 @@
             </w:pPr>
             <w:r>
               <w:rPr>
-                <w:rFonts w:ascii="PingFangTC-Regular" w:hAnsi="PingFangTC-Regular" w:eastAsia="PingFangTC-Regular" w:cs="PingFangTC-Regular"/>
+                <w:rFonts w:ascii="Heiti TC" w:hAnsi="Heiti TC" w:eastAsia="Heiti TC" w:cs="Heiti TC"/>
                 <w:b w:val="0"/>
                 <w:sz w:val="20"/>
               </w:rPr>
@@ -152,11 +152,11 @@
             </w:pPr>
             <w:r>
               <w:rPr>
-                <w:rFonts w:ascii="PingFangTC-Regular" w:hAnsi="PingFangTC-Regular" w:eastAsia="PingFangTC-Regular" w:cs="PingFangTC-Regular"/>
+                <w:rFonts w:ascii="Heiti TC" w:hAnsi="Heiti TC" w:eastAsia="Heiti TC" w:cs="Heiti TC"/>
                 <w:b w:val="0"/>
                 <w:sz w:val="20"/>
               </w:rPr>
-              <w:t>18</w:t>
+              <w:t>20</w:t>
             </w:r>
           </w:p>
         </w:tc>
@@ -170,7 +170,7 @@
             </w:pPr>
             <w:r>
               <w:rPr>
-                <w:rFonts w:ascii="PingFangTC-Regular" w:hAnsi="PingFangTC-Regular" w:eastAsia="PingFangTC-Regular" w:cs="PingFangTC-Regular"/>
+                <w:rFonts w:ascii="Heiti TC" w:hAnsi="Heiti TC" w:eastAsia="Heiti TC" w:cs="Heiti TC"/>
                 <w:b w:val="0"/>
                 <w:sz w:val="20"/>
               </w:rPr>
@@ -190,7 +190,7 @@
             </w:pPr>
             <w:r>
               <w:rPr>
-                <w:rFonts w:ascii="PingFangTC-Regular" w:hAnsi="PingFangTC-Regular" w:eastAsia="PingFangTC-Regular" w:cs="PingFangTC-Regular"/>
+                <w:rFonts w:ascii="Heiti TC" w:hAnsi="Heiti TC" w:eastAsia="Heiti TC" w:cs="Heiti TC"/>
                 <w:b w:val="0"/>
                 <w:sz w:val="20"/>
               </w:rPr>
@@ -208,11 +208,11 @@
             </w:pPr>
             <w:r>
               <w:rPr>
-                <w:rFonts w:ascii="PingFangTC-Regular" w:hAnsi="PingFangTC-Regular" w:eastAsia="PingFangTC-Regular" w:cs="PingFangTC-Regular"/>
+                <w:rFonts w:ascii="Heiti TC" w:hAnsi="Heiti TC" w:eastAsia="Heiti TC" w:cs="Heiti TC"/>
                 <w:b w:val="0"/>
                 <w:sz w:val="20"/>
               </w:rPr>
-              <w:t>17</w:t>
+              <w:t>19</w:t>
             </w:r>
           </w:p>
         </w:tc>
@@ -226,7 +226,7 @@
             </w:pPr>
             <w:r>
               <w:rPr>
-                <w:rFonts w:ascii="PingFangTC-Regular" w:hAnsi="PingFangTC-Regular" w:eastAsia="PingFangTC-Regular" w:cs="PingFangTC-Regular"/>
+                <w:rFonts w:ascii="Heiti TC" w:hAnsi="Heiti TC" w:eastAsia="Heiti TC" w:cs="Heiti TC"/>
                 <w:b w:val="0"/>
                 <w:sz w:val="20"/>
               </w:rPr>
@@ -246,7 +246,7 @@
             </w:pPr>
             <w:r>
               <w:rPr>
-                <w:rFonts w:ascii="PingFangTC-Regular" w:hAnsi="PingFangTC-Regular" w:eastAsia="PingFangTC-Regular" w:cs="PingFangTC-Regular"/>
+                <w:rFonts w:ascii="Heiti TC" w:hAnsi="Heiti TC" w:eastAsia="Heiti TC" w:cs="Heiti TC"/>
                 <w:b w:val="0"/>
                 <w:sz w:val="20"/>
               </w:rPr>
@@ -264,7 +264,7 @@
             </w:pPr>
             <w:r>
               <w:rPr>
-                <w:rFonts w:ascii="PingFangTC-Regular" w:hAnsi="PingFangTC-Regular" w:eastAsia="PingFangTC-Regular" w:cs="PingFangTC-Regular"/>
+                <w:rFonts w:ascii="Heiti TC" w:hAnsi="Heiti TC" w:eastAsia="Heiti TC" w:cs="Heiti TC"/>
                 <w:b w:val="0"/>
                 <w:sz w:val="20"/>
               </w:rPr>
@@ -282,7 +282,7 @@
             </w:pPr>
             <w:r>
               <w:rPr>
-                <w:rFonts w:ascii="PingFangTC-Regular" w:hAnsi="PingFangTC-Regular" w:eastAsia="PingFangTC-Regular" w:cs="PingFangTC-Regular"/>
+                <w:rFonts w:ascii="Heiti TC" w:hAnsi="Heiti TC" w:eastAsia="Heiti TC" w:cs="Heiti TC"/>
                 <w:b w:val="0"/>
                 <w:sz w:val="20"/>
               </w:rPr>
@@ -302,7 +302,7 @@
             </w:pPr>
             <w:r>
               <w:rPr>
-                <w:rFonts w:ascii="PingFangTC-Regular" w:hAnsi="PingFangTC-Regular" w:eastAsia="PingFangTC-Regular" w:cs="PingFangTC-Regular"/>
+                <w:rFonts w:ascii="Heiti TC" w:hAnsi="Heiti TC" w:eastAsia="Heiti TC" w:cs="Heiti TC"/>
                 <w:b w:val="0"/>
                 <w:sz w:val="20"/>
               </w:rPr>
@@ -320,11 +320,11 @@
             </w:pPr>
             <w:r>
               <w:rPr>
-                <w:rFonts w:ascii="PingFangTC-Regular" w:hAnsi="PingFangTC-Regular" w:eastAsia="PingFangTC-Regular" w:cs="PingFangTC-Regular"/>
+                <w:rFonts w:ascii="Heiti TC" w:hAnsi="Heiti TC" w:eastAsia="Heiti TC" w:cs="Heiti TC"/>
                 <w:b w:val="0"/>
                 <w:sz w:val="20"/>
               </w:rPr>
-              <w:t>2026-08-02</w:t>
+              <w:t>2026-10-21</w:t>
             </w:r>
           </w:p>
         </w:tc>
@@ -338,7 +338,7 @@
             </w:pPr>
             <w:r>
               <w:rPr>
-                <w:rFonts w:ascii="PingFangTC-Regular" w:hAnsi="PingFangTC-Regular" w:eastAsia="PingFangTC-Regular" w:cs="PingFangTC-Regular"/>
+                <w:rFonts w:ascii="Heiti TC" w:hAnsi="Heiti TC" w:eastAsia="Heiti TC" w:cs="Heiti TC"/>
                 <w:b w:val="0"/>
                 <w:sz w:val="20"/>
               </w:rPr>
@@ -354,7 +354,7 @@
       </w:pPr>
       <w:r>
         <w:rPr>
-          <w:rFonts w:ascii="PingFangTC-Regular" w:hAnsi="PingFangTC-Regular" w:eastAsia="PingFangTC-Regular" w:cs="PingFangTC-Regular"/>
+          <w:rFonts w:ascii="Heiti TC" w:hAnsi="Heiti TC" w:eastAsia="Heiti TC" w:cs="Heiti TC"/>
           <w:b w:val="0"/>
           <w:sz w:val="26"/>
         </w:rPr>
@@ -385,7 +385,7 @@
             </w:pPr>
             <w:r>
               <w:rPr>
-                <w:rFonts w:ascii="PingFangTC-Regular" w:hAnsi="PingFangTC-Regular" w:eastAsia="PingFangTC-Regular" w:cs="PingFangTC-Regular"/>
+                <w:rFonts w:ascii="Heiti TC" w:hAnsi="Heiti TC" w:eastAsia="Heiti TC" w:cs="Heiti TC"/>
                 <w:b/>
                 <w:sz w:val="20"/>
               </w:rPr>
@@ -403,7 +403,7 @@
             </w:pPr>
             <w:r>
               <w:rPr>
-                <w:rFonts w:ascii="PingFangTC-Regular" w:hAnsi="PingFangTC-Regular" w:eastAsia="PingFangTC-Regular" w:cs="PingFangTC-Regular"/>
+                <w:rFonts w:ascii="Heiti TC" w:hAnsi="Heiti TC" w:eastAsia="Heiti TC" w:cs="Heiti TC"/>
                 <w:b/>
                 <w:sz w:val="20"/>
               </w:rPr>
@@ -421,7 +421,7 @@
             </w:pPr>
             <w:r>
               <w:rPr>
-                <w:rFonts w:ascii="PingFangTC-Regular" w:hAnsi="PingFangTC-Regular" w:eastAsia="PingFangTC-Regular" w:cs="PingFangTC-Regular"/>
+                <w:rFonts w:ascii="Heiti TC" w:hAnsi="Heiti TC" w:eastAsia="Heiti TC" w:cs="Heiti TC"/>
                 <w:b/>
                 <w:sz w:val="20"/>
               </w:rPr>
@@ -439,7 +439,7 @@
             </w:pPr>
             <w:r>
               <w:rPr>
-                <w:rFonts w:ascii="PingFangTC-Regular" w:hAnsi="PingFangTC-Regular" w:eastAsia="PingFangTC-Regular" w:cs="PingFangTC-Regular"/>
+                <w:rFonts w:ascii="Heiti TC" w:hAnsi="Heiti TC" w:eastAsia="Heiti TC" w:cs="Heiti TC"/>
                 <w:b/>
                 <w:sz w:val="20"/>
               </w:rPr>
@@ -459,7 +459,7 @@
             </w:pPr>
             <w:r>
               <w:rPr>
-                <w:rFonts w:ascii="PingFangTC-Regular" w:hAnsi="PingFangTC-Regular" w:eastAsia="PingFangTC-Regular" w:cs="PingFangTC-Regular"/>
+                <w:rFonts w:ascii="Heiti TC" w:hAnsi="Heiti TC" w:eastAsia="Heiti TC" w:cs="Heiti TC"/>
                 <w:b w:val="0"/>
                 <w:sz w:val="20"/>
               </w:rPr>
@@ -477,11 +477,11 @@
             </w:pPr>
             <w:r>
               <w:rPr>
-                <w:rFonts w:ascii="PingFangTC-Regular" w:hAnsi="PingFangTC-Regular" w:eastAsia="PingFangTC-Regular" w:cs="PingFangTC-Regular"/>
+                <w:rFonts w:ascii="Heiti TC" w:hAnsi="Heiti TC" w:eastAsia="Heiti TC" w:cs="Heiti TC"/>
                 <w:b w:val="0"/>
                 <w:sz w:val="20"/>
               </w:rPr>
-              <w:t>2026-08-02</w:t>
+              <w:t>2026-10-21</w:t>
             </w:r>
           </w:p>
         </w:tc>
@@ -495,11 +495,11 @@
             </w:pPr>
             <w:r>
               <w:rPr>
-                <w:rFonts w:ascii="PingFangTC-Regular" w:hAnsi="PingFangTC-Regular" w:eastAsia="PingFangTC-Regular" w:cs="PingFangTC-Regular"/>
+                <w:rFonts w:ascii="Heiti TC" w:hAnsi="Heiti TC" w:eastAsia="Heiti TC" w:cs="Heiti TC"/>
                 <w:b w:val="0"/>
                 <w:sz w:val="20"/>
               </w:rPr>
-              <w:t>AI 摘要改為個人研究優先模式</w:t>
+              <w:t>模型快取精簡發布與 40 MB 安全門檻</w:t>
             </w:r>
           </w:p>
         </w:tc>
@@ -513,7 +513,7 @@
             </w:pPr>
             <w:r>
               <w:rPr>
-                <w:rFonts w:ascii="PingFangTC-Regular" w:hAnsi="PingFangTC-Regular" w:eastAsia="PingFangTC-Regular" w:cs="PingFangTC-Regular"/>
+                <w:rFonts w:ascii="Heiti TC" w:hAnsi="Heiti TC" w:eastAsia="Heiti TC" w:cs="Heiti TC"/>
                 <w:b w:val="0"/>
                 <w:sz w:val="20"/>
               </w:rPr>
@@ -533,7 +533,7 @@
             </w:pPr>
             <w:r>
               <w:rPr>
-                <w:rFonts w:ascii="PingFangTC-Regular" w:hAnsi="PingFangTC-Regular" w:eastAsia="PingFangTC-Regular" w:cs="PingFangTC-Regular"/>
+                <w:rFonts w:ascii="Heiti TC" w:hAnsi="Heiti TC" w:eastAsia="Heiti TC" w:cs="Heiti TC"/>
                 <w:b w:val="0"/>
                 <w:sz w:val="20"/>
               </w:rPr>
@@ -551,11 +551,11 @@
             </w:pPr>
             <w:r>
               <w:rPr>
-                <w:rFonts w:ascii="PingFangTC-Regular" w:hAnsi="PingFangTC-Regular" w:eastAsia="PingFangTC-Regular" w:cs="PingFangTC-Regular"/>
+                <w:rFonts w:ascii="Heiti TC" w:hAnsi="Heiti TC" w:eastAsia="Heiti TC" w:cs="Heiti TC"/>
                 <w:b w:val="0"/>
                 <w:sz w:val="20"/>
               </w:rPr>
-              <w:t>2026-07-26</w:t>
+              <w:t>2026-10-21</w:t>
             </w:r>
           </w:p>
         </w:tc>
@@ -569,11 +569,11 @@
             </w:pPr>
             <w:r>
               <w:rPr>
-                <w:rFonts w:ascii="PingFangTC-Regular" w:hAnsi="PingFangTC-Regular" w:eastAsia="PingFangTC-Regular" w:cs="PingFangTC-Regular"/>
+                <w:rFonts w:ascii="Heiti TC" w:hAnsi="Heiti TC" w:eastAsia="Heiti TC" w:cs="Heiti TC"/>
                 <w:b w:val="0"/>
                 <w:sz w:val="20"/>
               </w:rPr>
-              <w:t>LSTM 基準比較與機率校準</w:t>
+              <w:t>八檔共享模型與 TSLA 專屬模型</w:t>
             </w:r>
           </w:p>
         </w:tc>
@@ -587,7 +587,7 @@
             </w:pPr>
             <w:r>
               <w:rPr>
-                <w:rFonts w:ascii="PingFangTC-Regular" w:hAnsi="PingFangTC-Regular" w:eastAsia="PingFangTC-Regular" w:cs="PingFangTC-Regular"/>
+                <w:rFonts w:ascii="Heiti TC" w:hAnsi="Heiti TC" w:eastAsia="Heiti TC" w:cs="Heiti TC"/>
                 <w:b w:val="0"/>
                 <w:sz w:val="20"/>
               </w:rPr>
@@ -607,7 +607,7 @@
             </w:pPr>
             <w:r>
               <w:rPr>
-                <w:rFonts w:ascii="PingFangTC-Regular" w:hAnsi="PingFangTC-Regular" w:eastAsia="PingFangTC-Regular" w:cs="PingFangTC-Regular"/>
+                <w:rFonts w:ascii="Heiti TC" w:hAnsi="Heiti TC" w:eastAsia="Heiti TC" w:cs="Heiti TC"/>
                 <w:b w:val="0"/>
                 <w:sz w:val="20"/>
               </w:rPr>
@@ -625,11 +625,11 @@
             </w:pPr>
             <w:r>
               <w:rPr>
-                <w:rFonts w:ascii="PingFangTC-Regular" w:hAnsi="PingFangTC-Regular" w:eastAsia="PingFangTC-Regular" w:cs="PingFangTC-Regular"/>
+                <w:rFonts w:ascii="Heiti TC" w:hAnsi="Heiti TC" w:eastAsia="Heiti TC" w:cs="Heiti TC"/>
                 <w:b w:val="0"/>
                 <w:sz w:val="20"/>
               </w:rPr>
-              <w:t>2026-07-26</w:t>
+              <w:t>2026-08-02</w:t>
             </w:r>
           </w:p>
         </w:tc>
@@ -643,11 +643,11 @@
             </w:pPr>
             <w:r>
               <w:rPr>
-                <w:rFonts w:ascii="PingFangTC-Regular" w:hAnsi="PingFangTC-Regular" w:eastAsia="PingFangTC-Regular" w:cs="PingFangTC-Regular"/>
+                <w:rFonts w:ascii="Heiti TC" w:hAnsi="Heiti TC" w:eastAsia="Heiti TC" w:cs="Heiti TC"/>
                 <w:b w:val="0"/>
                 <w:sz w:val="20"/>
               </w:rPr>
-              <w:t>KG 歷史回測資格與因子有效性報告</w:t>
+              <w:t>AI 摘要改為個人研究優先模式</w:t>
             </w:r>
           </w:p>
         </w:tc>
@@ -661,7 +661,7 @@
             </w:pPr>
             <w:r>
               <w:rPr>
-                <w:rFonts w:ascii="PingFangTC-Regular" w:hAnsi="PingFangTC-Regular" w:eastAsia="PingFangTC-Regular" w:cs="PingFangTC-Regular"/>
+                <w:rFonts w:ascii="Heiti TC" w:hAnsi="Heiti TC" w:eastAsia="Heiti TC" w:cs="Heiti TC"/>
                 <w:b w:val="0"/>
                 <w:sz w:val="20"/>
               </w:rPr>
@@ -681,7 +681,7 @@
             </w:pPr>
             <w:r>
               <w:rPr>
-                <w:rFonts w:ascii="PingFangTC-Regular" w:hAnsi="PingFangTC-Regular" w:eastAsia="PingFangTC-Regular" w:cs="PingFangTC-Regular"/>
+                <w:rFonts w:ascii="Heiti TC" w:hAnsi="Heiti TC" w:eastAsia="Heiti TC" w:cs="Heiti TC"/>
                 <w:b w:val="0"/>
                 <w:sz w:val="20"/>
               </w:rPr>
@@ -699,11 +699,11 @@
             </w:pPr>
             <w:r>
               <w:rPr>
-                <w:rFonts w:ascii="PingFangTC-Regular" w:hAnsi="PingFangTC-Regular" w:eastAsia="PingFangTC-Regular" w:cs="PingFangTC-Regular"/>
+                <w:rFonts w:ascii="Heiti TC" w:hAnsi="Heiti TC" w:eastAsia="Heiti TC" w:cs="Heiti TC"/>
                 <w:b w:val="0"/>
                 <w:sz w:val="20"/>
               </w:rPr>
-              <w:t>2026-07-24</w:t>
+              <w:t>2026-07-26</w:t>
             </w:r>
           </w:p>
         </w:tc>
@@ -717,11 +717,11 @@
             </w:pPr>
             <w:r>
               <w:rPr>
-                <w:rFonts w:ascii="PingFangTC-Regular" w:hAnsi="PingFangTC-Regular" w:eastAsia="PingFangTC-Regular" w:cs="PingFangTC-Regular"/>
+                <w:rFonts w:ascii="Heiti TC" w:hAnsi="Heiti TC" w:eastAsia="Heiti TC" w:cs="Heiti TC"/>
                 <w:b w:val="0"/>
                 <w:sz w:val="20"/>
               </w:rPr>
-              <w:t>專案記憶受控寫入流程</w:t>
+              <w:t>LSTM 基準比較與機率校準</w:t>
             </w:r>
           </w:p>
         </w:tc>
@@ -735,7 +735,7 @@
             </w:pPr>
             <w:r>
               <w:rPr>
-                <w:rFonts w:ascii="PingFangTC-Regular" w:hAnsi="PingFangTC-Regular" w:eastAsia="PingFangTC-Regular" w:cs="PingFangTC-Regular"/>
+                <w:rFonts w:ascii="Heiti TC" w:hAnsi="Heiti TC" w:eastAsia="Heiti TC" w:cs="Heiti TC"/>
                 <w:b w:val="0"/>
                 <w:sz w:val="20"/>
               </w:rPr>
@@ -755,7 +755,7 @@
             </w:pPr>
             <w:r>
               <w:rPr>
-                <w:rFonts w:ascii="PingFangTC-Regular" w:hAnsi="PingFangTC-Regular" w:eastAsia="PingFangTC-Regular" w:cs="PingFangTC-Regular"/>
+                <w:rFonts w:ascii="Heiti TC" w:hAnsi="Heiti TC" w:eastAsia="Heiti TC" w:cs="Heiti TC"/>
                 <w:b w:val="0"/>
                 <w:sz w:val="20"/>
               </w:rPr>
@@ -773,11 +773,11 @@
             </w:pPr>
             <w:r>
               <w:rPr>
-                <w:rFonts w:ascii="PingFangTC-Regular" w:hAnsi="PingFangTC-Regular" w:eastAsia="PingFangTC-Regular" w:cs="PingFangTC-Regular"/>
+                <w:rFonts w:ascii="Heiti TC" w:hAnsi="Heiti TC" w:eastAsia="Heiti TC" w:cs="Heiti TC"/>
                 <w:b w:val="0"/>
                 <w:sz w:val="20"/>
               </w:rPr>
-              <w:t>2026-07-24</w:t>
+              <w:t>2026-07-26</w:t>
             </w:r>
           </w:p>
         </w:tc>
@@ -791,11 +791,11 @@
             </w:pPr>
             <w:r>
               <w:rPr>
-                <w:rFonts w:ascii="PingFangTC-Regular" w:hAnsi="PingFangTC-Regular" w:eastAsia="PingFangTC-Regular" w:cs="PingFangTC-Regular"/>
+                <w:rFonts w:ascii="Heiti TC" w:hAnsi="Heiti TC" w:eastAsia="Heiti TC" w:cs="Heiti TC"/>
                 <w:b w:val="0"/>
                 <w:sz w:val="20"/>
               </w:rPr>
-              <w:t>SEC point-in-time 基本面歷史資料</w:t>
+              <w:t>KG 歷史回測資格與因子有效性報告</w:t>
             </w:r>
           </w:p>
         </w:tc>
@@ -809,7 +809,7 @@
             </w:pPr>
             <w:r>
               <w:rPr>
-                <w:rFonts w:ascii="PingFangTC-Regular" w:hAnsi="PingFangTC-Regular" w:eastAsia="PingFangTC-Regular" w:cs="PingFangTC-Regular"/>
+                <w:rFonts w:ascii="Heiti TC" w:hAnsi="Heiti TC" w:eastAsia="Heiti TC" w:cs="Heiti TC"/>
                 <w:b w:val="0"/>
                 <w:sz w:val="20"/>
               </w:rPr>
@@ -829,7 +829,7 @@
             </w:pPr>
             <w:r>
               <w:rPr>
-                <w:rFonts w:ascii="PingFangTC-Regular" w:hAnsi="PingFangTC-Regular" w:eastAsia="PingFangTC-Regular" w:cs="PingFangTC-Regular"/>
+                <w:rFonts w:ascii="Heiti TC" w:hAnsi="Heiti TC" w:eastAsia="Heiti TC" w:cs="Heiti TC"/>
                 <w:b w:val="0"/>
                 <w:sz w:val="20"/>
               </w:rPr>
@@ -847,11 +847,11 @@
             </w:pPr>
             <w:r>
               <w:rPr>
-                <w:rFonts w:ascii="PingFangTC-Regular" w:hAnsi="PingFangTC-Regular" w:eastAsia="PingFangTC-Regular" w:cs="PingFangTC-Regular"/>
+                <w:rFonts w:ascii="Heiti TC" w:hAnsi="Heiti TC" w:eastAsia="Heiti TC" w:cs="Heiti TC"/>
                 <w:b w:val="0"/>
                 <w:sz w:val="20"/>
               </w:rPr>
-              <w:t>2026-08-02</w:t>
+              <w:t>2026-10-21</w:t>
             </w:r>
           </w:p>
         </w:tc>
@@ -865,11 +865,11 @@
             </w:pPr>
             <w:r>
               <w:rPr>
-                <w:rFonts w:ascii="PingFangTC-Regular" w:hAnsi="PingFangTC-Regular" w:eastAsia="PingFangTC-Regular" w:cs="PingFangTC-Regular"/>
+                <w:rFonts w:ascii="Heiti TC" w:hAnsi="Heiti TC" w:eastAsia="Heiti TC" w:cs="Heiti TC"/>
                 <w:b w:val="0"/>
                 <w:sz w:val="20"/>
               </w:rPr>
-              <w:t>AI 摘要改為個人研究優先模式</w:t>
+              <w:t>模型快取精簡發布與 40 MB 安全門檻</w:t>
             </w:r>
           </w:p>
         </w:tc>
@@ -883,7 +883,7 @@
             </w:pPr>
             <w:r>
               <w:rPr>
-                <w:rFonts w:ascii="PingFangTC-Regular" w:hAnsi="PingFangTC-Regular" w:eastAsia="PingFangTC-Regular" w:cs="PingFangTC-Regular"/>
+                <w:rFonts w:ascii="Heiti TC" w:hAnsi="Heiti TC" w:eastAsia="Heiti TC" w:cs="Heiti TC"/>
                 <w:b w:val="0"/>
                 <w:sz w:val="20"/>
               </w:rPr>
@@ -903,7 +903,7 @@
             </w:pPr>
             <w:r>
               <w:rPr>
-                <w:rFonts w:ascii="PingFangTC-Regular" w:hAnsi="PingFangTC-Regular" w:eastAsia="PingFangTC-Regular" w:cs="PingFangTC-Regular"/>
+                <w:rFonts w:ascii="Heiti TC" w:hAnsi="Heiti TC" w:eastAsia="Heiti TC" w:cs="Heiti TC"/>
                 <w:b w:val="0"/>
                 <w:sz w:val="20"/>
               </w:rPr>
@@ -921,11 +921,11 @@
             </w:pPr>
             <w:r>
               <w:rPr>
-                <w:rFonts w:ascii="PingFangTC-Regular" w:hAnsi="PingFangTC-Regular" w:eastAsia="PingFangTC-Regular" w:cs="PingFangTC-Regular"/>
+                <w:rFonts w:ascii="Heiti TC" w:hAnsi="Heiti TC" w:eastAsia="Heiti TC" w:cs="Heiti TC"/>
                 <w:b w:val="0"/>
                 <w:sz w:val="20"/>
               </w:rPr>
-              <w:t>2026-07-26</w:t>
+              <w:t>2026-10-21</w:t>
             </w:r>
           </w:p>
         </w:tc>
@@ -939,11 +939,11 @@
             </w:pPr>
             <w:r>
               <w:rPr>
-                <w:rFonts w:ascii="PingFangTC-Regular" w:hAnsi="PingFangTC-Regular" w:eastAsia="PingFangTC-Regular" w:cs="PingFangTC-Regular"/>
+                <w:rFonts w:ascii="Heiti TC" w:hAnsi="Heiti TC" w:eastAsia="Heiti TC" w:cs="Heiti TC"/>
                 <w:b w:val="0"/>
                 <w:sz w:val="20"/>
               </w:rPr>
-              <w:t>KG 歷史回測資格與因子有效性報告</w:t>
+              <w:t>八檔共享模型與 TSLA 專屬模型</w:t>
             </w:r>
           </w:p>
         </w:tc>
@@ -957,7 +957,7 @@
             </w:pPr>
             <w:r>
               <w:rPr>
-                <w:rFonts w:ascii="PingFangTC-Regular" w:hAnsi="PingFangTC-Regular" w:eastAsia="PingFangTC-Regular" w:cs="PingFangTC-Regular"/>
+                <w:rFonts w:ascii="Heiti TC" w:hAnsi="Heiti TC" w:eastAsia="Heiti TC" w:cs="Heiti TC"/>
                 <w:b w:val="0"/>
                 <w:sz w:val="20"/>
               </w:rPr>
@@ -977,7 +977,7 @@
             </w:pPr>
             <w:r>
               <w:rPr>
-                <w:rFonts w:ascii="PingFangTC-Regular" w:hAnsi="PingFangTC-Regular" w:eastAsia="PingFangTC-Regular" w:cs="PingFangTC-Regular"/>
+                <w:rFonts w:ascii="Heiti TC" w:hAnsi="Heiti TC" w:eastAsia="Heiti TC" w:cs="Heiti TC"/>
                 <w:b w:val="0"/>
                 <w:sz w:val="20"/>
               </w:rPr>
@@ -995,11 +995,11 @@
             </w:pPr>
             <w:r>
               <w:rPr>
-                <w:rFonts w:ascii="PingFangTC-Regular" w:hAnsi="PingFangTC-Regular" w:eastAsia="PingFangTC-Regular" w:cs="PingFangTC-Regular"/>
+                <w:rFonts w:ascii="Heiti TC" w:hAnsi="Heiti TC" w:eastAsia="Heiti TC" w:cs="Heiti TC"/>
                 <w:b w:val="0"/>
                 <w:sz w:val="20"/>
               </w:rPr>
-              <w:t>2026-07-26</w:t>
+              <w:t>2026-08-02</w:t>
             </w:r>
           </w:p>
         </w:tc>
@@ -1013,11 +1013,11 @@
             </w:pPr>
             <w:r>
               <w:rPr>
-                <w:rFonts w:ascii="PingFangTC-Regular" w:hAnsi="PingFangTC-Regular" w:eastAsia="PingFangTC-Regular" w:cs="PingFangTC-Regular"/>
+                <w:rFonts w:ascii="Heiti TC" w:hAnsi="Heiti TC" w:eastAsia="Heiti TC" w:cs="Heiti TC"/>
                 <w:b w:val="0"/>
                 <w:sz w:val="20"/>
               </w:rPr>
-              <w:t>LSTM 基準比較與機率校準</w:t>
+              <w:t>AI 摘要改為個人研究優先模式</w:t>
             </w:r>
           </w:p>
         </w:tc>
@@ -1031,7 +1031,7 @@
             </w:pPr>
             <w:r>
               <w:rPr>
-                <w:rFonts w:ascii="PingFangTC-Regular" w:hAnsi="PingFangTC-Regular" w:eastAsia="PingFangTC-Regular" w:cs="PingFangTC-Regular"/>
+                <w:rFonts w:ascii="Heiti TC" w:hAnsi="Heiti TC" w:eastAsia="Heiti TC" w:cs="Heiti TC"/>
                 <w:b w:val="0"/>
                 <w:sz w:val="20"/>
               </w:rPr>
@@ -1051,7 +1051,7 @@
             </w:pPr>
             <w:r>
               <w:rPr>
-                <w:rFonts w:ascii="PingFangTC-Regular" w:hAnsi="PingFangTC-Regular" w:eastAsia="PingFangTC-Regular" w:cs="PingFangTC-Regular"/>
+                <w:rFonts w:ascii="Heiti TC" w:hAnsi="Heiti TC" w:eastAsia="Heiti TC" w:cs="Heiti TC"/>
                 <w:b w:val="0"/>
                 <w:sz w:val="20"/>
               </w:rPr>
@@ -1069,11 +1069,11 @@
             </w:pPr>
             <w:r>
               <w:rPr>
-                <w:rFonts w:ascii="PingFangTC-Regular" w:hAnsi="PingFangTC-Regular" w:eastAsia="PingFangTC-Regular" w:cs="PingFangTC-Regular"/>
+                <w:rFonts w:ascii="Heiti TC" w:hAnsi="Heiti TC" w:eastAsia="Heiti TC" w:cs="Heiti TC"/>
                 <w:b w:val="0"/>
                 <w:sz w:val="20"/>
               </w:rPr>
-              <w:t>2026-07-24</w:t>
+              <w:t>2026-07-26</w:t>
             </w:r>
           </w:p>
         </w:tc>
@@ -1087,11 +1087,11 @@
             </w:pPr>
             <w:r>
               <w:rPr>
-                <w:rFonts w:ascii="PingFangTC-Regular" w:hAnsi="PingFangTC-Regular" w:eastAsia="PingFangTC-Regular" w:cs="PingFangTC-Regular"/>
+                <w:rFonts w:ascii="Heiti TC" w:hAnsi="Heiti TC" w:eastAsia="Heiti TC" w:cs="Heiti TC"/>
                 <w:b w:val="0"/>
                 <w:sz w:val="20"/>
               </w:rPr>
-              <w:t>KG 預測 V2 多因子趨勢觀察</w:t>
+              <w:t>LSTM 基準比較與機率校準</w:t>
             </w:r>
           </w:p>
         </w:tc>
@@ -1105,7 +1105,7 @@
             </w:pPr>
             <w:r>
               <w:rPr>
-                <w:rFonts w:ascii="PingFangTC-Regular" w:hAnsi="PingFangTC-Regular" w:eastAsia="PingFangTC-Regular" w:cs="PingFangTC-Regular"/>
+                <w:rFonts w:ascii="Heiti TC" w:hAnsi="Heiti TC" w:eastAsia="Heiti TC" w:cs="Heiti TC"/>
                 <w:b w:val="0"/>
                 <w:sz w:val="20"/>
               </w:rPr>
@@ -1125,7 +1125,7 @@
             </w:pPr>
             <w:r>
               <w:rPr>
-                <w:rFonts w:ascii="PingFangTC-Regular" w:hAnsi="PingFangTC-Regular" w:eastAsia="PingFangTC-Regular" w:cs="PingFangTC-Regular"/>
+                <w:rFonts w:ascii="Heiti TC" w:hAnsi="Heiti TC" w:eastAsia="Heiti TC" w:cs="Heiti TC"/>
                 <w:b w:val="0"/>
                 <w:sz w:val="20"/>
               </w:rPr>
@@ -1143,11 +1143,11 @@
             </w:pPr>
             <w:r>
               <w:rPr>
-                <w:rFonts w:ascii="PingFangTC-Regular" w:hAnsi="PingFangTC-Regular" w:eastAsia="PingFangTC-Regular" w:cs="PingFangTC-Regular"/>
+                <w:rFonts w:ascii="Heiti TC" w:hAnsi="Heiti TC" w:eastAsia="Heiti TC" w:cs="Heiti TC"/>
                 <w:b w:val="0"/>
                 <w:sz w:val="20"/>
               </w:rPr>
-              <w:t>2026-07-24</w:t>
+              <w:t>2026-07-26</w:t>
             </w:r>
           </w:p>
         </w:tc>
@@ -1161,11 +1161,11 @@
             </w:pPr>
             <w:r>
               <w:rPr>
-                <w:rFonts w:ascii="PingFangTC-Regular" w:hAnsi="PingFangTC-Regular" w:eastAsia="PingFangTC-Regular" w:cs="PingFangTC-Regular"/>
+                <w:rFonts w:ascii="Heiti TC" w:hAnsi="Heiti TC" w:eastAsia="Heiti TC" w:cs="Heiti TC"/>
                 <w:b w:val="0"/>
                 <w:sz w:val="20"/>
               </w:rPr>
-              <w:t>專案記憶受控寫入流程</w:t>
+              <w:t>KG 歷史回測資格與因子有效性報告</w:t>
             </w:r>
           </w:p>
         </w:tc>
@@ -1179,7 +1179,7 @@
             </w:pPr>
             <w:r>
               <w:rPr>
-                <w:rFonts w:ascii="PingFangTC-Regular" w:hAnsi="PingFangTC-Regular" w:eastAsia="PingFangTC-Regular" w:cs="PingFangTC-Regular"/>
+                <w:rFonts w:ascii="Heiti TC" w:hAnsi="Heiti TC" w:eastAsia="Heiti TC" w:cs="Heiti TC"/>
                 <w:b w:val="0"/>
                 <w:sz w:val="20"/>
               </w:rPr>
@@ -1195,7 +1195,7 @@
       </w:pPr>
       <w:r>
         <w:rPr>
-          <w:rFonts w:ascii="PingFangTC-Regular" w:hAnsi="PingFangTC-Regular" w:eastAsia="PingFangTC-Regular" w:cs="PingFangTC-Regular"/>
+          <w:rFonts w:ascii="Heiti TC" w:hAnsi="Heiti TC" w:eastAsia="Heiti TC" w:cs="Heiti TC"/>
           <w:b w:val="0"/>
           <w:sz w:val="32"/>
         </w:rPr>
@@ -1208,7 +1208,7 @@
       </w:pPr>
       <w:r>
         <w:rPr>
-          <w:rFonts w:ascii="PingFangTC-Regular" w:hAnsi="PingFangTC-Regular" w:eastAsia="PingFangTC-Regular" w:cs="PingFangTC-Regular"/>
+          <w:rFonts w:ascii="Heiti TC" w:hAnsi="Heiti TC" w:eastAsia="Heiti TC" w:cs="Heiti TC"/>
           <w:b w:val="0"/>
           <w:sz w:val="32"/>
         </w:rPr>
@@ -1221,7 +1221,7 @@
       </w:pPr>
       <w:r>
         <w:rPr>
-          <w:rFonts w:ascii="PingFangTC-Regular" w:hAnsi="PingFangTC-Regular" w:eastAsia="PingFangTC-Regular" w:cs="PingFangTC-Regular"/>
+          <w:rFonts w:ascii="Heiti TC" w:hAnsi="Heiti TC" w:eastAsia="Heiti TC" w:cs="Heiti TC"/>
           <w:b w:val="0"/>
           <w:sz w:val="26"/>
         </w:rPr>
@@ -1235,7 +1235,7 @@
       </w:pPr>
       <w:r>
         <w:rPr>
-          <w:rFonts w:ascii="PingFangTC-Regular" w:hAnsi="PingFangTC-Regular" w:eastAsia="PingFangTC-Regular" w:cs="PingFangTC-Regular"/>
+          <w:rFonts w:ascii="Heiti TC" w:hAnsi="Heiti TC" w:eastAsia="Heiti TC" w:cs="Heiti TC"/>
           <w:b w:val="0"/>
           <w:sz w:val="22"/>
         </w:rPr>
@@ -1249,7 +1249,7 @@
       </w:pPr>
       <w:r>
         <w:rPr>
-          <w:rFonts w:ascii="PingFangTC-Regular" w:hAnsi="PingFangTC-Regular" w:eastAsia="PingFangTC-Regular" w:cs="PingFangTC-Regular"/>
+          <w:rFonts w:ascii="Heiti TC" w:hAnsi="Heiti TC" w:eastAsia="Heiti TC" w:cs="Heiti TC"/>
           <w:b w:val="0"/>
           <w:sz w:val="22"/>
         </w:rPr>
@@ -1263,7 +1263,7 @@
       </w:pPr>
       <w:r>
         <w:rPr>
-          <w:rFonts w:ascii="PingFangTC-Regular" w:hAnsi="PingFangTC-Regular" w:eastAsia="PingFangTC-Regular" w:cs="PingFangTC-Regular"/>
+          <w:rFonts w:ascii="Heiti TC" w:hAnsi="Heiti TC" w:eastAsia="Heiti TC" w:cs="Heiti TC"/>
           <w:b w:val="0"/>
           <w:sz w:val="22"/>
         </w:rPr>
@@ -1277,7 +1277,7 @@
       </w:pPr>
       <w:r>
         <w:rPr>
-          <w:rFonts w:ascii="PingFangTC-Regular" w:hAnsi="PingFangTC-Regular" w:eastAsia="PingFangTC-Regular" w:cs="PingFangTC-Regular"/>
+          <w:rFonts w:ascii="Heiti TC" w:hAnsi="Heiti TC" w:eastAsia="Heiti TC" w:cs="Heiti TC"/>
           <w:b w:val="0"/>
           <w:sz w:val="22"/>
         </w:rPr>
@@ -1290,7 +1290,7 @@
       </w:pPr>
       <w:r>
         <w:rPr>
-          <w:rFonts w:ascii="PingFangTC-Regular" w:hAnsi="PingFangTC-Regular" w:eastAsia="PingFangTC-Regular" w:cs="PingFangTC-Regular"/>
+          <w:rFonts w:ascii="Heiti TC" w:hAnsi="Heiti TC" w:eastAsia="Heiti TC" w:cs="Heiti TC"/>
           <w:b w:val="0"/>
           <w:sz w:val="26"/>
         </w:rPr>
@@ -1304,7 +1304,7 @@
       </w:pPr>
       <w:r>
         <w:rPr>
-          <w:rFonts w:ascii="PingFangTC-Regular" w:hAnsi="PingFangTC-Regular" w:eastAsia="PingFangTC-Regular" w:cs="PingFangTC-Regular"/>
+          <w:rFonts w:ascii="Heiti TC" w:hAnsi="Heiti TC" w:eastAsia="Heiti TC" w:cs="Heiti TC"/>
           <w:b w:val="0"/>
           <w:sz w:val="22"/>
         </w:rPr>
@@ -1318,7 +1318,7 @@
       </w:pPr>
       <w:r>
         <w:rPr>
-          <w:rFonts w:ascii="PingFangTC-Regular" w:hAnsi="PingFangTC-Regular" w:eastAsia="PingFangTC-Regular" w:cs="PingFangTC-Regular"/>
+          <w:rFonts w:ascii="Heiti TC" w:hAnsi="Heiti TC" w:eastAsia="Heiti TC" w:cs="Heiti TC"/>
           <w:b w:val="0"/>
           <w:sz w:val="22"/>
         </w:rPr>
@@ -1332,7 +1332,7 @@
       </w:pPr>
       <w:r>
         <w:rPr>
-          <w:rFonts w:ascii="PingFangTC-Regular" w:hAnsi="PingFangTC-Regular" w:eastAsia="PingFangTC-Regular" w:cs="PingFangTC-Regular"/>
+          <w:rFonts w:ascii="Heiti TC" w:hAnsi="Heiti TC" w:eastAsia="Heiti TC" w:cs="Heiti TC"/>
           <w:b w:val="0"/>
           <w:sz w:val="22"/>
         </w:rPr>
@@ -1346,7 +1346,7 @@
       </w:pPr>
       <w:r>
         <w:rPr>
-          <w:rFonts w:ascii="PingFangTC-Regular" w:hAnsi="PingFangTC-Regular" w:eastAsia="PingFangTC-Regular" w:cs="PingFangTC-Regular"/>
+          <w:rFonts w:ascii="Heiti TC" w:hAnsi="Heiti TC" w:eastAsia="Heiti TC" w:cs="Heiti TC"/>
           <w:b w:val="0"/>
           <w:sz w:val="22"/>
         </w:rPr>
@@ -1360,7 +1360,7 @@
       </w:pPr>
       <w:r>
         <w:rPr>
-          <w:rFonts w:ascii="PingFangTC-Regular" w:hAnsi="PingFangTC-Regular" w:eastAsia="PingFangTC-Regular" w:cs="PingFangTC-Regular"/>
+          <w:rFonts w:ascii="Heiti TC" w:hAnsi="Heiti TC" w:eastAsia="Heiti TC" w:cs="Heiti TC"/>
           <w:b w:val="0"/>
           <w:sz w:val="22"/>
         </w:rPr>
@@ -1373,7 +1373,7 @@
       </w:pPr>
       <w:r>
         <w:rPr>
-          <w:rFonts w:ascii="PingFangTC-Regular" w:hAnsi="PingFangTC-Regular" w:eastAsia="PingFangTC-Regular" w:cs="PingFangTC-Regular"/>
+          <w:rFonts w:ascii="Heiti TC" w:hAnsi="Heiti TC" w:eastAsia="Heiti TC" w:cs="Heiti TC"/>
           <w:b w:val="0"/>
           <w:sz w:val="26"/>
         </w:rPr>
@@ -1387,7 +1387,7 @@
       </w:pPr>
       <w:r>
         <w:rPr>
-          <w:rFonts w:ascii="PingFangTC-Regular" w:hAnsi="PingFangTC-Regular" w:eastAsia="PingFangTC-Regular" w:cs="PingFangTC-Regular"/>
+          <w:rFonts w:ascii="Heiti TC" w:hAnsi="Heiti TC" w:eastAsia="Heiti TC" w:cs="Heiti TC"/>
           <w:b w:val="0"/>
           <w:sz w:val="22"/>
         </w:rPr>
@@ -1401,7 +1401,7 @@
       </w:pPr>
       <w:r>
         <w:rPr>
-          <w:rFonts w:ascii="PingFangTC-Regular" w:hAnsi="PingFangTC-Regular" w:eastAsia="PingFangTC-Regular" w:cs="PingFangTC-Regular"/>
+          <w:rFonts w:ascii="Heiti TC" w:hAnsi="Heiti TC" w:eastAsia="Heiti TC" w:cs="Heiti TC"/>
           <w:b w:val="0"/>
           <w:sz w:val="22"/>
         </w:rPr>
@@ -1415,7 +1415,7 @@
       </w:pPr>
       <w:r>
         <w:rPr>
-          <w:rFonts w:ascii="PingFangTC-Regular" w:hAnsi="PingFangTC-Regular" w:eastAsia="PingFangTC-Regular" w:cs="PingFangTC-Regular"/>
+          <w:rFonts w:ascii="Heiti TC" w:hAnsi="Heiti TC" w:eastAsia="Heiti TC" w:cs="Heiti TC"/>
           <w:b w:val="0"/>
           <w:sz w:val="22"/>
         </w:rPr>
@@ -1429,7 +1429,7 @@
       </w:pPr>
       <w:r>
         <w:rPr>
-          <w:rFonts w:ascii="PingFangTC-Regular" w:hAnsi="PingFangTC-Regular" w:eastAsia="PingFangTC-Regular" w:cs="PingFangTC-Regular"/>
+          <w:rFonts w:ascii="Heiti TC" w:hAnsi="Heiti TC" w:eastAsia="Heiti TC" w:cs="Heiti TC"/>
           <w:b w:val="0"/>
           <w:sz w:val="22"/>
         </w:rPr>
@@ -1443,7 +1443,7 @@
       </w:pPr>
       <w:r>
         <w:rPr>
-          <w:rFonts w:ascii="PingFangTC-Regular" w:hAnsi="PingFangTC-Regular" w:eastAsia="PingFangTC-Regular" w:cs="PingFangTC-Regular"/>
+          <w:rFonts w:ascii="Heiti TC" w:hAnsi="Heiti TC" w:eastAsia="Heiti TC" w:cs="Heiti TC"/>
           <w:b w:val="0"/>
           <w:sz w:val="22"/>
         </w:rPr>
@@ -1457,7 +1457,7 @@
       </w:pPr>
       <w:r>
         <w:rPr>
-          <w:rFonts w:ascii="PingFangTC-Regular" w:hAnsi="PingFangTC-Regular" w:eastAsia="PingFangTC-Regular" w:cs="PingFangTC-Regular"/>
+          <w:rFonts w:ascii="Heiti TC" w:hAnsi="Heiti TC" w:eastAsia="Heiti TC" w:cs="Heiti TC"/>
           <w:b w:val="0"/>
           <w:sz w:val="22"/>
         </w:rPr>
@@ -1470,7 +1470,7 @@
       </w:pPr>
       <w:r>
         <w:rPr>
-          <w:rFonts w:ascii="PingFangTC-Regular" w:hAnsi="PingFangTC-Regular" w:eastAsia="PingFangTC-Regular" w:cs="PingFangTC-Regular"/>
+          <w:rFonts w:ascii="Heiti TC" w:hAnsi="Heiti TC" w:eastAsia="Heiti TC" w:cs="Heiti TC"/>
           <w:b w:val="0"/>
           <w:sz w:val="26"/>
         </w:rPr>
@@ -1484,7 +1484,7 @@
       </w:pPr>
       <w:r>
         <w:rPr>
-          <w:rFonts w:ascii="PingFangTC-Regular" w:hAnsi="PingFangTC-Regular" w:eastAsia="PingFangTC-Regular" w:cs="PingFangTC-Regular"/>
+          <w:rFonts w:ascii="Heiti TC" w:hAnsi="Heiti TC" w:eastAsia="Heiti TC" w:cs="Heiti TC"/>
           <w:b w:val="0"/>
           <w:sz w:val="22"/>
         </w:rPr>
@@ -1498,7 +1498,7 @@
       </w:pPr>
       <w:r>
         <w:rPr>
-          <w:rFonts w:ascii="PingFangTC-Regular" w:hAnsi="PingFangTC-Regular" w:eastAsia="PingFangTC-Regular" w:cs="PingFangTC-Regular"/>
+          <w:rFonts w:ascii="Heiti TC" w:hAnsi="Heiti TC" w:eastAsia="Heiti TC" w:cs="Heiti TC"/>
           <w:b w:val="0"/>
           <w:sz w:val="22"/>
         </w:rPr>
@@ -1512,7 +1512,7 @@
       </w:pPr>
       <w:r>
         <w:rPr>
-          <w:rFonts w:ascii="PingFangTC-Regular" w:hAnsi="PingFangTC-Regular" w:eastAsia="PingFangTC-Regular" w:cs="PingFangTC-Regular"/>
+          <w:rFonts w:ascii="Heiti TC" w:hAnsi="Heiti TC" w:eastAsia="Heiti TC" w:cs="Heiti TC"/>
           <w:b w:val="0"/>
           <w:sz w:val="22"/>
         </w:rPr>
@@ -1526,7 +1526,7 @@
       </w:pPr>
       <w:r>
         <w:rPr>
-          <w:rFonts w:ascii="PingFangTC-Regular" w:hAnsi="PingFangTC-Regular" w:eastAsia="PingFangTC-Regular" w:cs="PingFangTC-Regular"/>
+          <w:rFonts w:ascii="Heiti TC" w:hAnsi="Heiti TC" w:eastAsia="Heiti TC" w:cs="Heiti TC"/>
           <w:b w:val="0"/>
           <w:sz w:val="22"/>
         </w:rPr>
@@ -1539,7 +1539,7 @@
       </w:pPr>
       <w:r>
         <w:rPr>
-          <w:rFonts w:ascii="PingFangTC-Regular" w:hAnsi="PingFangTC-Regular" w:eastAsia="PingFangTC-Regular" w:cs="PingFangTC-Regular"/>
+          <w:rFonts w:ascii="Heiti TC" w:hAnsi="Heiti TC" w:eastAsia="Heiti TC" w:cs="Heiti TC"/>
           <w:b w:val="0"/>
           <w:sz w:val="26"/>
         </w:rPr>
@@ -1553,7 +1553,7 @@
       </w:pPr>
       <w:r>
         <w:rPr>
-          <w:rFonts w:ascii="PingFangTC-Regular" w:hAnsi="PingFangTC-Regular" w:eastAsia="PingFangTC-Regular" w:cs="PingFangTC-Regular"/>
+          <w:rFonts w:ascii="Heiti TC" w:hAnsi="Heiti TC" w:eastAsia="Heiti TC" w:cs="Heiti TC"/>
           <w:b w:val="0"/>
           <w:sz w:val="22"/>
         </w:rPr>
@@ -1567,7 +1567,7 @@
       </w:pPr>
       <w:r>
         <w:rPr>
-          <w:rFonts w:ascii="PingFangTC-Regular" w:hAnsi="PingFangTC-Regular" w:eastAsia="PingFangTC-Regular" w:cs="PingFangTC-Regular"/>
+          <w:rFonts w:ascii="Heiti TC" w:hAnsi="Heiti TC" w:eastAsia="Heiti TC" w:cs="Heiti TC"/>
           <w:b w:val="0"/>
           <w:sz w:val="22"/>
         </w:rPr>
@@ -1581,7 +1581,7 @@
       </w:pPr>
       <w:r>
         <w:rPr>
-          <w:rFonts w:ascii="PingFangTC-Regular" w:hAnsi="PingFangTC-Regular" w:eastAsia="PingFangTC-Regular" w:cs="PingFangTC-Regular"/>
+          <w:rFonts w:ascii="Heiti TC" w:hAnsi="Heiti TC" w:eastAsia="Heiti TC" w:cs="Heiti TC"/>
           <w:b w:val="0"/>
           <w:sz w:val="22"/>
         </w:rPr>
@@ -1595,7 +1595,7 @@
       </w:pPr>
       <w:r>
         <w:rPr>
-          <w:rFonts w:ascii="PingFangTC-Regular" w:hAnsi="PingFangTC-Regular" w:eastAsia="PingFangTC-Regular" w:cs="PingFangTC-Regular"/>
+          <w:rFonts w:ascii="Heiti TC" w:hAnsi="Heiti TC" w:eastAsia="Heiti TC" w:cs="Heiti TC"/>
           <w:b w:val="0"/>
           <w:sz w:val="22"/>
         </w:rPr>
@@ -1608,7 +1608,7 @@
       </w:pPr>
       <w:r>
         <w:rPr>
-          <w:rFonts w:ascii="PingFangTC-Regular" w:hAnsi="PingFangTC-Regular" w:eastAsia="PingFangTC-Regular" w:cs="PingFangTC-Regular"/>
+          <w:rFonts w:ascii="Heiti TC" w:hAnsi="Heiti TC" w:eastAsia="Heiti TC" w:cs="Heiti TC"/>
           <w:b w:val="0"/>
           <w:sz w:val="26"/>
         </w:rPr>
@@ -1622,7 +1622,7 @@
       </w:pPr>
       <w:r>
         <w:rPr>
-          <w:rFonts w:ascii="PingFangTC-Regular" w:hAnsi="PingFangTC-Regular" w:eastAsia="PingFangTC-Regular" w:cs="PingFangTC-Regular"/>
+          <w:rFonts w:ascii="Heiti TC" w:hAnsi="Heiti TC" w:eastAsia="Heiti TC" w:cs="Heiti TC"/>
           <w:b w:val="0"/>
           <w:sz w:val="22"/>
         </w:rPr>
@@ -1636,7 +1636,7 @@
       </w:pPr>
       <w:r>
         <w:rPr>
-          <w:rFonts w:ascii="PingFangTC-Regular" w:hAnsi="PingFangTC-Regular" w:eastAsia="PingFangTC-Regular" w:cs="PingFangTC-Regular"/>
+          <w:rFonts w:ascii="Heiti TC" w:hAnsi="Heiti TC" w:eastAsia="Heiti TC" w:cs="Heiti TC"/>
           <w:b w:val="0"/>
           <w:sz w:val="22"/>
         </w:rPr>
@@ -1650,7 +1650,7 @@
       </w:pPr>
       <w:r>
         <w:rPr>
-          <w:rFonts w:ascii="PingFangTC-Regular" w:hAnsi="PingFangTC-Regular" w:eastAsia="PingFangTC-Regular" w:cs="PingFangTC-Regular"/>
+          <w:rFonts w:ascii="Heiti TC" w:hAnsi="Heiti TC" w:eastAsia="Heiti TC" w:cs="Heiti TC"/>
           <w:b w:val="0"/>
           <w:sz w:val="22"/>
         </w:rPr>
@@ -1664,7 +1664,7 @@
       </w:pPr>
       <w:r>
         <w:rPr>
-          <w:rFonts w:ascii="PingFangTC-Regular" w:hAnsi="PingFangTC-Regular" w:eastAsia="PingFangTC-Regular" w:cs="PingFangTC-Regular"/>
+          <w:rFonts w:ascii="Heiti TC" w:hAnsi="Heiti TC" w:eastAsia="Heiti TC" w:cs="Heiti TC"/>
           <w:b w:val="0"/>
           <w:sz w:val="22"/>
         </w:rPr>
@@ -1677,7 +1677,7 @@
       </w:pPr>
       <w:r>
         <w:rPr>
-          <w:rFonts w:ascii="PingFangTC-Regular" w:hAnsi="PingFangTC-Regular" w:eastAsia="PingFangTC-Regular" w:cs="PingFangTC-Regular"/>
+          <w:rFonts w:ascii="Heiti TC" w:hAnsi="Heiti TC" w:eastAsia="Heiti TC" w:cs="Heiti TC"/>
           <w:b w:val="0"/>
           <w:sz w:val="26"/>
         </w:rPr>
@@ -1691,7 +1691,7 @@
       </w:pPr>
       <w:r>
         <w:rPr>
-          <w:rFonts w:ascii="PingFangTC-Regular" w:hAnsi="PingFangTC-Regular" w:eastAsia="PingFangTC-Regular" w:cs="PingFangTC-Regular"/>
+          <w:rFonts w:ascii="Heiti TC" w:hAnsi="Heiti TC" w:eastAsia="Heiti TC" w:cs="Heiti TC"/>
           <w:b w:val="0"/>
           <w:sz w:val="22"/>
         </w:rPr>
@@ -1704,7 +1704,7 @@
       </w:pPr>
       <w:r>
         <w:rPr>
-          <w:rFonts w:ascii="PingFangTC-Regular" w:hAnsi="PingFangTC-Regular" w:eastAsia="PingFangTC-Regular" w:cs="PingFangTC-Regular"/>
+          <w:rFonts w:ascii="Heiti TC" w:hAnsi="Heiti TC" w:eastAsia="Heiti TC" w:cs="Heiti TC"/>
           <w:b w:val="0"/>
           <w:sz w:val="26"/>
         </w:rPr>
@@ -1718,7 +1718,7 @@
       </w:pPr>
       <w:r>
         <w:rPr>
-          <w:rFonts w:ascii="PingFangTC-Regular" w:hAnsi="PingFangTC-Regular" w:eastAsia="PingFangTC-Regular" w:cs="PingFangTC-Regular"/>
+          <w:rFonts w:ascii="Heiti TC" w:hAnsi="Heiti TC" w:eastAsia="Heiti TC" w:cs="Heiti TC"/>
           <w:b w:val="0"/>
           <w:sz w:val="22"/>
         </w:rPr>
@@ -1731,7 +1731,7 @@
       </w:pPr>
       <w:r>
         <w:rPr>
-          <w:rFonts w:ascii="PingFangTC-Regular" w:hAnsi="PingFangTC-Regular" w:eastAsia="PingFangTC-Regular" w:cs="PingFangTC-Regular"/>
+          <w:rFonts w:ascii="Heiti TC" w:hAnsi="Heiti TC" w:eastAsia="Heiti TC" w:cs="Heiti TC"/>
           <w:b w:val="0"/>
           <w:sz w:val="26"/>
         </w:rPr>
@@ -1745,7 +1745,7 @@
       </w:pPr>
       <w:r>
         <w:rPr>
-          <w:rFonts w:ascii="PingFangTC-Regular" w:hAnsi="PingFangTC-Regular" w:eastAsia="PingFangTC-Regular" w:cs="PingFangTC-Regular"/>
+          <w:rFonts w:ascii="Heiti TC" w:hAnsi="Heiti TC" w:eastAsia="Heiti TC" w:cs="Heiti TC"/>
           <w:b w:val="0"/>
           <w:sz w:val="22"/>
         </w:rPr>
@@ -1758,7 +1758,7 @@
       </w:pPr>
       <w:r>
         <w:rPr>
-          <w:rFonts w:ascii="PingFangTC-Regular" w:hAnsi="PingFangTC-Regular" w:eastAsia="PingFangTC-Regular" w:cs="PingFangTC-Regular"/>
+          <w:rFonts w:ascii="Heiti TC" w:hAnsi="Heiti TC" w:eastAsia="Heiti TC" w:cs="Heiti TC"/>
           <w:b w:val="0"/>
           <w:sz w:val="26"/>
         </w:rPr>
@@ -1772,7 +1772,7 @@
       </w:pPr>
       <w:r>
         <w:rPr>
-          <w:rFonts w:ascii="PingFangTC-Regular" w:hAnsi="PingFangTC-Regular" w:eastAsia="PingFangTC-Regular" w:cs="PingFangTC-Regular"/>
+          <w:rFonts w:ascii="Heiti TC" w:hAnsi="Heiti TC" w:eastAsia="Heiti TC" w:cs="Heiti TC"/>
           <w:b w:val="0"/>
           <w:sz w:val="22"/>
         </w:rPr>
@@ -1785,7 +1785,7 @@
       </w:pPr>
       <w:r>
         <w:rPr>
-          <w:rFonts w:ascii="PingFangTC-Regular" w:hAnsi="PingFangTC-Regular" w:eastAsia="PingFangTC-Regular" w:cs="PingFangTC-Regular"/>
+          <w:rFonts w:ascii="Heiti TC" w:hAnsi="Heiti TC" w:eastAsia="Heiti TC" w:cs="Heiti TC"/>
           <w:b w:val="0"/>
           <w:sz w:val="26"/>
         </w:rPr>
@@ -1799,7 +1799,7 @@
       </w:pPr>
       <w:r>
         <w:rPr>
-          <w:rFonts w:ascii="PingFangTC-Regular" w:hAnsi="PingFangTC-Regular" w:eastAsia="PingFangTC-Regular" w:cs="PingFangTC-Regular"/>
+          <w:rFonts w:ascii="Heiti TC" w:hAnsi="Heiti TC" w:eastAsia="Heiti TC" w:cs="Heiti TC"/>
           <w:b w:val="0"/>
           <w:sz w:val="22"/>
         </w:rPr>
@@ -1812,7 +1812,7 @@
       </w:pPr>
       <w:r>
         <w:rPr>
-          <w:rFonts w:ascii="PingFangTC-Regular" w:hAnsi="PingFangTC-Regular" w:eastAsia="PingFangTC-Regular" w:cs="PingFangTC-Regular"/>
+          <w:rFonts w:ascii="Heiti TC" w:hAnsi="Heiti TC" w:eastAsia="Heiti TC" w:cs="Heiti TC"/>
           <w:b w:val="0"/>
           <w:sz w:val="26"/>
         </w:rPr>
@@ -1826,7 +1826,7 @@
       </w:pPr>
       <w:r>
         <w:rPr>
-          <w:rFonts w:ascii="PingFangTC-Regular" w:hAnsi="PingFangTC-Regular" w:eastAsia="PingFangTC-Regular" w:cs="PingFangTC-Regular"/>
+          <w:rFonts w:ascii="Heiti TC" w:hAnsi="Heiti TC" w:eastAsia="Heiti TC" w:cs="Heiti TC"/>
           <w:b w:val="0"/>
           <w:sz w:val="22"/>
         </w:rPr>
@@ -1839,7 +1839,7 @@
       </w:pPr>
       <w:r>
         <w:rPr>
-          <w:rFonts w:ascii="PingFangTC-Regular" w:hAnsi="PingFangTC-Regular" w:eastAsia="PingFangTC-Regular" w:cs="PingFangTC-Regular"/>
+          <w:rFonts w:ascii="Heiti TC" w:hAnsi="Heiti TC" w:eastAsia="Heiti TC" w:cs="Heiti TC"/>
           <w:b w:val="0"/>
           <w:sz w:val="26"/>
         </w:rPr>
@@ -1853,7 +1853,7 @@
       </w:pPr>
       <w:r>
         <w:rPr>
-          <w:rFonts w:ascii="PingFangTC-Regular" w:hAnsi="PingFangTC-Regular" w:eastAsia="PingFangTC-Regular" w:cs="PingFangTC-Regular"/>
+          <w:rFonts w:ascii="Heiti TC" w:hAnsi="Heiti TC" w:eastAsia="Heiti TC" w:cs="Heiti TC"/>
           <w:b w:val="0"/>
           <w:sz w:val="22"/>
         </w:rPr>
@@ -1866,7 +1866,7 @@
       </w:pPr>
       <w:r>
         <w:rPr>
-          <w:rFonts w:ascii="PingFangTC-Regular" w:hAnsi="PingFangTC-Regular" w:eastAsia="PingFangTC-Regular" w:cs="PingFangTC-Regular"/>
+          <w:rFonts w:ascii="Heiti TC" w:hAnsi="Heiti TC" w:eastAsia="Heiti TC" w:cs="Heiti TC"/>
           <w:b w:val="0"/>
           <w:sz w:val="26"/>
         </w:rPr>
@@ -1880,7 +1880,7 @@
       </w:pPr>
       <w:r>
         <w:rPr>
-          <w:rFonts w:ascii="PingFangTC-Regular" w:hAnsi="PingFangTC-Regular" w:eastAsia="PingFangTC-Regular" w:cs="PingFangTC-Regular"/>
+          <w:rFonts w:ascii="Heiti TC" w:hAnsi="Heiti TC" w:eastAsia="Heiti TC" w:cs="Heiti TC"/>
           <w:b w:val="0"/>
           <w:sz w:val="22"/>
         </w:rPr>
@@ -1889,11 +1889,65 @@
     </w:p>
     <w:p>
       <w:pPr>
+        <w:spacing w:before="200" w:after="120"/>
+      </w:pPr>
+      <w:r>
+        <w:rPr>
+          <w:rFonts w:ascii="Heiti TC" w:hAnsi="Heiti TC" w:eastAsia="Heiti TC" w:cs="Heiti TC"/>
+          <w:b w:val="0"/>
+          <w:sz w:val="26"/>
+        </w:rPr>
+        <w:t>2026-10-21｜八檔共享模型與 TSLA 專屬模型</w:t>
+      </w:r>
+    </w:p>
+    <w:p>
+      <w:pPr>
+        <w:pStyle w:val="ListBullet"/>
+        <w:spacing w:after="60" w:line="276" w:lineRule="auto"/>
+      </w:pPr>
+      <w:r>
+        <w:rPr>
+          <w:rFonts w:ascii="Heiti TC" w:hAnsi="Heiti TC" w:eastAsia="Heiti TC" w:cs="Heiti TC"/>
+          <w:b w:val="0"/>
+          <w:sz w:val="22"/>
+        </w:rPr>
+        <w:t>LSTM 採八檔共享模型加 TSLA 專屬模型。訓練資料從 2013 年起涵蓋成長股震盪、2018 下跌、2020 疫情、2022 升息熊市與 AI 多頭；採時間序列切分與空窗隔離，禁止用未來資訊提高分數。</w:t>
+      </w:r>
+    </w:p>
+    <w:p>
+      <w:pPr>
+        <w:spacing w:before="200" w:after="120"/>
+      </w:pPr>
+      <w:r>
+        <w:rPr>
+          <w:rFonts w:ascii="Heiti TC" w:hAnsi="Heiti TC" w:eastAsia="Heiti TC" w:cs="Heiti TC"/>
+          <w:b w:val="0"/>
+          <w:sz w:val="26"/>
+        </w:rPr>
+        <w:t>2026-10-21｜模型快取精簡發布與 40 MB 安全門檻</w:t>
+      </w:r>
+    </w:p>
+    <w:p>
+      <w:pPr>
+        <w:pStyle w:val="ListBullet"/>
+        <w:spacing w:after="60" w:line="276" w:lineRule="auto"/>
+      </w:pPr>
+      <w:r>
+        <w:rPr>
+          <w:rFonts w:ascii="Heiti TC" w:hAnsi="Heiti TC" w:eastAsia="Heiti TC" w:cs="Heiti TC"/>
+          <w:b w:val="0"/>
+          <w:sz w:val="22"/>
+        </w:rPr>
+        <w:t>40 MB 是單次 GitHub 提交的安全門檻，不是資料庫總容量、資料收集上限或模型可用性限制。超過時只停止該次發布並列出大型檔案；資料仍可在執行環境中計算與使用，下一次排程也會繼續。必要的小型成果應優先保存，可重建的大型中間檔則不進 Git 歷史。</w:t>
+      </w:r>
+    </w:p>
+    <w:p>
+      <w:pPr>
         <w:spacing w:before="280" w:after="120"/>
       </w:pPr>
       <w:r>
         <w:rPr>
-          <w:rFonts w:ascii="PingFangTC-Regular" w:hAnsi="PingFangTC-Regular" w:eastAsia="PingFangTC-Regular" w:cs="PingFangTC-Regular"/>
+          <w:rFonts w:ascii="Heiti TC" w:hAnsi="Heiti TC" w:eastAsia="Heiti TC" w:cs="Heiti TC"/>
           <w:b w:val="0"/>
           <w:sz w:val="32"/>
         </w:rPr>
@@ -1906,7 +1960,7 @@
       </w:pPr>
       <w:r>
         <w:rPr>
-          <w:rFonts w:ascii="PingFangTC-Regular" w:hAnsi="PingFangTC-Regular" w:eastAsia="PingFangTC-Regular" w:cs="PingFangTC-Regular"/>
+          <w:rFonts w:ascii="Heiti TC" w:hAnsi="Heiti TC" w:eastAsia="Heiti TC" w:cs="Heiti TC"/>
           <w:b w:val="0"/>
           <w:sz w:val="32"/>
         </w:rPr>
@@ -1919,7 +1973,7 @@
       </w:pPr>
       <w:r>
         <w:rPr>
-          <w:rFonts w:ascii="PingFangTC-Regular" w:hAnsi="PingFangTC-Regular" w:eastAsia="PingFangTC-Regular" w:cs="PingFangTC-Regular"/>
+          <w:rFonts w:ascii="Heiti TC" w:hAnsi="Heiti TC" w:eastAsia="Heiti TC" w:cs="Heiti TC"/>
           <w:b w:val="0"/>
           <w:sz w:val="26"/>
         </w:rPr>
@@ -1932,7 +1986,7 @@
       </w:pPr>
       <w:r>
         <w:rPr>
-          <w:rFonts w:ascii="PingFangTC-Regular" w:hAnsi="PingFangTC-Regular" w:eastAsia="PingFangTC-Regular" w:cs="PingFangTC-Regular"/>
+          <w:rFonts w:ascii="Heiti TC" w:hAnsi="Heiti TC" w:eastAsia="Heiti TC" w:cs="Heiti TC"/>
           <w:b w:val="0"/>
           <w:sz w:val="24"/>
         </w:rPr>
@@ -1946,7 +2000,7 @@
       </w:pPr>
       <w:r>
         <w:rPr>
-          <w:rFonts w:ascii="PingFangTC-Regular" w:hAnsi="PingFangTC-Regular" w:eastAsia="PingFangTC-Regular" w:cs="PingFangTC-Regular"/>
+          <w:rFonts w:ascii="Heiti TC" w:hAnsi="Heiti TC" w:eastAsia="Heiti TC" w:cs="Heiti TC"/>
           <w:b w:val="0"/>
           <w:sz w:val="22"/>
         </w:rPr>
@@ -1960,7 +2014,7 @@
       </w:pPr>
       <w:r>
         <w:rPr>
-          <w:rFonts w:ascii="PingFangTC-Regular" w:hAnsi="PingFangTC-Regular" w:eastAsia="PingFangTC-Regular" w:cs="PingFangTC-Regular"/>
+          <w:rFonts w:ascii="Heiti TC" w:hAnsi="Heiti TC" w:eastAsia="Heiti TC" w:cs="Heiti TC"/>
           <w:b w:val="0"/>
           <w:sz w:val="22"/>
         </w:rPr>
@@ -1974,7 +2028,7 @@
       </w:pPr>
       <w:r>
         <w:rPr>
-          <w:rFonts w:ascii="PingFangTC-Regular" w:hAnsi="PingFangTC-Regular" w:eastAsia="PingFangTC-Regular" w:cs="PingFangTC-Regular"/>
+          <w:rFonts w:ascii="Heiti TC" w:hAnsi="Heiti TC" w:eastAsia="Heiti TC" w:cs="Heiti TC"/>
           <w:b w:val="0"/>
           <w:sz w:val="22"/>
         </w:rPr>
@@ -1988,7 +2042,7 @@
       </w:pPr>
       <w:r>
         <w:rPr>
-          <w:rFonts w:ascii="PingFangTC-Regular" w:hAnsi="PingFangTC-Regular" w:eastAsia="PingFangTC-Regular" w:cs="PingFangTC-Regular"/>
+          <w:rFonts w:ascii="Heiti TC" w:hAnsi="Heiti TC" w:eastAsia="Heiti TC" w:cs="Heiti TC"/>
           <w:b w:val="0"/>
           <w:sz w:val="22"/>
         </w:rPr>
@@ -2001,7 +2055,7 @@
       </w:pPr>
       <w:r>
         <w:rPr>
-          <w:rFonts w:ascii="PingFangTC-Regular" w:hAnsi="PingFangTC-Regular" w:eastAsia="PingFangTC-Regular" w:cs="PingFangTC-Regular"/>
+          <w:rFonts w:ascii="Heiti TC" w:hAnsi="Heiti TC" w:eastAsia="Heiti TC" w:cs="Heiti TC"/>
           <w:b w:val="0"/>
           <w:sz w:val="24"/>
         </w:rPr>
@@ -2015,7 +2069,7 @@
       </w:pPr>
       <w:r>
         <w:rPr>
-          <w:rFonts w:ascii="PingFangTC-Regular" w:hAnsi="PingFangTC-Regular" w:eastAsia="PingFangTC-Regular" w:cs="PingFangTC-Regular"/>
+          <w:rFonts w:ascii="Heiti TC" w:hAnsi="Heiti TC" w:eastAsia="Heiti TC" w:cs="Heiti TC"/>
           <w:b w:val="0"/>
           <w:sz w:val="22"/>
         </w:rPr>
@@ -2029,7 +2083,7 @@
       </w:pPr>
       <w:r>
         <w:rPr>
-          <w:rFonts w:ascii="PingFangTC-Regular" w:hAnsi="PingFangTC-Regular" w:eastAsia="PingFangTC-Regular" w:cs="PingFangTC-Regular"/>
+          <w:rFonts w:ascii="Heiti TC" w:hAnsi="Heiti TC" w:eastAsia="Heiti TC" w:cs="Heiti TC"/>
           <w:b w:val="0"/>
           <w:sz w:val="22"/>
         </w:rPr>
@@ -2043,7 +2097,7 @@
       </w:pPr>
       <w:r>
         <w:rPr>
-          <w:rFonts w:ascii="PingFangTC-Regular" w:hAnsi="PingFangTC-Regular" w:eastAsia="PingFangTC-Regular" w:cs="PingFangTC-Regular"/>
+          <w:rFonts w:ascii="Heiti TC" w:hAnsi="Heiti TC" w:eastAsia="Heiti TC" w:cs="Heiti TC"/>
           <w:b w:val="0"/>
           <w:sz w:val="22"/>
         </w:rPr>
@@ -2056,7 +2110,7 @@
       </w:pPr>
       <w:r>
         <w:rPr>
-          <w:rFonts w:ascii="PingFangTC-Regular" w:hAnsi="PingFangTC-Regular" w:eastAsia="PingFangTC-Regular" w:cs="PingFangTC-Regular"/>
+          <w:rFonts w:ascii="Heiti TC" w:hAnsi="Heiti TC" w:eastAsia="Heiti TC" w:cs="Heiti TC"/>
           <w:b w:val="0"/>
           <w:sz w:val="24"/>
         </w:rPr>
@@ -2070,7 +2124,7 @@
       </w:pPr>
       <w:r>
         <w:rPr>
-          <w:rFonts w:ascii="PingFangTC-Regular" w:hAnsi="PingFangTC-Regular" w:eastAsia="PingFangTC-Regular" w:cs="PingFangTC-Regular"/>
+          <w:rFonts w:ascii="Heiti TC" w:hAnsi="Heiti TC" w:eastAsia="Heiti TC" w:cs="Heiti TC"/>
           <w:b w:val="0"/>
           <w:sz w:val="22"/>
         </w:rPr>
@@ -2084,7 +2138,7 @@
       </w:pPr>
       <w:r>
         <w:rPr>
-          <w:rFonts w:ascii="PingFangTC-Regular" w:hAnsi="PingFangTC-Regular" w:eastAsia="PingFangTC-Regular" w:cs="PingFangTC-Regular"/>
+          <w:rFonts w:ascii="Heiti TC" w:hAnsi="Heiti TC" w:eastAsia="Heiti TC" w:cs="Heiti TC"/>
           <w:b w:val="0"/>
           <w:sz w:val="22"/>
         </w:rPr>
@@ -2098,7 +2152,7 @@
       </w:pPr>
       <w:r>
         <w:rPr>
-          <w:rFonts w:ascii="PingFangTC-Regular" w:hAnsi="PingFangTC-Regular" w:eastAsia="PingFangTC-Regular" w:cs="PingFangTC-Regular"/>
+          <w:rFonts w:ascii="Heiti TC" w:hAnsi="Heiti TC" w:eastAsia="Heiti TC" w:cs="Heiti TC"/>
           <w:b w:val="0"/>
           <w:sz w:val="22"/>
         </w:rPr>
@@ -2111,7 +2165,7 @@
       </w:pPr>
       <w:r>
         <w:rPr>
-          <w:rFonts w:ascii="PingFangTC-Regular" w:hAnsi="PingFangTC-Regular" w:eastAsia="PingFangTC-Regular" w:cs="PingFangTC-Regular"/>
+          <w:rFonts w:ascii="Heiti TC" w:hAnsi="Heiti TC" w:eastAsia="Heiti TC" w:cs="Heiti TC"/>
           <w:b w:val="0"/>
           <w:sz w:val="24"/>
         </w:rPr>
@@ -2125,7 +2179,7 @@
       </w:pPr>
       <w:r>
         <w:rPr>
-          <w:rFonts w:ascii="PingFangTC-Regular" w:hAnsi="PingFangTC-Regular" w:eastAsia="PingFangTC-Regular" w:cs="PingFangTC-Regular"/>
+          <w:rFonts w:ascii="Heiti TC" w:hAnsi="Heiti TC" w:eastAsia="Heiti TC" w:cs="Heiti TC"/>
           <w:b w:val="0"/>
           <w:sz w:val="22"/>
         </w:rPr>
@@ -2139,7 +2193,7 @@
       </w:pPr>
       <w:r>
         <w:rPr>
-          <w:rFonts w:ascii="PingFangTC-Regular" w:hAnsi="PingFangTC-Regular" w:eastAsia="PingFangTC-Regular" w:cs="PingFangTC-Regular"/>
+          <w:rFonts w:ascii="Heiti TC" w:hAnsi="Heiti TC" w:eastAsia="Heiti TC" w:cs="Heiti TC"/>
           <w:b w:val="0"/>
           <w:sz w:val="22"/>
         </w:rPr>
@@ -2153,7 +2207,7 @@
       </w:pPr>
       <w:r>
         <w:rPr>
-          <w:rFonts w:ascii="PingFangTC-Regular" w:hAnsi="PingFangTC-Regular" w:eastAsia="PingFangTC-Regular" w:cs="PingFangTC-Regular"/>
+          <w:rFonts w:ascii="Heiti TC" w:hAnsi="Heiti TC" w:eastAsia="Heiti TC" w:cs="Heiti TC"/>
           <w:b w:val="0"/>
           <w:sz w:val="22"/>
         </w:rPr>
@@ -2166,7 +2220,7 @@
       </w:pPr>
       <w:r>
         <w:rPr>
-          <w:rFonts w:ascii="PingFangTC-Regular" w:hAnsi="PingFangTC-Regular" w:eastAsia="PingFangTC-Regular" w:cs="PingFangTC-Regular"/>
+          <w:rFonts w:ascii="Heiti TC" w:hAnsi="Heiti TC" w:eastAsia="Heiti TC" w:cs="Heiti TC"/>
           <w:b w:val="0"/>
           <w:sz w:val="24"/>
         </w:rPr>
@@ -2180,7 +2234,7 @@
       </w:pPr>
       <w:r>
         <w:rPr>
-          <w:rFonts w:ascii="PingFangTC-Regular" w:hAnsi="PingFangTC-Regular" w:eastAsia="PingFangTC-Regular" w:cs="PingFangTC-Regular"/>
+          <w:rFonts w:ascii="Heiti TC" w:hAnsi="Heiti TC" w:eastAsia="Heiti TC" w:cs="Heiti TC"/>
           <w:b w:val="0"/>
           <w:sz w:val="22"/>
         </w:rPr>
@@ -2194,7 +2248,7 @@
       </w:pPr>
       <w:r>
         <w:rPr>
-          <w:rFonts w:ascii="PingFangTC-Regular" w:hAnsi="PingFangTC-Regular" w:eastAsia="PingFangTC-Regular" w:cs="PingFangTC-Regular"/>
+          <w:rFonts w:ascii="Heiti TC" w:hAnsi="Heiti TC" w:eastAsia="Heiti TC" w:cs="Heiti TC"/>
           <w:b w:val="0"/>
           <w:sz w:val="22"/>
         </w:rPr>
@@ -2208,7 +2262,7 @@
       </w:pPr>
       <w:r>
         <w:rPr>
-          <w:rFonts w:ascii="PingFangTC-Regular" w:hAnsi="PingFangTC-Regular" w:eastAsia="PingFangTC-Regular" w:cs="PingFangTC-Regular"/>
+          <w:rFonts w:ascii="Heiti TC" w:hAnsi="Heiti TC" w:eastAsia="Heiti TC" w:cs="Heiti TC"/>
           <w:b w:val="0"/>
           <w:sz w:val="22"/>
         </w:rPr>
@@ -2221,7 +2275,7 @@
       </w:pPr>
       <w:r>
         <w:rPr>
-          <w:rFonts w:ascii="PingFangTC-Regular" w:hAnsi="PingFangTC-Regular" w:eastAsia="PingFangTC-Regular" w:cs="PingFangTC-Regular"/>
+          <w:rFonts w:ascii="Heiti TC" w:hAnsi="Heiti TC" w:eastAsia="Heiti TC" w:cs="Heiti TC"/>
           <w:b w:val="0"/>
           <w:sz w:val="24"/>
         </w:rPr>
@@ -2235,7 +2289,7 @@
       </w:pPr>
       <w:r>
         <w:rPr>
-          <w:rFonts w:ascii="PingFangTC-Regular" w:hAnsi="PingFangTC-Regular" w:eastAsia="PingFangTC-Regular" w:cs="PingFangTC-Regular"/>
+          <w:rFonts w:ascii="Heiti TC" w:hAnsi="Heiti TC" w:eastAsia="Heiti TC" w:cs="Heiti TC"/>
           <w:b w:val="0"/>
           <w:sz w:val="22"/>
         </w:rPr>
@@ -2249,7 +2303,7 @@
       </w:pPr>
       <w:r>
         <w:rPr>
-          <w:rFonts w:ascii="PingFangTC-Regular" w:hAnsi="PingFangTC-Regular" w:eastAsia="PingFangTC-Regular" w:cs="PingFangTC-Regular"/>
+          <w:rFonts w:ascii="Heiti TC" w:hAnsi="Heiti TC" w:eastAsia="Heiti TC" w:cs="Heiti TC"/>
           <w:b w:val="0"/>
           <w:sz w:val="22"/>
         </w:rPr>
@@ -2263,7 +2317,7 @@
       </w:pPr>
       <w:r>
         <w:rPr>
-          <w:rFonts w:ascii="PingFangTC-Regular" w:hAnsi="PingFangTC-Regular" w:eastAsia="PingFangTC-Regular" w:cs="PingFangTC-Regular"/>
+          <w:rFonts w:ascii="Heiti TC" w:hAnsi="Heiti TC" w:eastAsia="Heiti TC" w:cs="Heiti TC"/>
           <w:b w:val="0"/>
           <w:sz w:val="22"/>
         </w:rPr>
@@ -2276,7 +2330,7 @@
       </w:pPr>
       <w:r>
         <w:rPr>
-          <w:rFonts w:ascii="PingFangTC-Regular" w:hAnsi="PingFangTC-Regular" w:eastAsia="PingFangTC-Regular" w:cs="PingFangTC-Regular"/>
+          <w:rFonts w:ascii="Heiti TC" w:hAnsi="Heiti TC" w:eastAsia="Heiti TC" w:cs="Heiti TC"/>
           <w:b w:val="0"/>
           <w:sz w:val="24"/>
         </w:rPr>
@@ -2290,7 +2344,7 @@
       </w:pPr>
       <w:r>
         <w:rPr>
-          <w:rFonts w:ascii="PingFangTC-Regular" w:hAnsi="PingFangTC-Regular" w:eastAsia="PingFangTC-Regular" w:cs="PingFangTC-Regular"/>
+          <w:rFonts w:ascii="Heiti TC" w:hAnsi="Heiti TC" w:eastAsia="Heiti TC" w:cs="Heiti TC"/>
           <w:b w:val="0"/>
           <w:sz w:val="22"/>
         </w:rPr>
@@ -2304,7 +2358,7 @@
       </w:pPr>
       <w:r>
         <w:rPr>
-          <w:rFonts w:ascii="PingFangTC-Regular" w:hAnsi="PingFangTC-Regular" w:eastAsia="PingFangTC-Regular" w:cs="PingFangTC-Regular"/>
+          <w:rFonts w:ascii="Heiti TC" w:hAnsi="Heiti TC" w:eastAsia="Heiti TC" w:cs="Heiti TC"/>
           <w:b w:val="0"/>
           <w:sz w:val="22"/>
         </w:rPr>
@@ -2318,7 +2372,7 @@
       </w:pPr>
       <w:r>
         <w:rPr>
-          <w:rFonts w:ascii="PingFangTC-Regular" w:hAnsi="PingFangTC-Regular" w:eastAsia="PingFangTC-Regular" w:cs="PingFangTC-Regular"/>
+          <w:rFonts w:ascii="Heiti TC" w:hAnsi="Heiti TC" w:eastAsia="Heiti TC" w:cs="Heiti TC"/>
           <w:b w:val="0"/>
           <w:sz w:val="22"/>
         </w:rPr>
@@ -2331,7 +2385,7 @@
       </w:pPr>
       <w:r>
         <w:rPr>
-          <w:rFonts w:ascii="PingFangTC-Regular" w:hAnsi="PingFangTC-Regular" w:eastAsia="PingFangTC-Regular" w:cs="PingFangTC-Regular"/>
+          <w:rFonts w:ascii="Heiti TC" w:hAnsi="Heiti TC" w:eastAsia="Heiti TC" w:cs="Heiti TC"/>
           <w:b w:val="0"/>
           <w:sz w:val="24"/>
         </w:rPr>
@@ -2345,7 +2399,7 @@
       </w:pPr>
       <w:r>
         <w:rPr>
-          <w:rFonts w:ascii="PingFangTC-Regular" w:hAnsi="PingFangTC-Regular" w:eastAsia="PingFangTC-Regular" w:cs="PingFangTC-Regular"/>
+          <w:rFonts w:ascii="Heiti TC" w:hAnsi="Heiti TC" w:eastAsia="Heiti TC" w:cs="Heiti TC"/>
           <w:b w:val="0"/>
           <w:sz w:val="22"/>
         </w:rPr>
@@ -2359,7 +2413,7 @@
       </w:pPr>
       <w:r>
         <w:rPr>
-          <w:rFonts w:ascii="PingFangTC-Regular" w:hAnsi="PingFangTC-Regular" w:eastAsia="PingFangTC-Regular" w:cs="PingFangTC-Regular"/>
+          <w:rFonts w:ascii="Heiti TC" w:hAnsi="Heiti TC" w:eastAsia="Heiti TC" w:cs="Heiti TC"/>
           <w:b w:val="0"/>
           <w:sz w:val="22"/>
         </w:rPr>
@@ -2372,7 +2426,7 @@
       </w:pPr>
       <w:r>
         <w:rPr>
-          <w:rFonts w:ascii="PingFangTC-Regular" w:hAnsi="PingFangTC-Regular" w:eastAsia="PingFangTC-Regular" w:cs="PingFangTC-Regular"/>
+          <w:rFonts w:ascii="Heiti TC" w:hAnsi="Heiti TC" w:eastAsia="Heiti TC" w:cs="Heiti TC"/>
           <w:b w:val="0"/>
           <w:sz w:val="24"/>
         </w:rPr>
@@ -2386,7 +2440,7 @@
       </w:pPr>
       <w:r>
         <w:rPr>
-          <w:rFonts w:ascii="PingFangTC-Regular" w:hAnsi="PingFangTC-Regular" w:eastAsia="PingFangTC-Regular" w:cs="PingFangTC-Regular"/>
+          <w:rFonts w:ascii="Heiti TC" w:hAnsi="Heiti TC" w:eastAsia="Heiti TC" w:cs="Heiti TC"/>
           <w:b w:val="0"/>
           <w:sz w:val="22"/>
         </w:rPr>
@@ -2400,7 +2454,7 @@
       </w:pPr>
       <w:r>
         <w:rPr>
-          <w:rFonts w:ascii="PingFangTC-Regular" w:hAnsi="PingFangTC-Regular" w:eastAsia="PingFangTC-Regular" w:cs="PingFangTC-Regular"/>
+          <w:rFonts w:ascii="Heiti TC" w:hAnsi="Heiti TC" w:eastAsia="Heiti TC" w:cs="Heiti TC"/>
           <w:b w:val="0"/>
           <w:sz w:val="22"/>
         </w:rPr>
@@ -2414,7 +2468,7 @@
       </w:pPr>
       <w:r>
         <w:rPr>
-          <w:rFonts w:ascii="PingFangTC-Regular" w:hAnsi="PingFangTC-Regular" w:eastAsia="PingFangTC-Regular" w:cs="PingFangTC-Regular"/>
+          <w:rFonts w:ascii="Heiti TC" w:hAnsi="Heiti TC" w:eastAsia="Heiti TC" w:cs="Heiti TC"/>
           <w:b w:val="0"/>
           <w:sz w:val="22"/>
         </w:rPr>
@@ -2428,7 +2482,7 @@
       </w:pPr>
       <w:r>
         <w:rPr>
-          <w:rFonts w:ascii="PingFangTC-Regular" w:hAnsi="PingFangTC-Regular" w:eastAsia="PingFangTC-Regular" w:cs="PingFangTC-Regular"/>
+          <w:rFonts w:ascii="Heiti TC" w:hAnsi="Heiti TC" w:eastAsia="Heiti TC" w:cs="Heiti TC"/>
           <w:b w:val="0"/>
           <w:sz w:val="22"/>
         </w:rPr>
@@ -2441,7 +2495,7 @@
       </w:pPr>
       <w:r>
         <w:rPr>
-          <w:rFonts w:ascii="PingFangTC-Regular" w:hAnsi="PingFangTC-Regular" w:eastAsia="PingFangTC-Regular" w:cs="PingFangTC-Regular"/>
+          <w:rFonts w:ascii="Heiti TC" w:hAnsi="Heiti TC" w:eastAsia="Heiti TC" w:cs="Heiti TC"/>
           <w:b w:val="0"/>
           <w:sz w:val="24"/>
         </w:rPr>
@@ -2455,7 +2509,7 @@
       </w:pPr>
       <w:r>
         <w:rPr>
-          <w:rFonts w:ascii="PingFangTC-Regular" w:hAnsi="PingFangTC-Regular" w:eastAsia="PingFangTC-Regular" w:cs="PingFangTC-Regular"/>
+          <w:rFonts w:ascii="Heiti TC" w:hAnsi="Heiti TC" w:eastAsia="Heiti TC" w:cs="Heiti TC"/>
           <w:b w:val="0"/>
           <w:sz w:val="22"/>
         </w:rPr>
@@ -2469,7 +2523,7 @@
       </w:pPr>
       <w:r>
         <w:rPr>
-          <w:rFonts w:ascii="PingFangTC-Regular" w:hAnsi="PingFangTC-Regular" w:eastAsia="PingFangTC-Regular" w:cs="PingFangTC-Regular"/>
+          <w:rFonts w:ascii="Heiti TC" w:hAnsi="Heiti TC" w:eastAsia="Heiti TC" w:cs="Heiti TC"/>
           <w:b w:val="0"/>
           <w:sz w:val="22"/>
         </w:rPr>
@@ -2483,7 +2537,7 @@
       </w:pPr>
       <w:r>
         <w:rPr>
-          <w:rFonts w:ascii="PingFangTC-Regular" w:hAnsi="PingFangTC-Regular" w:eastAsia="PingFangTC-Regular" w:cs="PingFangTC-Regular"/>
+          <w:rFonts w:ascii="Heiti TC" w:hAnsi="Heiti TC" w:eastAsia="Heiti TC" w:cs="Heiti TC"/>
           <w:b w:val="0"/>
           <w:sz w:val="22"/>
         </w:rPr>
@@ -2497,7 +2551,7 @@
       </w:pPr>
       <w:r>
         <w:rPr>
-          <w:rFonts w:ascii="PingFangTC-Regular" w:hAnsi="PingFangTC-Regular" w:eastAsia="PingFangTC-Regular" w:cs="PingFangTC-Regular"/>
+          <w:rFonts w:ascii="Heiti TC" w:hAnsi="Heiti TC" w:eastAsia="Heiti TC" w:cs="Heiti TC"/>
           <w:b w:val="0"/>
           <w:sz w:val="22"/>
         </w:rPr>
@@ -2510,7 +2564,7 @@
       </w:pPr>
       <w:r>
         <w:rPr>
-          <w:rFonts w:ascii="PingFangTC-Regular" w:hAnsi="PingFangTC-Regular" w:eastAsia="PingFangTC-Regular" w:cs="PingFangTC-Regular"/>
+          <w:rFonts w:ascii="Heiti TC" w:hAnsi="Heiti TC" w:eastAsia="Heiti TC" w:cs="Heiti TC"/>
           <w:b w:val="0"/>
           <w:sz w:val="26"/>
         </w:rPr>
@@ -2524,7 +2578,7 @@
       </w:pPr>
       <w:r>
         <w:rPr>
-          <w:rFonts w:ascii="PingFangTC-Regular" w:hAnsi="PingFangTC-Regular" w:eastAsia="PingFangTC-Regular" w:cs="PingFangTC-Regular"/>
+          <w:rFonts w:ascii="Heiti TC" w:hAnsi="Heiti TC" w:eastAsia="Heiti TC" w:cs="Heiti TC"/>
           <w:b w:val="0"/>
           <w:sz w:val="22"/>
         </w:rPr>
@@ -2537,7 +2591,7 @@
       </w:pPr>
       <w:r>
         <w:rPr>
-          <w:rFonts w:ascii="PingFangTC-Regular" w:hAnsi="PingFangTC-Regular" w:eastAsia="PingFangTC-Regular" w:cs="PingFangTC-Regular"/>
+          <w:rFonts w:ascii="Heiti TC" w:hAnsi="Heiti TC" w:eastAsia="Heiti TC" w:cs="Heiti TC"/>
           <w:b w:val="0"/>
           <w:sz w:val="26"/>
         </w:rPr>
@@ -2551,7 +2605,7 @@
       </w:pPr>
       <w:r>
         <w:rPr>
-          <w:rFonts w:ascii="PingFangTC-Regular" w:hAnsi="PingFangTC-Regular" w:eastAsia="PingFangTC-Regular" w:cs="PingFangTC-Regular"/>
+          <w:rFonts w:ascii="Heiti TC" w:hAnsi="Heiti TC" w:eastAsia="Heiti TC" w:cs="Heiti TC"/>
           <w:b w:val="0"/>
           <w:sz w:val="22"/>
         </w:rPr>
@@ -2564,7 +2618,7 @@
       </w:pPr>
       <w:r>
         <w:rPr>
-          <w:rFonts w:ascii="PingFangTC-Regular" w:hAnsi="PingFangTC-Regular" w:eastAsia="PingFangTC-Regular" w:cs="PingFangTC-Regular"/>
+          <w:rFonts w:ascii="Heiti TC" w:hAnsi="Heiti TC" w:eastAsia="Heiti TC" w:cs="Heiti TC"/>
           <w:b w:val="0"/>
           <w:sz w:val="26"/>
         </w:rPr>
@@ -2578,7 +2632,7 @@
       </w:pPr>
       <w:r>
         <w:rPr>
-          <w:rFonts w:ascii="PingFangTC-Regular" w:hAnsi="PingFangTC-Regular" w:eastAsia="PingFangTC-Regular" w:cs="PingFangTC-Regular"/>
+          <w:rFonts w:ascii="Heiti TC" w:hAnsi="Heiti TC" w:eastAsia="Heiti TC" w:cs="Heiti TC"/>
           <w:b w:val="0"/>
           <w:sz w:val="22"/>
         </w:rPr>
@@ -2591,7 +2645,7 @@
       </w:pPr>
       <w:r>
         <w:rPr>
-          <w:rFonts w:ascii="PingFangTC-Regular" w:hAnsi="PingFangTC-Regular" w:eastAsia="PingFangTC-Regular" w:cs="PingFangTC-Regular"/>
+          <w:rFonts w:ascii="Heiti TC" w:hAnsi="Heiti TC" w:eastAsia="Heiti TC" w:cs="Heiti TC"/>
           <w:b w:val="0"/>
           <w:sz w:val="26"/>
         </w:rPr>
@@ -2605,7 +2659,7 @@
       </w:pPr>
       <w:r>
         <w:rPr>
-          <w:rFonts w:ascii="PingFangTC-Regular" w:hAnsi="PingFangTC-Regular" w:eastAsia="PingFangTC-Regular" w:cs="PingFangTC-Regular"/>
+          <w:rFonts w:ascii="Heiti TC" w:hAnsi="Heiti TC" w:eastAsia="Heiti TC" w:cs="Heiti TC"/>
           <w:b w:val="0"/>
           <w:sz w:val="22"/>
         </w:rPr>
@@ -2618,7 +2672,7 @@
       </w:pPr>
       <w:r>
         <w:rPr>
-          <w:rFonts w:ascii="PingFangTC-Regular" w:hAnsi="PingFangTC-Regular" w:eastAsia="PingFangTC-Regular" w:cs="PingFangTC-Regular"/>
+          <w:rFonts w:ascii="Heiti TC" w:hAnsi="Heiti TC" w:eastAsia="Heiti TC" w:cs="Heiti TC"/>
           <w:b w:val="0"/>
           <w:sz w:val="26"/>
         </w:rPr>
@@ -2632,7 +2686,7 @@
       </w:pPr>
       <w:r>
         <w:rPr>
-          <w:rFonts w:ascii="PingFangTC-Regular" w:hAnsi="PingFangTC-Regular" w:eastAsia="PingFangTC-Regular" w:cs="PingFangTC-Regular"/>
+          <w:rFonts w:ascii="Heiti TC" w:hAnsi="Heiti TC" w:eastAsia="Heiti TC" w:cs="Heiti TC"/>
           <w:b w:val="0"/>
           <w:sz w:val="22"/>
         </w:rPr>
@@ -2645,7 +2699,7 @@
       </w:pPr>
       <w:r>
         <w:rPr>
-          <w:rFonts w:ascii="PingFangTC-Regular" w:hAnsi="PingFangTC-Regular" w:eastAsia="PingFangTC-Regular" w:cs="PingFangTC-Regular"/>
+          <w:rFonts w:ascii="Heiti TC" w:hAnsi="Heiti TC" w:eastAsia="Heiti TC" w:cs="Heiti TC"/>
           <w:b w:val="0"/>
           <w:sz w:val="26"/>
         </w:rPr>
@@ -2659,7 +2713,7 @@
       </w:pPr>
       <w:r>
         <w:rPr>
-          <w:rFonts w:ascii="PingFangTC-Regular" w:hAnsi="PingFangTC-Regular" w:eastAsia="PingFangTC-Regular" w:cs="PingFangTC-Regular"/>
+          <w:rFonts w:ascii="Heiti TC" w:hAnsi="Heiti TC" w:eastAsia="Heiti TC" w:cs="Heiti TC"/>
           <w:b w:val="0"/>
           <w:sz w:val="22"/>
         </w:rPr>
@@ -2672,7 +2726,7 @@
       </w:pPr>
       <w:r>
         <w:rPr>
-          <w:rFonts w:ascii="PingFangTC-Regular" w:hAnsi="PingFangTC-Regular" w:eastAsia="PingFangTC-Regular" w:cs="PingFangTC-Regular"/>
+          <w:rFonts w:ascii="Heiti TC" w:hAnsi="Heiti TC" w:eastAsia="Heiti TC" w:cs="Heiti TC"/>
           <w:b w:val="0"/>
           <w:sz w:val="26"/>
         </w:rPr>
@@ -2686,7 +2740,7 @@
       </w:pPr>
       <w:r>
         <w:rPr>
-          <w:rFonts w:ascii="PingFangTC-Regular" w:hAnsi="PingFangTC-Regular" w:eastAsia="PingFangTC-Regular" w:cs="PingFangTC-Regular"/>
+          <w:rFonts w:ascii="Heiti TC" w:hAnsi="Heiti TC" w:eastAsia="Heiti TC" w:cs="Heiti TC"/>
           <w:b w:val="0"/>
           <w:sz w:val="22"/>
         </w:rPr>
@@ -2699,7 +2753,7 @@
       </w:pPr>
       <w:r>
         <w:rPr>
-          <w:rFonts w:ascii="PingFangTC-Regular" w:hAnsi="PingFangTC-Regular" w:eastAsia="PingFangTC-Regular" w:cs="PingFangTC-Regular"/>
+          <w:rFonts w:ascii="Heiti TC" w:hAnsi="Heiti TC" w:eastAsia="Heiti TC" w:cs="Heiti TC"/>
           <w:b w:val="0"/>
           <w:sz w:val="26"/>
         </w:rPr>
@@ -2713,7 +2767,7 @@
       </w:pPr>
       <w:r>
         <w:rPr>
-          <w:rFonts w:ascii="PingFangTC-Regular" w:hAnsi="PingFangTC-Regular" w:eastAsia="PingFangTC-Regular" w:cs="PingFangTC-Regular"/>
+          <w:rFonts w:ascii="Heiti TC" w:hAnsi="Heiti TC" w:eastAsia="Heiti TC" w:cs="Heiti TC"/>
           <w:b w:val="0"/>
           <w:sz w:val="22"/>
         </w:rPr>
@@ -2726,7 +2780,7 @@
       </w:pPr>
       <w:r>
         <w:rPr>
-          <w:rFonts w:ascii="PingFangTC-Regular" w:hAnsi="PingFangTC-Regular" w:eastAsia="PingFangTC-Regular" w:cs="PingFangTC-Regular"/>
+          <w:rFonts w:ascii="Heiti TC" w:hAnsi="Heiti TC" w:eastAsia="Heiti TC" w:cs="Heiti TC"/>
           <w:b w:val="0"/>
           <w:sz w:val="26"/>
         </w:rPr>
@@ -2740,7 +2794,7 @@
       </w:pPr>
       <w:r>
         <w:rPr>
-          <w:rFonts w:ascii="PingFangTC-Regular" w:hAnsi="PingFangTC-Regular" w:eastAsia="PingFangTC-Regular" w:cs="PingFangTC-Regular"/>
+          <w:rFonts w:ascii="Heiti TC" w:hAnsi="Heiti TC" w:eastAsia="Heiti TC" w:cs="Heiti TC"/>
           <w:b w:val="0"/>
           <w:sz w:val="22"/>
         </w:rPr>
@@ -2749,11 +2803,65 @@
     </w:p>
     <w:p>
       <w:pPr>
+        <w:spacing w:before="200" w:after="120"/>
+      </w:pPr>
+      <w:r>
+        <w:rPr>
+          <w:rFonts w:ascii="Heiti TC" w:hAnsi="Heiti TC" w:eastAsia="Heiti TC" w:cs="Heiti TC"/>
+          <w:b w:val="0"/>
+          <w:sz w:val="26"/>
+        </w:rPr>
+        <w:t>2026-10-21｜八檔共享模型與 TSLA 專屬模型</w:t>
+      </w:r>
+    </w:p>
+    <w:p>
+      <w:pPr>
+        <w:pStyle w:val="ListBullet"/>
+        <w:spacing w:after="60" w:line="276" w:lineRule="auto"/>
+      </w:pPr>
+      <w:r>
+        <w:rPr>
+          <w:rFonts w:ascii="Heiti TC" w:hAnsi="Heiti TC" w:eastAsia="Heiti TC" w:cs="Heiti TC"/>
+          <w:b w:val="0"/>
+          <w:sz w:val="22"/>
+        </w:rPr>
+        <w:t>已確認並完成八檔共享模型與 TSLA 專屬模型。模型可顯示資料不足、低信心與不交易；準確率只是其中一項指標，必須連同基準、方向報酬、最大回撤與機率校準閱讀。</w:t>
+      </w:r>
+    </w:p>
+    <w:p>
+      <w:pPr>
+        <w:spacing w:before="200" w:after="120"/>
+      </w:pPr>
+      <w:r>
+        <w:rPr>
+          <w:rFonts w:ascii="Heiti TC" w:hAnsi="Heiti TC" w:eastAsia="Heiti TC" w:cs="Heiti TC"/>
+          <w:b w:val="0"/>
+          <w:sz w:val="26"/>
+        </w:rPr>
+        <w:t>2026-10-21｜模型快取精簡發布與 40 MB 安全門檻</w:t>
+      </w:r>
+    </w:p>
+    <w:p>
+      <w:pPr>
+        <w:pStyle w:val="ListBullet"/>
+        <w:spacing w:after="60" w:line="276" w:lineRule="auto"/>
+      </w:pPr>
+      <w:r>
+        <w:rPr>
+          <w:rFonts w:ascii="Heiti TC" w:hAnsi="Heiti TC" w:eastAsia="Heiti TC" w:cs="Heiti TC"/>
+          <w:b w:val="0"/>
+          <w:sz w:val="22"/>
+        </w:rPr>
+        <w:t>使用者詢問 40 MB 是否代表不能再新增資料。已釐清：限制只套用在單次自動提交，正常六小時資料收集不會因資料庫總量超過 40 MB 而停止。可能觸發的情況包括大量歷史回補、完整 LSTM 重訓、CSV 與 Parquet 重複輸出或異常重複寫入。</w:t>
+      </w:r>
+    </w:p>
+    <w:p>
+      <w:pPr>
         <w:spacing w:before="280" w:after="120"/>
       </w:pPr>
       <w:r>
         <w:rPr>
-          <w:rFonts w:ascii="PingFangTC-Regular" w:hAnsi="PingFangTC-Regular" w:eastAsia="PingFangTC-Regular" w:cs="PingFangTC-Regular"/>
+          <w:rFonts w:ascii="Heiti TC" w:hAnsi="Heiti TC" w:eastAsia="Heiti TC" w:cs="Heiti TC"/>
           <w:b w:val="0"/>
           <w:sz w:val="32"/>
         </w:rPr>
@@ -2766,7 +2874,7 @@
       </w:pPr>
       <w:r>
         <w:rPr>
-          <w:rFonts w:ascii="PingFangTC-Regular" w:hAnsi="PingFangTC-Regular" w:eastAsia="PingFangTC-Regular" w:cs="PingFangTC-Regular"/>
+          <w:rFonts w:ascii="Heiti TC" w:hAnsi="Heiti TC" w:eastAsia="Heiti TC" w:cs="Heiti TC"/>
           <w:b w:val="0"/>
           <w:sz w:val="32"/>
         </w:rPr>
@@ -2779,7 +2887,7 @@
       </w:pPr>
       <w:r>
         <w:rPr>
-          <w:rFonts w:ascii="PingFangTC-Regular" w:hAnsi="PingFangTC-Regular" w:eastAsia="PingFangTC-Regular" w:cs="PingFangTC-Regular"/>
+          <w:rFonts w:ascii="Heiti TC" w:hAnsi="Heiti TC" w:eastAsia="Heiti TC" w:cs="Heiti TC"/>
           <w:b w:val="0"/>
           <w:sz w:val="26"/>
         </w:rPr>
@@ -2793,7 +2901,7 @@
       </w:pPr>
       <w:r>
         <w:rPr>
-          <w:rFonts w:ascii="PingFangTC-Regular" w:hAnsi="PingFangTC-Regular" w:eastAsia="PingFangTC-Regular" w:cs="PingFangTC-Regular"/>
+          <w:rFonts w:ascii="Heiti TC" w:hAnsi="Heiti TC" w:eastAsia="Heiti TC" w:cs="Heiti TC"/>
           <w:b w:val="0"/>
           <w:sz w:val="22"/>
         </w:rPr>
@@ -2807,7 +2915,7 @@
       </w:pPr>
       <w:r>
         <w:rPr>
-          <w:rFonts w:ascii="PingFangTC-Regular" w:hAnsi="PingFangTC-Regular" w:eastAsia="PingFangTC-Regular" w:cs="PingFangTC-Regular"/>
+          <w:rFonts w:ascii="Heiti TC" w:hAnsi="Heiti TC" w:eastAsia="Heiti TC" w:cs="Heiti TC"/>
           <w:b w:val="0"/>
           <w:sz w:val="22"/>
         </w:rPr>
@@ -2820,7 +2928,7 @@
       </w:pPr>
       <w:r>
         <w:rPr>
-          <w:rFonts w:ascii="PingFangTC-Regular" w:hAnsi="PingFangTC-Regular" w:eastAsia="PingFangTC-Regular" w:cs="PingFangTC-Regular"/>
+          <w:rFonts w:ascii="Heiti TC" w:hAnsi="Heiti TC" w:eastAsia="Heiti TC" w:cs="Heiti TC"/>
           <w:b w:val="0"/>
           <w:sz w:val="26"/>
         </w:rPr>
@@ -2834,7 +2942,7 @@
       </w:pPr>
       <w:r>
         <w:rPr>
-          <w:rFonts w:ascii="PingFangTC-Regular" w:hAnsi="PingFangTC-Regular" w:eastAsia="PingFangTC-Regular" w:cs="PingFangTC-Regular"/>
+          <w:rFonts w:ascii="Heiti TC" w:hAnsi="Heiti TC" w:eastAsia="Heiti TC" w:cs="Heiti TC"/>
           <w:b w:val="0"/>
           <w:sz w:val="22"/>
         </w:rPr>
@@ -2848,7 +2956,7 @@
       </w:pPr>
       <w:r>
         <w:rPr>
-          <w:rFonts w:ascii="PingFangTC-Regular" w:hAnsi="PingFangTC-Regular" w:eastAsia="PingFangTC-Regular" w:cs="PingFangTC-Regular"/>
+          <w:rFonts w:ascii="Heiti TC" w:hAnsi="Heiti TC" w:eastAsia="Heiti TC" w:cs="Heiti TC"/>
           <w:b w:val="0"/>
           <w:sz w:val="22"/>
         </w:rPr>
@@ -2862,7 +2970,7 @@
       </w:pPr>
       <w:r>
         <w:rPr>
-          <w:rFonts w:ascii="PingFangTC-Regular" w:hAnsi="PingFangTC-Regular" w:eastAsia="PingFangTC-Regular" w:cs="PingFangTC-Regular"/>
+          <w:rFonts w:ascii="Heiti TC" w:hAnsi="Heiti TC" w:eastAsia="Heiti TC" w:cs="Heiti TC"/>
           <w:b w:val="0"/>
           <w:sz w:val="22"/>
         </w:rPr>
@@ -2876,7 +2984,7 @@
       </w:pPr>
       <w:r>
         <w:rPr>
-          <w:rFonts w:ascii="PingFangTC-Regular" w:hAnsi="PingFangTC-Regular" w:eastAsia="PingFangTC-Regular" w:cs="PingFangTC-Regular"/>
+          <w:rFonts w:ascii="Heiti TC" w:hAnsi="Heiti TC" w:eastAsia="Heiti TC" w:cs="Heiti TC"/>
           <w:b w:val="0"/>
           <w:sz w:val="22"/>
         </w:rPr>
@@ -2889,7 +2997,7 @@
       </w:pPr>
       <w:r>
         <w:rPr>
-          <w:rFonts w:ascii="PingFangTC-Regular" w:hAnsi="PingFangTC-Regular" w:eastAsia="PingFangTC-Regular" w:cs="PingFangTC-Regular"/>
+          <w:rFonts w:ascii="Heiti TC" w:hAnsi="Heiti TC" w:eastAsia="Heiti TC" w:cs="Heiti TC"/>
           <w:b w:val="0"/>
           <w:sz w:val="26"/>
         </w:rPr>
@@ -2903,7 +3011,7 @@
       </w:pPr>
       <w:r>
         <w:rPr>
-          <w:rFonts w:ascii="PingFangTC-Regular" w:hAnsi="PingFangTC-Regular" w:eastAsia="PingFangTC-Regular" w:cs="PingFangTC-Regular"/>
+          <w:rFonts w:ascii="Heiti TC" w:hAnsi="Heiti TC" w:eastAsia="Heiti TC" w:cs="Heiti TC"/>
           <w:b w:val="0"/>
           <w:sz w:val="22"/>
         </w:rPr>
@@ -2917,7 +3025,7 @@
       </w:pPr>
       <w:r>
         <w:rPr>
-          <w:rFonts w:ascii="PingFangTC-Regular" w:hAnsi="PingFangTC-Regular" w:eastAsia="PingFangTC-Regular" w:cs="PingFangTC-Regular"/>
+          <w:rFonts w:ascii="Heiti TC" w:hAnsi="Heiti TC" w:eastAsia="Heiti TC" w:cs="Heiti TC"/>
           <w:b w:val="0"/>
           <w:sz w:val="22"/>
         </w:rPr>
@@ -2931,7 +3039,7 @@
       </w:pPr>
       <w:r>
         <w:rPr>
-          <w:rFonts w:ascii="PingFangTC-Regular" w:hAnsi="PingFangTC-Regular" w:eastAsia="PingFangTC-Regular" w:cs="PingFangTC-Regular"/>
+          <w:rFonts w:ascii="Heiti TC" w:hAnsi="Heiti TC" w:eastAsia="Heiti TC" w:cs="Heiti TC"/>
           <w:b w:val="0"/>
           <w:sz w:val="22"/>
         </w:rPr>
@@ -2944,7 +3052,7 @@
       </w:pPr>
       <w:r>
         <w:rPr>
-          <w:rFonts w:ascii="PingFangTC-Regular" w:hAnsi="PingFangTC-Regular" w:eastAsia="PingFangTC-Regular" w:cs="PingFangTC-Regular"/>
+          <w:rFonts w:ascii="Heiti TC" w:hAnsi="Heiti TC" w:eastAsia="Heiti TC" w:cs="Heiti TC"/>
           <w:b w:val="0"/>
           <w:sz w:val="26"/>
         </w:rPr>
@@ -2958,7 +3066,7 @@
       </w:pPr>
       <w:r>
         <w:rPr>
-          <w:rFonts w:ascii="PingFangTC-Regular" w:hAnsi="PingFangTC-Regular" w:eastAsia="PingFangTC-Regular" w:cs="PingFangTC-Regular"/>
+          <w:rFonts w:ascii="Heiti TC" w:hAnsi="Heiti TC" w:eastAsia="Heiti TC" w:cs="Heiti TC"/>
           <w:b w:val="0"/>
           <w:sz w:val="22"/>
         </w:rPr>
@@ -2972,7 +3080,7 @@
       </w:pPr>
       <w:r>
         <w:rPr>
-          <w:rFonts w:ascii="PingFangTC-Regular" w:hAnsi="PingFangTC-Regular" w:eastAsia="PingFangTC-Regular" w:cs="PingFangTC-Regular"/>
+          <w:rFonts w:ascii="Heiti TC" w:hAnsi="Heiti TC" w:eastAsia="Heiti TC" w:cs="Heiti TC"/>
           <w:b w:val="0"/>
           <w:sz w:val="22"/>
         </w:rPr>
@@ -2986,7 +3094,7 @@
       </w:pPr>
       <w:r>
         <w:rPr>
-          <w:rFonts w:ascii="PingFangTC-Regular" w:hAnsi="PingFangTC-Regular" w:eastAsia="PingFangTC-Regular" w:cs="PingFangTC-Regular"/>
+          <w:rFonts w:ascii="Heiti TC" w:hAnsi="Heiti TC" w:eastAsia="Heiti TC" w:cs="Heiti TC"/>
           <w:b w:val="0"/>
           <w:sz w:val="22"/>
         </w:rPr>
@@ -3000,7 +3108,7 @@
       </w:pPr>
       <w:r>
         <w:rPr>
-          <w:rFonts w:ascii="PingFangTC-Regular" w:hAnsi="PingFangTC-Regular" w:eastAsia="PingFangTC-Regular" w:cs="PingFangTC-Regular"/>
+          <w:rFonts w:ascii="Heiti TC" w:hAnsi="Heiti TC" w:eastAsia="Heiti TC" w:cs="Heiti TC"/>
           <w:b w:val="0"/>
           <w:sz w:val="22"/>
         </w:rPr>
@@ -3014,7 +3122,7 @@
       </w:pPr>
       <w:r>
         <w:rPr>
-          <w:rFonts w:ascii="PingFangTC-Regular" w:hAnsi="PingFangTC-Regular" w:eastAsia="PingFangTC-Regular" w:cs="PingFangTC-Regular"/>
+          <w:rFonts w:ascii="Heiti TC" w:hAnsi="Heiti TC" w:eastAsia="Heiti TC" w:cs="Heiti TC"/>
           <w:b w:val="0"/>
           <w:sz w:val="22"/>
         </w:rPr>
@@ -3027,7 +3135,7 @@
       </w:pPr>
       <w:r>
         <w:rPr>
-          <w:rFonts w:ascii="PingFangTC-Regular" w:hAnsi="PingFangTC-Regular" w:eastAsia="PingFangTC-Regular" w:cs="PingFangTC-Regular"/>
+          <w:rFonts w:ascii="Heiti TC" w:hAnsi="Heiti TC" w:eastAsia="Heiti TC" w:cs="Heiti TC"/>
           <w:b w:val="0"/>
           <w:sz w:val="26"/>
         </w:rPr>
@@ -3041,7 +3149,7 @@
       </w:pPr>
       <w:r>
         <w:rPr>
-          <w:rFonts w:ascii="PingFangTC-Regular" w:hAnsi="PingFangTC-Regular" w:eastAsia="PingFangTC-Regular" w:cs="PingFangTC-Regular"/>
+          <w:rFonts w:ascii="Heiti TC" w:hAnsi="Heiti TC" w:eastAsia="Heiti TC" w:cs="Heiti TC"/>
           <w:b w:val="0"/>
           <w:sz w:val="22"/>
         </w:rPr>
@@ -3054,7 +3162,7 @@
       </w:pPr>
       <w:r>
         <w:rPr>
-          <w:rFonts w:ascii="PingFangTC-Regular" w:hAnsi="PingFangTC-Regular" w:eastAsia="PingFangTC-Regular" w:cs="PingFangTC-Regular"/>
+          <w:rFonts w:ascii="Heiti TC" w:hAnsi="Heiti TC" w:eastAsia="Heiti TC" w:cs="Heiti TC"/>
           <w:b w:val="0"/>
           <w:sz w:val="26"/>
         </w:rPr>
@@ -3068,7 +3176,7 @@
       </w:pPr>
       <w:r>
         <w:rPr>
-          <w:rFonts w:ascii="PingFangTC-Regular" w:hAnsi="PingFangTC-Regular" w:eastAsia="PingFangTC-Regular" w:cs="PingFangTC-Regular"/>
+          <w:rFonts w:ascii="Heiti TC" w:hAnsi="Heiti TC" w:eastAsia="Heiti TC" w:cs="Heiti TC"/>
           <w:b w:val="0"/>
           <w:sz w:val="22"/>
         </w:rPr>
@@ -3081,7 +3189,7 @@
       </w:pPr>
       <w:r>
         <w:rPr>
-          <w:rFonts w:ascii="PingFangTC-Regular" w:hAnsi="PingFangTC-Regular" w:eastAsia="PingFangTC-Regular" w:cs="PingFangTC-Regular"/>
+          <w:rFonts w:ascii="Heiti TC" w:hAnsi="Heiti TC" w:eastAsia="Heiti TC" w:cs="Heiti TC"/>
           <w:b w:val="0"/>
           <w:sz w:val="26"/>
         </w:rPr>
@@ -3095,7 +3203,7 @@
       </w:pPr>
       <w:r>
         <w:rPr>
-          <w:rFonts w:ascii="PingFangTC-Regular" w:hAnsi="PingFangTC-Regular" w:eastAsia="PingFangTC-Regular" w:cs="PingFangTC-Regular"/>
+          <w:rFonts w:ascii="Heiti TC" w:hAnsi="Heiti TC" w:eastAsia="Heiti TC" w:cs="Heiti TC"/>
           <w:b w:val="0"/>
           <w:sz w:val="22"/>
         </w:rPr>
@@ -3108,7 +3216,7 @@
       </w:pPr>
       <w:r>
         <w:rPr>
-          <w:rFonts w:ascii="PingFangTC-Regular" w:hAnsi="PingFangTC-Regular" w:eastAsia="PingFangTC-Regular" w:cs="PingFangTC-Regular"/>
+          <w:rFonts w:ascii="Heiti TC" w:hAnsi="Heiti TC" w:eastAsia="Heiti TC" w:cs="Heiti TC"/>
           <w:b w:val="0"/>
           <w:sz w:val="26"/>
         </w:rPr>
@@ -3122,7 +3230,7 @@
       </w:pPr>
       <w:r>
         <w:rPr>
-          <w:rFonts w:ascii="PingFangTC-Regular" w:hAnsi="PingFangTC-Regular" w:eastAsia="PingFangTC-Regular" w:cs="PingFangTC-Regular"/>
+          <w:rFonts w:ascii="Heiti TC" w:hAnsi="Heiti TC" w:eastAsia="Heiti TC" w:cs="Heiti TC"/>
           <w:b w:val="0"/>
           <w:sz w:val="22"/>
         </w:rPr>
@@ -3135,7 +3243,7 @@
       </w:pPr>
       <w:r>
         <w:rPr>
-          <w:rFonts w:ascii="PingFangTC-Regular" w:hAnsi="PingFangTC-Regular" w:eastAsia="PingFangTC-Regular" w:cs="PingFangTC-Regular"/>
+          <w:rFonts w:ascii="Heiti TC" w:hAnsi="Heiti TC" w:eastAsia="Heiti TC" w:cs="Heiti TC"/>
           <w:b w:val="0"/>
           <w:sz w:val="26"/>
         </w:rPr>
@@ -3149,7 +3257,7 @@
       </w:pPr>
       <w:r>
         <w:rPr>
-          <w:rFonts w:ascii="PingFangTC-Regular" w:hAnsi="PingFangTC-Regular" w:eastAsia="PingFangTC-Regular" w:cs="PingFangTC-Regular"/>
+          <w:rFonts w:ascii="Heiti TC" w:hAnsi="Heiti TC" w:eastAsia="Heiti TC" w:cs="Heiti TC"/>
           <w:b w:val="0"/>
           <w:sz w:val="22"/>
         </w:rPr>
@@ -3162,7 +3270,7 @@
       </w:pPr>
       <w:r>
         <w:rPr>
-          <w:rFonts w:ascii="PingFangTC-Regular" w:hAnsi="PingFangTC-Regular" w:eastAsia="PingFangTC-Regular" w:cs="PingFangTC-Regular"/>
+          <w:rFonts w:ascii="Heiti TC" w:hAnsi="Heiti TC" w:eastAsia="Heiti TC" w:cs="Heiti TC"/>
           <w:b w:val="0"/>
           <w:sz w:val="26"/>
         </w:rPr>
@@ -3176,7 +3284,7 @@
       </w:pPr>
       <w:r>
         <w:rPr>
-          <w:rFonts w:ascii="PingFangTC-Regular" w:hAnsi="PingFangTC-Regular" w:eastAsia="PingFangTC-Regular" w:cs="PingFangTC-Regular"/>
+          <w:rFonts w:ascii="Heiti TC" w:hAnsi="Heiti TC" w:eastAsia="Heiti TC" w:cs="Heiti TC"/>
           <w:b w:val="0"/>
           <w:sz w:val="22"/>
         </w:rPr>
@@ -3189,7 +3297,7 @@
       </w:pPr>
       <w:r>
         <w:rPr>
-          <w:rFonts w:ascii="PingFangTC-Regular" w:hAnsi="PingFangTC-Regular" w:eastAsia="PingFangTC-Regular" w:cs="PingFangTC-Regular"/>
+          <w:rFonts w:ascii="Heiti TC" w:hAnsi="Heiti TC" w:eastAsia="Heiti TC" w:cs="Heiti TC"/>
           <w:b w:val="0"/>
           <w:sz w:val="26"/>
         </w:rPr>
@@ -3203,7 +3311,7 @@
       </w:pPr>
       <w:r>
         <w:rPr>
-          <w:rFonts w:ascii="PingFangTC-Regular" w:hAnsi="PingFangTC-Regular" w:eastAsia="PingFangTC-Regular" w:cs="PingFangTC-Regular"/>
+          <w:rFonts w:ascii="Heiti TC" w:hAnsi="Heiti TC" w:eastAsia="Heiti TC" w:cs="Heiti TC"/>
           <w:b w:val="0"/>
           <w:sz w:val="22"/>
         </w:rPr>
@@ -3216,7 +3324,7 @@
       </w:pPr>
       <w:r>
         <w:rPr>
-          <w:rFonts w:ascii="PingFangTC-Regular" w:hAnsi="PingFangTC-Regular" w:eastAsia="PingFangTC-Regular" w:cs="PingFangTC-Regular"/>
+          <w:rFonts w:ascii="Heiti TC" w:hAnsi="Heiti TC" w:eastAsia="Heiti TC" w:cs="Heiti TC"/>
           <w:b w:val="0"/>
           <w:sz w:val="26"/>
         </w:rPr>
@@ -3230,7 +3338,7 @@
       </w:pPr>
       <w:r>
         <w:rPr>
-          <w:rFonts w:ascii="PingFangTC-Regular" w:hAnsi="PingFangTC-Regular" w:eastAsia="PingFangTC-Regular" w:cs="PingFangTC-Regular"/>
+          <w:rFonts w:ascii="Heiti TC" w:hAnsi="Heiti TC" w:eastAsia="Heiti TC" w:cs="Heiti TC"/>
           <w:b w:val="0"/>
           <w:sz w:val="22"/>
         </w:rPr>
@@ -3243,7 +3351,7 @@
       </w:pPr>
       <w:r>
         <w:rPr>
-          <w:rFonts w:ascii="PingFangTC-Regular" w:hAnsi="PingFangTC-Regular" w:eastAsia="PingFangTC-Regular" w:cs="PingFangTC-Regular"/>
+          <w:rFonts w:ascii="Heiti TC" w:hAnsi="Heiti TC" w:eastAsia="Heiti TC" w:cs="Heiti TC"/>
           <w:b w:val="0"/>
           <w:sz w:val="26"/>
         </w:rPr>
@@ -3257,7 +3365,7 @@
       </w:pPr>
       <w:r>
         <w:rPr>
-          <w:rFonts w:ascii="PingFangTC-Regular" w:hAnsi="PingFangTC-Regular" w:eastAsia="PingFangTC-Regular" w:cs="PingFangTC-Regular"/>
+          <w:rFonts w:ascii="Heiti TC" w:hAnsi="Heiti TC" w:eastAsia="Heiti TC" w:cs="Heiti TC"/>
           <w:b w:val="0"/>
           <w:sz w:val="22"/>
         </w:rPr>
@@ -3270,7 +3378,61 @@
       </w:pPr>
       <w:r>
         <w:rPr>
-          <w:rFonts w:ascii="PingFangTC-Regular" w:hAnsi="PingFangTC-Regular" w:eastAsia="PingFangTC-Regular" w:cs="PingFangTC-Regular"/>
+          <w:rFonts w:ascii="Heiti TC" w:hAnsi="Heiti TC" w:eastAsia="Heiti TC" w:cs="Heiti TC"/>
+          <w:b w:val="0"/>
+          <w:sz w:val="26"/>
+        </w:rPr>
+        <w:t>2026-10-21｜八檔共享模型與 TSLA 專屬模型</w:t>
+      </w:r>
+    </w:p>
+    <w:p>
+      <w:pPr>
+        <w:pStyle w:val="ListBullet"/>
+        <w:spacing w:after="60" w:line="276" w:lineRule="auto"/>
+      </w:pPr>
+      <w:r>
+        <w:rPr>
+          <w:rFonts w:ascii="Heiti TC" w:hAnsi="Heiti TC" w:eastAsia="Heiti TC" w:cs="Heiti TC"/>
+          <w:b w:val="0"/>
+          <w:sz w:val="22"/>
+        </w:rPr>
+        <w:t>已部署 lstm-regime-v2：共享模型已產生 5497 筆特徵與 792 筆測試資料；TSLA 專屬模型已產生 690 筆特徵與 101 筆測試資料。現階段模型仍屬低信心研究工具，不應視為投資保證。</w:t>
+      </w:r>
+    </w:p>
+    <w:p>
+      <w:pPr>
+        <w:spacing w:before="200" w:after="120"/>
+      </w:pPr>
+      <w:r>
+        <w:rPr>
+          <w:rFonts w:ascii="Heiti TC" w:hAnsi="Heiti TC" w:eastAsia="Heiti TC" w:cs="Heiti TC"/>
+          <w:b w:val="0"/>
+          <w:sz w:val="26"/>
+        </w:rPr>
+        <w:t>2026-10-21｜模型快取精簡發布與 40 MB 安全門檻</w:t>
+      </w:r>
+    </w:p>
+    <w:p>
+      <w:pPr>
+        <w:pStyle w:val="ListBullet"/>
+        <w:spacing w:after="60" w:line="276" w:lineRule="auto"/>
+      </w:pPr>
+      <w:r>
+        <w:rPr>
+          <w:rFonts w:ascii="Heiti TC" w:hAnsi="Heiti TC" w:eastAsia="Heiti TC" w:cs="Heiti TC"/>
+          <w:b w:val="0"/>
+          <w:sz w:val="22"/>
+        </w:rPr>
+        <w:t>GitHub Actions 第 732 次已成功驗證：八檔共享模型、TSLA 專屬模型、快取精簡、自動暫存同步與推送均成功。後續若觸發 40 MB 門檻，應由資料健康檢查列出大型檔案並判斷排除或分批保存。</w:t>
+      </w:r>
+    </w:p>
+    <w:p>
+      <w:pPr>
+        <w:spacing w:before="200" w:after="120"/>
+      </w:pPr>
+      <w:r>
+        <w:rPr>
+          <w:rFonts w:ascii="Heiti TC" w:hAnsi="Heiti TC" w:eastAsia="Heiti TC" w:cs="Heiti TC"/>
           <w:b w:val="0"/>
           <w:sz w:val="26"/>
         </w:rPr>
@@ -3306,7 +3468,7 @@
             </w:pPr>
             <w:r>
               <w:rPr>
-                <w:rFonts w:ascii="PingFangTC-Regular" w:hAnsi="PingFangTC-Regular" w:eastAsia="PingFangTC-Regular" w:cs="PingFangTC-Regular"/>
+                <w:rFonts w:ascii="Heiti TC" w:hAnsi="Heiti TC" w:eastAsia="Heiti TC" w:cs="Heiti TC"/>
                 <w:b/>
                 <w:sz w:val="20"/>
               </w:rPr>
@@ -3324,7 +3486,7 @@
             </w:pPr>
             <w:r>
               <w:rPr>
-                <w:rFonts w:ascii="PingFangTC-Regular" w:hAnsi="PingFangTC-Regular" w:eastAsia="PingFangTC-Regular" w:cs="PingFangTC-Regular"/>
+                <w:rFonts w:ascii="Heiti TC" w:hAnsi="Heiti TC" w:eastAsia="Heiti TC" w:cs="Heiti TC"/>
                 <w:b/>
                 <w:sz w:val="20"/>
               </w:rPr>
@@ -3342,7 +3504,7 @@
             </w:pPr>
             <w:r>
               <w:rPr>
-                <w:rFonts w:ascii="PingFangTC-Regular" w:hAnsi="PingFangTC-Regular" w:eastAsia="PingFangTC-Regular" w:cs="PingFangTC-Regular"/>
+                <w:rFonts w:ascii="Heiti TC" w:hAnsi="Heiti TC" w:eastAsia="Heiti TC" w:cs="Heiti TC"/>
                 <w:b/>
                 <w:sz w:val="20"/>
               </w:rPr>
@@ -3360,7 +3522,7 @@
             </w:pPr>
             <w:r>
               <w:rPr>
-                <w:rFonts w:ascii="PingFangTC-Regular" w:hAnsi="PingFangTC-Regular" w:eastAsia="PingFangTC-Regular" w:cs="PingFangTC-Regular"/>
+                <w:rFonts w:ascii="Heiti TC" w:hAnsi="Heiti TC" w:eastAsia="Heiti TC" w:cs="Heiti TC"/>
                 <w:b/>
                 <w:sz w:val="20"/>
               </w:rPr>
@@ -3378,7 +3540,7 @@
             </w:pPr>
             <w:r>
               <w:rPr>
-                <w:rFonts w:ascii="PingFangTC-Regular" w:hAnsi="PingFangTC-Regular" w:eastAsia="PingFangTC-Regular" w:cs="PingFangTC-Regular"/>
+                <w:rFonts w:ascii="Heiti TC" w:hAnsi="Heiti TC" w:eastAsia="Heiti TC" w:cs="Heiti TC"/>
                 <w:b/>
                 <w:sz w:val="20"/>
               </w:rPr>
@@ -3396,7 +3558,7 @@
             </w:pPr>
             <w:r>
               <w:rPr>
-                <w:rFonts w:ascii="PingFangTC-Regular" w:hAnsi="PingFangTC-Regular" w:eastAsia="PingFangTC-Regular" w:cs="PingFangTC-Regular"/>
+                <w:rFonts w:ascii="Heiti TC" w:hAnsi="Heiti TC" w:eastAsia="Heiti TC" w:cs="Heiti TC"/>
                 <w:b/>
                 <w:sz w:val="20"/>
               </w:rPr>
@@ -3414,7 +3576,7 @@
             </w:pPr>
             <w:r>
               <w:rPr>
-                <w:rFonts w:ascii="PingFangTC-Regular" w:hAnsi="PingFangTC-Regular" w:eastAsia="PingFangTC-Regular" w:cs="PingFangTC-Regular"/>
+                <w:rFonts w:ascii="Heiti TC" w:hAnsi="Heiti TC" w:eastAsia="Heiti TC" w:cs="Heiti TC"/>
                 <w:b/>
                 <w:sz w:val="20"/>
               </w:rPr>
@@ -3432,7 +3594,7 @@
             </w:pPr>
             <w:r>
               <w:rPr>
-                <w:rFonts w:ascii="PingFangTC-Regular" w:hAnsi="PingFangTC-Regular" w:eastAsia="PingFangTC-Regular" w:cs="PingFangTC-Regular"/>
+                <w:rFonts w:ascii="Heiti TC" w:hAnsi="Heiti TC" w:eastAsia="Heiti TC" w:cs="Heiti TC"/>
                 <w:b/>
                 <w:sz w:val="20"/>
               </w:rPr>
@@ -3450,7 +3612,7 @@
             </w:pPr>
             <w:r>
               <w:rPr>
-                <w:rFonts w:ascii="PingFangTC-Regular" w:hAnsi="PingFangTC-Regular" w:eastAsia="PingFangTC-Regular" w:cs="PingFangTC-Regular"/>
+                <w:rFonts w:ascii="Heiti TC" w:hAnsi="Heiti TC" w:eastAsia="Heiti TC" w:cs="Heiti TC"/>
                 <w:b/>
                 <w:sz w:val="20"/>
               </w:rPr>
@@ -3470,7 +3632,7 @@
             </w:pPr>
             <w:r>
               <w:rPr>
-                <w:rFonts w:ascii="PingFangTC-Regular" w:hAnsi="PingFangTC-Regular" w:eastAsia="PingFangTC-Regular" w:cs="PingFangTC-Regular"/>
+                <w:rFonts w:ascii="Heiti TC" w:hAnsi="Heiti TC" w:eastAsia="Heiti TC" w:cs="Heiti TC"/>
                 <w:b w:val="0"/>
                 <w:sz w:val="20"/>
               </w:rPr>
@@ -3488,7 +3650,7 @@
             </w:pPr>
             <w:r>
               <w:rPr>
-                <w:rFonts w:ascii="PingFangTC-Regular" w:hAnsi="PingFangTC-Regular" w:eastAsia="PingFangTC-Regular" w:cs="PingFangTC-Regular"/>
+                <w:rFonts w:ascii="Heiti TC" w:hAnsi="Heiti TC" w:eastAsia="Heiti TC" w:cs="Heiti TC"/>
                 <w:b w:val="0"/>
                 <w:sz w:val="20"/>
               </w:rPr>
@@ -3506,7 +3668,7 @@
             </w:pPr>
             <w:r>
               <w:rPr>
-                <w:rFonts w:ascii="PingFangTC-Regular" w:hAnsi="PingFangTC-Regular" w:eastAsia="PingFangTC-Regular" w:cs="PingFangTC-Regular"/>
+                <w:rFonts w:ascii="Heiti TC" w:hAnsi="Heiti TC" w:eastAsia="Heiti TC" w:cs="Heiti TC"/>
                 <w:b w:val="0"/>
                 <w:sz w:val="20"/>
               </w:rPr>
@@ -3524,7 +3686,7 @@
             </w:pPr>
             <w:r>
               <w:rPr>
-                <w:rFonts w:ascii="PingFangTC-Regular" w:hAnsi="PingFangTC-Regular" w:eastAsia="PingFangTC-Regular" w:cs="PingFangTC-Regular"/>
+                <w:rFonts w:ascii="Heiti TC" w:hAnsi="Heiti TC" w:eastAsia="Heiti TC" w:cs="Heiti TC"/>
                 <w:b w:val="0"/>
                 <w:sz w:val="20"/>
               </w:rPr>
@@ -3542,7 +3704,7 @@
             </w:pPr>
             <w:r>
               <w:rPr>
-                <w:rFonts w:ascii="PingFangTC-Regular" w:hAnsi="PingFangTC-Regular" w:eastAsia="PingFangTC-Regular" w:cs="PingFangTC-Regular"/>
+                <w:rFonts w:ascii="Heiti TC" w:hAnsi="Heiti TC" w:eastAsia="Heiti TC" w:cs="Heiti TC"/>
                 <w:b w:val="0"/>
                 <w:sz w:val="20"/>
               </w:rPr>
@@ -3560,7 +3722,7 @@
             </w:pPr>
             <w:r>
               <w:rPr>
-                <w:rFonts w:ascii="PingFangTC-Regular" w:hAnsi="PingFangTC-Regular" w:eastAsia="PingFangTC-Regular" w:cs="PingFangTC-Regular"/>
+                <w:rFonts w:ascii="Heiti TC" w:hAnsi="Heiti TC" w:eastAsia="Heiti TC" w:cs="Heiti TC"/>
                 <w:b w:val="0"/>
                 <w:sz w:val="20"/>
               </w:rPr>
@@ -3578,7 +3740,7 @@
             </w:pPr>
             <w:r>
               <w:rPr>
-                <w:rFonts w:ascii="PingFangTC-Regular" w:hAnsi="PingFangTC-Regular" w:eastAsia="PingFangTC-Regular" w:cs="PingFangTC-Regular"/>
+                <w:rFonts w:ascii="Heiti TC" w:hAnsi="Heiti TC" w:eastAsia="Heiti TC" w:cs="Heiti TC"/>
                 <w:b w:val="0"/>
                 <w:sz w:val="20"/>
               </w:rPr>
@@ -3596,7 +3758,7 @@
             </w:pPr>
             <w:r>
               <w:rPr>
-                <w:rFonts w:ascii="PingFangTC-Regular" w:hAnsi="PingFangTC-Regular" w:eastAsia="PingFangTC-Regular" w:cs="PingFangTC-Regular"/>
+                <w:rFonts w:ascii="Heiti TC" w:hAnsi="Heiti TC" w:eastAsia="Heiti TC" w:cs="Heiti TC"/>
                 <w:b w:val="0"/>
                 <w:sz w:val="20"/>
               </w:rPr>
@@ -3614,7 +3776,7 @@
             </w:pPr>
             <w:r>
               <w:rPr>
-                <w:rFonts w:ascii="PingFangTC-Regular" w:hAnsi="PingFangTC-Regular" w:eastAsia="PingFangTC-Regular" w:cs="PingFangTC-Regular"/>
+                <w:rFonts w:ascii="Heiti TC" w:hAnsi="Heiti TC" w:eastAsia="Heiti TC" w:cs="Heiti TC"/>
                 <w:b w:val="0"/>
                 <w:sz w:val="20"/>
               </w:rPr>
@@ -3633,7 +3795,7 @@
             </w:pPr>
             <w:r>
               <w:rPr>
-                <w:rFonts w:ascii="PingFangTC-Regular" w:hAnsi="PingFangTC-Regular" w:eastAsia="PingFangTC-Regular" w:cs="PingFangTC-Regular"/>
+                <w:rFonts w:ascii="Heiti TC" w:hAnsi="Heiti TC" w:eastAsia="Heiti TC" w:cs="Heiti TC"/>
                 <w:b w:val="0"/>
                 <w:sz w:val="20"/>
               </w:rPr>
@@ -3651,7 +3813,7 @@
             </w:pPr>
             <w:r>
               <w:rPr>
-                <w:rFonts w:ascii="PingFangTC-Regular" w:hAnsi="PingFangTC-Regular" w:eastAsia="PingFangTC-Regular" w:cs="PingFangTC-Regular"/>
+                <w:rFonts w:ascii="Heiti TC" w:hAnsi="Heiti TC" w:eastAsia="Heiti TC" w:cs="Heiti TC"/>
                 <w:b w:val="0"/>
                 <w:sz w:val="20"/>
               </w:rPr>
@@ -3669,7 +3831,7 @@
             </w:pPr>
             <w:r>
               <w:rPr>
-                <w:rFonts w:ascii="PingFangTC-Regular" w:hAnsi="PingFangTC-Regular" w:eastAsia="PingFangTC-Regular" w:cs="PingFangTC-Regular"/>
+                <w:rFonts w:ascii="Heiti TC" w:hAnsi="Heiti TC" w:eastAsia="Heiti TC" w:cs="Heiti TC"/>
                 <w:b w:val="0"/>
                 <w:sz w:val="20"/>
               </w:rPr>
@@ -3687,7 +3849,7 @@
             </w:pPr>
             <w:r>
               <w:rPr>
-                <w:rFonts w:ascii="PingFangTC-Regular" w:hAnsi="PingFangTC-Regular" w:eastAsia="PingFangTC-Regular" w:cs="PingFangTC-Regular"/>
+                <w:rFonts w:ascii="Heiti TC" w:hAnsi="Heiti TC" w:eastAsia="Heiti TC" w:cs="Heiti TC"/>
                 <w:b w:val="0"/>
                 <w:sz w:val="20"/>
               </w:rPr>
@@ -3705,7 +3867,7 @@
             </w:pPr>
             <w:r>
               <w:rPr>
-                <w:rFonts w:ascii="PingFangTC-Regular" w:hAnsi="PingFangTC-Regular" w:eastAsia="PingFangTC-Regular" w:cs="PingFangTC-Regular"/>
+                <w:rFonts w:ascii="Heiti TC" w:hAnsi="Heiti TC" w:eastAsia="Heiti TC" w:cs="Heiti TC"/>
                 <w:b w:val="0"/>
                 <w:sz w:val="20"/>
               </w:rPr>
@@ -3723,7 +3885,7 @@
             </w:pPr>
             <w:r>
               <w:rPr>
-                <w:rFonts w:ascii="PingFangTC-Regular" w:hAnsi="PingFangTC-Regular" w:eastAsia="PingFangTC-Regular" w:cs="PingFangTC-Regular"/>
+                <w:rFonts w:ascii="Heiti TC" w:hAnsi="Heiti TC" w:eastAsia="Heiti TC" w:cs="Heiti TC"/>
                 <w:b w:val="0"/>
                 <w:sz w:val="20"/>
               </w:rPr>
@@ -3741,7 +3903,7 @@
             </w:pPr>
             <w:r>
               <w:rPr>
-                <w:rFonts w:ascii="PingFangTC-Regular" w:hAnsi="PingFangTC-Regular" w:eastAsia="PingFangTC-Regular" w:cs="PingFangTC-Regular"/>
+                <w:rFonts w:ascii="Heiti TC" w:hAnsi="Heiti TC" w:eastAsia="Heiti TC" w:cs="Heiti TC"/>
                 <w:b w:val="0"/>
                 <w:sz w:val="20"/>
               </w:rPr>
@@ -3759,7 +3921,7 @@
             </w:pPr>
             <w:r>
               <w:rPr>
-                <w:rFonts w:ascii="PingFangTC-Regular" w:hAnsi="PingFangTC-Regular" w:eastAsia="PingFangTC-Regular" w:cs="PingFangTC-Regular"/>
+                <w:rFonts w:ascii="Heiti TC" w:hAnsi="Heiti TC" w:eastAsia="Heiti TC" w:cs="Heiti TC"/>
                 <w:b w:val="0"/>
                 <w:sz w:val="20"/>
               </w:rPr>
@@ -3777,7 +3939,7 @@
             </w:pPr>
             <w:r>
               <w:rPr>
-                <w:rFonts w:ascii="PingFangTC-Regular" w:hAnsi="PingFangTC-Regular" w:eastAsia="PingFangTC-Regular" w:cs="PingFangTC-Regular"/>
+                <w:rFonts w:ascii="Heiti TC" w:hAnsi="Heiti TC" w:eastAsia="Heiti TC" w:cs="Heiti TC"/>
                 <w:b w:val="0"/>
                 <w:sz w:val="20"/>
               </w:rPr>
@@ -3796,7 +3958,7 @@
             </w:pPr>
             <w:r>
               <w:rPr>
-                <w:rFonts w:ascii="PingFangTC-Regular" w:hAnsi="PingFangTC-Regular" w:eastAsia="PingFangTC-Regular" w:cs="PingFangTC-Regular"/>
+                <w:rFonts w:ascii="Heiti TC" w:hAnsi="Heiti TC" w:eastAsia="Heiti TC" w:cs="Heiti TC"/>
                 <w:b w:val="0"/>
                 <w:sz w:val="20"/>
               </w:rPr>
@@ -3814,7 +3976,7 @@
             </w:pPr>
             <w:r>
               <w:rPr>
-                <w:rFonts w:ascii="PingFangTC-Regular" w:hAnsi="PingFangTC-Regular" w:eastAsia="PingFangTC-Regular" w:cs="PingFangTC-Regular"/>
+                <w:rFonts w:ascii="Heiti TC" w:hAnsi="Heiti TC" w:eastAsia="Heiti TC" w:cs="Heiti TC"/>
                 <w:b w:val="0"/>
                 <w:sz w:val="20"/>
               </w:rPr>
@@ -3832,7 +3994,7 @@
             </w:pPr>
             <w:r>
               <w:rPr>
-                <w:rFonts w:ascii="PingFangTC-Regular" w:hAnsi="PingFangTC-Regular" w:eastAsia="PingFangTC-Regular" w:cs="PingFangTC-Regular"/>
+                <w:rFonts w:ascii="Heiti TC" w:hAnsi="Heiti TC" w:eastAsia="Heiti TC" w:cs="Heiti TC"/>
                 <w:b w:val="0"/>
                 <w:sz w:val="20"/>
               </w:rPr>
@@ -3850,7 +4012,7 @@
             </w:pPr>
             <w:r>
               <w:rPr>
-                <w:rFonts w:ascii="PingFangTC-Regular" w:hAnsi="PingFangTC-Regular" w:eastAsia="PingFangTC-Regular" w:cs="PingFangTC-Regular"/>
+                <w:rFonts w:ascii="Heiti TC" w:hAnsi="Heiti TC" w:eastAsia="Heiti TC" w:cs="Heiti TC"/>
                 <w:b w:val="0"/>
                 <w:sz w:val="20"/>
               </w:rPr>
@@ -3868,7 +4030,7 @@
             </w:pPr>
             <w:r>
               <w:rPr>
-                <w:rFonts w:ascii="PingFangTC-Regular" w:hAnsi="PingFangTC-Regular" w:eastAsia="PingFangTC-Regular" w:cs="PingFangTC-Regular"/>
+                <w:rFonts w:ascii="Heiti TC" w:hAnsi="Heiti TC" w:eastAsia="Heiti TC" w:cs="Heiti TC"/>
                 <w:b w:val="0"/>
                 <w:sz w:val="20"/>
               </w:rPr>
@@ -3886,7 +4048,7 @@
             </w:pPr>
             <w:r>
               <w:rPr>
-                <w:rFonts w:ascii="PingFangTC-Regular" w:hAnsi="PingFangTC-Regular" w:eastAsia="PingFangTC-Regular" w:cs="PingFangTC-Regular"/>
+                <w:rFonts w:ascii="Heiti TC" w:hAnsi="Heiti TC" w:eastAsia="Heiti TC" w:cs="Heiti TC"/>
                 <w:b w:val="0"/>
                 <w:sz w:val="20"/>
               </w:rPr>
@@ -3904,7 +4066,7 @@
             </w:pPr>
             <w:r>
               <w:rPr>
-                <w:rFonts w:ascii="PingFangTC-Regular" w:hAnsi="PingFangTC-Regular" w:eastAsia="PingFangTC-Regular" w:cs="PingFangTC-Regular"/>
+                <w:rFonts w:ascii="Heiti TC" w:hAnsi="Heiti TC" w:eastAsia="Heiti TC" w:cs="Heiti TC"/>
                 <w:b w:val="0"/>
                 <w:sz w:val="20"/>
               </w:rPr>
@@ -3922,7 +4084,7 @@
             </w:pPr>
             <w:r>
               <w:rPr>
-                <w:rFonts w:ascii="PingFangTC-Regular" w:hAnsi="PingFangTC-Regular" w:eastAsia="PingFangTC-Regular" w:cs="PingFangTC-Regular"/>
+                <w:rFonts w:ascii="Heiti TC" w:hAnsi="Heiti TC" w:eastAsia="Heiti TC" w:cs="Heiti TC"/>
                 <w:b w:val="0"/>
                 <w:sz w:val="20"/>
               </w:rPr>
@@ -3940,7 +4102,7 @@
             </w:pPr>
             <w:r>
               <w:rPr>
-                <w:rFonts w:ascii="PingFangTC-Regular" w:hAnsi="PingFangTC-Regular" w:eastAsia="PingFangTC-Regular" w:cs="PingFangTC-Regular"/>
+                <w:rFonts w:ascii="Heiti TC" w:hAnsi="Heiti TC" w:eastAsia="Heiti TC" w:cs="Heiti TC"/>
                 <w:b w:val="0"/>
                 <w:sz w:val="20"/>
               </w:rPr>
@@ -3959,7 +4121,7 @@
             </w:pPr>
             <w:r>
               <w:rPr>
-                <w:rFonts w:ascii="PingFangTC-Regular" w:hAnsi="PingFangTC-Regular" w:eastAsia="PingFangTC-Regular" w:cs="PingFangTC-Regular"/>
+                <w:rFonts w:ascii="Heiti TC" w:hAnsi="Heiti TC" w:eastAsia="Heiti TC" w:cs="Heiti TC"/>
                 <w:b w:val="0"/>
                 <w:sz w:val="20"/>
               </w:rPr>
@@ -3977,7 +4139,7 @@
             </w:pPr>
             <w:r>
               <w:rPr>
-                <w:rFonts w:ascii="PingFangTC-Regular" w:hAnsi="PingFangTC-Regular" w:eastAsia="PingFangTC-Regular" w:cs="PingFangTC-Regular"/>
+                <w:rFonts w:ascii="Heiti TC" w:hAnsi="Heiti TC" w:eastAsia="Heiti TC" w:cs="Heiti TC"/>
                 <w:b w:val="0"/>
                 <w:sz w:val="20"/>
               </w:rPr>
@@ -3995,7 +4157,7 @@
             </w:pPr>
             <w:r>
               <w:rPr>
-                <w:rFonts w:ascii="PingFangTC-Regular" w:hAnsi="PingFangTC-Regular" w:eastAsia="PingFangTC-Regular" w:cs="PingFangTC-Regular"/>
+                <w:rFonts w:ascii="Heiti TC" w:hAnsi="Heiti TC" w:eastAsia="Heiti TC" w:cs="Heiti TC"/>
                 <w:b w:val="0"/>
                 <w:sz w:val="20"/>
               </w:rPr>
@@ -4013,7 +4175,7 @@
             </w:pPr>
             <w:r>
               <w:rPr>
-                <w:rFonts w:ascii="PingFangTC-Regular" w:hAnsi="PingFangTC-Regular" w:eastAsia="PingFangTC-Regular" w:cs="PingFangTC-Regular"/>
+                <w:rFonts w:ascii="Heiti TC" w:hAnsi="Heiti TC" w:eastAsia="Heiti TC" w:cs="Heiti TC"/>
                 <w:b w:val="0"/>
                 <w:sz w:val="20"/>
               </w:rPr>
@@ -4031,7 +4193,7 @@
             </w:pPr>
             <w:r>
               <w:rPr>
-                <w:rFonts w:ascii="PingFangTC-Regular" w:hAnsi="PingFangTC-Regular" w:eastAsia="PingFangTC-Regular" w:cs="PingFangTC-Regular"/>
+                <w:rFonts w:ascii="Heiti TC" w:hAnsi="Heiti TC" w:eastAsia="Heiti TC" w:cs="Heiti TC"/>
                 <w:b w:val="0"/>
                 <w:sz w:val="20"/>
               </w:rPr>
@@ -4049,7 +4211,7 @@
             </w:pPr>
             <w:r>
               <w:rPr>
-                <w:rFonts w:ascii="PingFangTC-Regular" w:hAnsi="PingFangTC-Regular" w:eastAsia="PingFangTC-Regular" w:cs="PingFangTC-Regular"/>
+                <w:rFonts w:ascii="Heiti TC" w:hAnsi="Heiti TC" w:eastAsia="Heiti TC" w:cs="Heiti TC"/>
                 <w:b w:val="0"/>
                 <w:sz w:val="20"/>
               </w:rPr>
@@ -4067,7 +4229,7 @@
             </w:pPr>
             <w:r>
               <w:rPr>
-                <w:rFonts w:ascii="PingFangTC-Regular" w:hAnsi="PingFangTC-Regular" w:eastAsia="PingFangTC-Regular" w:cs="PingFangTC-Regular"/>
+                <w:rFonts w:ascii="Heiti TC" w:hAnsi="Heiti TC" w:eastAsia="Heiti TC" w:cs="Heiti TC"/>
                 <w:b w:val="0"/>
                 <w:sz w:val="20"/>
               </w:rPr>
@@ -4085,7 +4247,7 @@
             </w:pPr>
             <w:r>
               <w:rPr>
-                <w:rFonts w:ascii="PingFangTC-Regular" w:hAnsi="PingFangTC-Regular" w:eastAsia="PingFangTC-Regular" w:cs="PingFangTC-Regular"/>
+                <w:rFonts w:ascii="Heiti TC" w:hAnsi="Heiti TC" w:eastAsia="Heiti TC" w:cs="Heiti TC"/>
                 <w:b w:val="0"/>
                 <w:sz w:val="20"/>
               </w:rPr>
@@ -4103,7 +4265,7 @@
             </w:pPr>
             <w:r>
               <w:rPr>
-                <w:rFonts w:ascii="PingFangTC-Regular" w:hAnsi="PingFangTC-Regular" w:eastAsia="PingFangTC-Regular" w:cs="PingFangTC-Regular"/>
+                <w:rFonts w:ascii="Heiti TC" w:hAnsi="Heiti TC" w:eastAsia="Heiti TC" w:cs="Heiti TC"/>
                 <w:b w:val="0"/>
                 <w:sz w:val="20"/>
               </w:rPr>
@@ -4122,7 +4284,7 @@
             </w:pPr>
             <w:r>
               <w:rPr>
-                <w:rFonts w:ascii="PingFangTC-Regular" w:hAnsi="PingFangTC-Regular" w:eastAsia="PingFangTC-Regular" w:cs="PingFangTC-Regular"/>
+                <w:rFonts w:ascii="Heiti TC" w:hAnsi="Heiti TC" w:eastAsia="Heiti TC" w:cs="Heiti TC"/>
                 <w:b w:val="0"/>
                 <w:sz w:val="20"/>
               </w:rPr>
@@ -4140,7 +4302,7 @@
             </w:pPr>
             <w:r>
               <w:rPr>
-                <w:rFonts w:ascii="PingFangTC-Regular" w:hAnsi="PingFangTC-Regular" w:eastAsia="PingFangTC-Regular" w:cs="PingFangTC-Regular"/>
+                <w:rFonts w:ascii="Heiti TC" w:hAnsi="Heiti TC" w:eastAsia="Heiti TC" w:cs="Heiti TC"/>
                 <w:b w:val="0"/>
                 <w:sz w:val="20"/>
               </w:rPr>
@@ -4158,7 +4320,7 @@
             </w:pPr>
             <w:r>
               <w:rPr>
-                <w:rFonts w:ascii="PingFangTC-Regular" w:hAnsi="PingFangTC-Regular" w:eastAsia="PingFangTC-Regular" w:cs="PingFangTC-Regular"/>
+                <w:rFonts w:ascii="Heiti TC" w:hAnsi="Heiti TC" w:eastAsia="Heiti TC" w:cs="Heiti TC"/>
                 <w:b w:val="0"/>
                 <w:sz w:val="20"/>
               </w:rPr>
@@ -4176,7 +4338,7 @@
             </w:pPr>
             <w:r>
               <w:rPr>
-                <w:rFonts w:ascii="PingFangTC-Regular" w:hAnsi="PingFangTC-Regular" w:eastAsia="PingFangTC-Regular" w:cs="PingFangTC-Regular"/>
+                <w:rFonts w:ascii="Heiti TC" w:hAnsi="Heiti TC" w:eastAsia="Heiti TC" w:cs="Heiti TC"/>
                 <w:b w:val="0"/>
                 <w:sz w:val="20"/>
               </w:rPr>
@@ -4194,7 +4356,7 @@
             </w:pPr>
             <w:r>
               <w:rPr>
-                <w:rFonts w:ascii="PingFangTC-Regular" w:hAnsi="PingFangTC-Regular" w:eastAsia="PingFangTC-Regular" w:cs="PingFangTC-Regular"/>
+                <w:rFonts w:ascii="Heiti TC" w:hAnsi="Heiti TC" w:eastAsia="Heiti TC" w:cs="Heiti TC"/>
                 <w:b w:val="0"/>
                 <w:sz w:val="20"/>
               </w:rPr>
@@ -4212,7 +4374,7 @@
             </w:pPr>
             <w:r>
               <w:rPr>
-                <w:rFonts w:ascii="PingFangTC-Regular" w:hAnsi="PingFangTC-Regular" w:eastAsia="PingFangTC-Regular" w:cs="PingFangTC-Regular"/>
+                <w:rFonts w:ascii="Heiti TC" w:hAnsi="Heiti TC" w:eastAsia="Heiti TC" w:cs="Heiti TC"/>
                 <w:b w:val="0"/>
                 <w:sz w:val="20"/>
               </w:rPr>
@@ -4230,7 +4392,7 @@
             </w:pPr>
             <w:r>
               <w:rPr>
-                <w:rFonts w:ascii="PingFangTC-Regular" w:hAnsi="PingFangTC-Regular" w:eastAsia="PingFangTC-Regular" w:cs="PingFangTC-Regular"/>
+                <w:rFonts w:ascii="Heiti TC" w:hAnsi="Heiti TC" w:eastAsia="Heiti TC" w:cs="Heiti TC"/>
                 <w:b w:val="0"/>
                 <w:sz w:val="20"/>
               </w:rPr>
@@ -4248,7 +4410,7 @@
             </w:pPr>
             <w:r>
               <w:rPr>
-                <w:rFonts w:ascii="PingFangTC-Regular" w:hAnsi="PingFangTC-Regular" w:eastAsia="PingFangTC-Regular" w:cs="PingFangTC-Regular"/>
+                <w:rFonts w:ascii="Heiti TC" w:hAnsi="Heiti TC" w:eastAsia="Heiti TC" w:cs="Heiti TC"/>
                 <w:b w:val="0"/>
                 <w:sz w:val="20"/>
               </w:rPr>
@@ -4266,7 +4428,7 @@
             </w:pPr>
             <w:r>
               <w:rPr>
-                <w:rFonts w:ascii="PingFangTC-Regular" w:hAnsi="PingFangTC-Regular" w:eastAsia="PingFangTC-Regular" w:cs="PingFangTC-Regular"/>
+                <w:rFonts w:ascii="Heiti TC" w:hAnsi="Heiti TC" w:eastAsia="Heiti TC" w:cs="Heiti TC"/>
                 <w:b w:val="0"/>
                 <w:sz w:val="20"/>
               </w:rPr>
@@ -4285,7 +4447,7 @@
             </w:pPr>
             <w:r>
               <w:rPr>
-                <w:rFonts w:ascii="PingFangTC-Regular" w:hAnsi="PingFangTC-Regular" w:eastAsia="PingFangTC-Regular" w:cs="PingFangTC-Regular"/>
+                <w:rFonts w:ascii="Heiti TC" w:hAnsi="Heiti TC" w:eastAsia="Heiti TC" w:cs="Heiti TC"/>
                 <w:b w:val="0"/>
                 <w:sz w:val="20"/>
               </w:rPr>
@@ -4303,7 +4465,7 @@
             </w:pPr>
             <w:r>
               <w:rPr>
-                <w:rFonts w:ascii="PingFangTC-Regular" w:hAnsi="PingFangTC-Regular" w:eastAsia="PingFangTC-Regular" w:cs="PingFangTC-Regular"/>
+                <w:rFonts w:ascii="Heiti TC" w:hAnsi="Heiti TC" w:eastAsia="Heiti TC" w:cs="Heiti TC"/>
                 <w:b w:val="0"/>
                 <w:sz w:val="20"/>
               </w:rPr>
@@ -4321,7 +4483,7 @@
             </w:pPr>
             <w:r>
               <w:rPr>
-                <w:rFonts w:ascii="PingFangTC-Regular" w:hAnsi="PingFangTC-Regular" w:eastAsia="PingFangTC-Regular" w:cs="PingFangTC-Regular"/>
+                <w:rFonts w:ascii="Heiti TC" w:hAnsi="Heiti TC" w:eastAsia="Heiti TC" w:cs="Heiti TC"/>
                 <w:b w:val="0"/>
                 <w:sz w:val="20"/>
               </w:rPr>
@@ -4339,7 +4501,7 @@
             </w:pPr>
             <w:r>
               <w:rPr>
-                <w:rFonts w:ascii="PingFangTC-Regular" w:hAnsi="PingFangTC-Regular" w:eastAsia="PingFangTC-Regular" w:cs="PingFangTC-Regular"/>
+                <w:rFonts w:ascii="Heiti TC" w:hAnsi="Heiti TC" w:eastAsia="Heiti TC" w:cs="Heiti TC"/>
                 <w:b w:val="0"/>
                 <w:sz w:val="20"/>
               </w:rPr>
@@ -4357,7 +4519,7 @@
             </w:pPr>
             <w:r>
               <w:rPr>
-                <w:rFonts w:ascii="PingFangTC-Regular" w:hAnsi="PingFangTC-Regular" w:eastAsia="PingFangTC-Regular" w:cs="PingFangTC-Regular"/>
+                <w:rFonts w:ascii="Heiti TC" w:hAnsi="Heiti TC" w:eastAsia="Heiti TC" w:cs="Heiti TC"/>
                 <w:b w:val="0"/>
                 <w:sz w:val="20"/>
               </w:rPr>
@@ -4375,7 +4537,7 @@
             </w:pPr>
             <w:r>
               <w:rPr>
-                <w:rFonts w:ascii="PingFangTC-Regular" w:hAnsi="PingFangTC-Regular" w:eastAsia="PingFangTC-Regular" w:cs="PingFangTC-Regular"/>
+                <w:rFonts w:ascii="Heiti TC" w:hAnsi="Heiti TC" w:eastAsia="Heiti TC" w:cs="Heiti TC"/>
                 <w:b w:val="0"/>
                 <w:sz w:val="20"/>
               </w:rPr>
@@ -4393,7 +4555,7 @@
             </w:pPr>
             <w:r>
               <w:rPr>
-                <w:rFonts w:ascii="PingFangTC-Regular" w:hAnsi="PingFangTC-Regular" w:eastAsia="PingFangTC-Regular" w:cs="PingFangTC-Regular"/>
+                <w:rFonts w:ascii="Heiti TC" w:hAnsi="Heiti TC" w:eastAsia="Heiti TC" w:cs="Heiti TC"/>
                 <w:b w:val="0"/>
                 <w:sz w:val="20"/>
               </w:rPr>
@@ -4411,7 +4573,7 @@
             </w:pPr>
             <w:r>
               <w:rPr>
-                <w:rFonts w:ascii="PingFangTC-Regular" w:hAnsi="PingFangTC-Regular" w:eastAsia="PingFangTC-Regular" w:cs="PingFangTC-Regular"/>
+                <w:rFonts w:ascii="Heiti TC" w:hAnsi="Heiti TC" w:eastAsia="Heiti TC" w:cs="Heiti TC"/>
                 <w:b w:val="0"/>
                 <w:sz w:val="20"/>
               </w:rPr>
@@ -4429,7 +4591,7 @@
             </w:pPr>
             <w:r>
               <w:rPr>
-                <w:rFonts w:ascii="PingFangTC-Regular" w:hAnsi="PingFangTC-Regular" w:eastAsia="PingFangTC-Regular" w:cs="PingFangTC-Regular"/>
+                <w:rFonts w:ascii="Heiti TC" w:hAnsi="Heiti TC" w:eastAsia="Heiti TC" w:cs="Heiti TC"/>
                 <w:b w:val="0"/>
                 <w:sz w:val="20"/>
               </w:rPr>
@@ -4448,7 +4610,7 @@
             </w:pPr>
             <w:r>
               <w:rPr>
-                <w:rFonts w:ascii="PingFangTC-Regular" w:hAnsi="PingFangTC-Regular" w:eastAsia="PingFangTC-Regular" w:cs="PingFangTC-Regular"/>
+                <w:rFonts w:ascii="Heiti TC" w:hAnsi="Heiti TC" w:eastAsia="Heiti TC" w:cs="Heiti TC"/>
                 <w:b w:val="0"/>
                 <w:sz w:val="20"/>
               </w:rPr>
@@ -4466,7 +4628,7 @@
             </w:pPr>
             <w:r>
               <w:rPr>
-                <w:rFonts w:ascii="PingFangTC-Regular" w:hAnsi="PingFangTC-Regular" w:eastAsia="PingFangTC-Regular" w:cs="PingFangTC-Regular"/>
+                <w:rFonts w:ascii="Heiti TC" w:hAnsi="Heiti TC" w:eastAsia="Heiti TC" w:cs="Heiti TC"/>
                 <w:b w:val="0"/>
                 <w:sz w:val="20"/>
               </w:rPr>
@@ -4484,7 +4646,7 @@
             </w:pPr>
             <w:r>
               <w:rPr>
-                <w:rFonts w:ascii="PingFangTC-Regular" w:hAnsi="PingFangTC-Regular" w:eastAsia="PingFangTC-Regular" w:cs="PingFangTC-Regular"/>
+                <w:rFonts w:ascii="Heiti TC" w:hAnsi="Heiti TC" w:eastAsia="Heiti TC" w:cs="Heiti TC"/>
                 <w:b w:val="0"/>
                 <w:sz w:val="20"/>
               </w:rPr>
@@ -4502,7 +4664,7 @@
             </w:pPr>
             <w:r>
               <w:rPr>
-                <w:rFonts w:ascii="PingFangTC-Regular" w:hAnsi="PingFangTC-Regular" w:eastAsia="PingFangTC-Regular" w:cs="PingFangTC-Regular"/>
+                <w:rFonts w:ascii="Heiti TC" w:hAnsi="Heiti TC" w:eastAsia="Heiti TC" w:cs="Heiti TC"/>
                 <w:b w:val="0"/>
                 <w:sz w:val="20"/>
               </w:rPr>
@@ -4520,7 +4682,7 @@
             </w:pPr>
             <w:r>
               <w:rPr>
-                <w:rFonts w:ascii="PingFangTC-Regular" w:hAnsi="PingFangTC-Regular" w:eastAsia="PingFangTC-Regular" w:cs="PingFangTC-Regular"/>
+                <w:rFonts w:ascii="Heiti TC" w:hAnsi="Heiti TC" w:eastAsia="Heiti TC" w:cs="Heiti TC"/>
                 <w:b w:val="0"/>
                 <w:sz w:val="20"/>
               </w:rPr>
@@ -4538,7 +4700,7 @@
             </w:pPr>
             <w:r>
               <w:rPr>
-                <w:rFonts w:ascii="PingFangTC-Regular" w:hAnsi="PingFangTC-Regular" w:eastAsia="PingFangTC-Regular" w:cs="PingFangTC-Regular"/>
+                <w:rFonts w:ascii="Heiti TC" w:hAnsi="Heiti TC" w:eastAsia="Heiti TC" w:cs="Heiti TC"/>
                 <w:b w:val="0"/>
                 <w:sz w:val="20"/>
               </w:rPr>
@@ -4556,7 +4718,7 @@
             </w:pPr>
             <w:r>
               <w:rPr>
-                <w:rFonts w:ascii="PingFangTC-Regular" w:hAnsi="PingFangTC-Regular" w:eastAsia="PingFangTC-Regular" w:cs="PingFangTC-Regular"/>
+                <w:rFonts w:ascii="Heiti TC" w:hAnsi="Heiti TC" w:eastAsia="Heiti TC" w:cs="Heiti TC"/>
                 <w:b w:val="0"/>
                 <w:sz w:val="20"/>
               </w:rPr>
@@ -4574,7 +4736,7 @@
             </w:pPr>
             <w:r>
               <w:rPr>
-                <w:rFonts w:ascii="PingFangTC-Regular" w:hAnsi="PingFangTC-Regular" w:eastAsia="PingFangTC-Regular" w:cs="PingFangTC-Regular"/>
+                <w:rFonts w:ascii="Heiti TC" w:hAnsi="Heiti TC" w:eastAsia="Heiti TC" w:cs="Heiti TC"/>
                 <w:b w:val="0"/>
                 <w:sz w:val="20"/>
               </w:rPr>
@@ -4591,7 +4753,7 @@
             </w:pPr>
             <w:r>
               <w:rPr>
-                <w:rFonts w:ascii="PingFangTC-Regular" w:hAnsi="PingFangTC-Regular" w:eastAsia="PingFangTC-Regular" w:cs="PingFangTC-Regular"/>
+                <w:rFonts w:ascii="Heiti TC" w:hAnsi="Heiti TC" w:eastAsia="Heiti TC" w:cs="Heiti TC"/>
                 <w:b w:val="0"/>
                 <w:sz w:val="20"/>
               </w:rPr>
@@ -4610,7 +4772,7 @@
             </w:pPr>
             <w:r>
               <w:rPr>
-                <w:rFonts w:ascii="PingFangTC-Regular" w:hAnsi="PingFangTC-Regular" w:eastAsia="PingFangTC-Regular" w:cs="PingFangTC-Regular"/>
+                <w:rFonts w:ascii="Heiti TC" w:hAnsi="Heiti TC" w:eastAsia="Heiti TC" w:cs="Heiti TC"/>
                 <w:b w:val="0"/>
                 <w:sz w:val="20"/>
               </w:rPr>
@@ -4628,7 +4790,7 @@
             </w:pPr>
             <w:r>
               <w:rPr>
-                <w:rFonts w:ascii="PingFangTC-Regular" w:hAnsi="PingFangTC-Regular" w:eastAsia="PingFangTC-Regular" w:cs="PingFangTC-Regular"/>
+                <w:rFonts w:ascii="Heiti TC" w:hAnsi="Heiti TC" w:eastAsia="Heiti TC" w:cs="Heiti TC"/>
                 <w:b w:val="0"/>
                 <w:sz w:val="20"/>
               </w:rPr>
@@ -4646,7 +4808,7 @@
             </w:pPr>
             <w:r>
               <w:rPr>
-                <w:rFonts w:ascii="PingFangTC-Regular" w:hAnsi="PingFangTC-Regular" w:eastAsia="PingFangTC-Regular" w:cs="PingFangTC-Regular"/>
+                <w:rFonts w:ascii="Heiti TC" w:hAnsi="Heiti TC" w:eastAsia="Heiti TC" w:cs="Heiti TC"/>
                 <w:b w:val="0"/>
                 <w:sz w:val="20"/>
               </w:rPr>
@@ -4664,7 +4826,7 @@
             </w:pPr>
             <w:r>
               <w:rPr>
-                <w:rFonts w:ascii="PingFangTC-Regular" w:hAnsi="PingFangTC-Regular" w:eastAsia="PingFangTC-Regular" w:cs="PingFangTC-Regular"/>
+                <w:rFonts w:ascii="Heiti TC" w:hAnsi="Heiti TC" w:eastAsia="Heiti TC" w:cs="Heiti TC"/>
                 <w:b w:val="0"/>
                 <w:sz w:val="20"/>
               </w:rPr>
@@ -4682,7 +4844,7 @@
             </w:pPr>
             <w:r>
               <w:rPr>
-                <w:rFonts w:ascii="PingFangTC-Regular" w:hAnsi="PingFangTC-Regular" w:eastAsia="PingFangTC-Regular" w:cs="PingFangTC-Regular"/>
+                <w:rFonts w:ascii="Heiti TC" w:hAnsi="Heiti TC" w:eastAsia="Heiti TC" w:cs="Heiti TC"/>
                 <w:b w:val="0"/>
                 <w:sz w:val="20"/>
               </w:rPr>
@@ -4700,7 +4862,7 @@
             </w:pPr>
             <w:r>
               <w:rPr>
-                <w:rFonts w:ascii="PingFangTC-Regular" w:hAnsi="PingFangTC-Regular" w:eastAsia="PingFangTC-Regular" w:cs="PingFangTC-Regular"/>
+                <w:rFonts w:ascii="Heiti TC" w:hAnsi="Heiti TC" w:eastAsia="Heiti TC" w:cs="Heiti TC"/>
                 <w:b w:val="0"/>
                 <w:sz w:val="20"/>
               </w:rPr>
@@ -4718,7 +4880,7 @@
             </w:pPr>
             <w:r>
               <w:rPr>
-                <w:rFonts w:ascii="PingFangTC-Regular" w:hAnsi="PingFangTC-Regular" w:eastAsia="PingFangTC-Regular" w:cs="PingFangTC-Regular"/>
+                <w:rFonts w:ascii="Heiti TC" w:hAnsi="Heiti TC" w:eastAsia="Heiti TC" w:cs="Heiti TC"/>
                 <w:b w:val="0"/>
                 <w:sz w:val="20"/>
               </w:rPr>
@@ -4736,7 +4898,7 @@
             </w:pPr>
             <w:r>
               <w:rPr>
-                <w:rFonts w:ascii="PingFangTC-Regular" w:hAnsi="PingFangTC-Regular" w:eastAsia="PingFangTC-Regular" w:cs="PingFangTC-Regular"/>
+                <w:rFonts w:ascii="Heiti TC" w:hAnsi="Heiti TC" w:eastAsia="Heiti TC" w:cs="Heiti TC"/>
                 <w:b w:val="0"/>
                 <w:sz w:val="20"/>
               </w:rPr>
@@ -4753,7 +4915,7 @@
             </w:pPr>
             <w:r>
               <w:rPr>
-                <w:rFonts w:ascii="PingFangTC-Regular" w:hAnsi="PingFangTC-Regular" w:eastAsia="PingFangTC-Regular" w:cs="PingFangTC-Regular"/>
+                <w:rFonts w:ascii="Heiti TC" w:hAnsi="Heiti TC" w:eastAsia="Heiti TC" w:cs="Heiti TC"/>
                 <w:b w:val="0"/>
                 <w:sz w:val="20"/>
               </w:rPr>
@@ -4772,7 +4934,7 @@
             </w:pPr>
             <w:r>
               <w:rPr>
-                <w:rFonts w:ascii="PingFangTC-Regular" w:hAnsi="PingFangTC-Regular" w:eastAsia="PingFangTC-Regular" w:cs="PingFangTC-Regular"/>
+                <w:rFonts w:ascii="Heiti TC" w:hAnsi="Heiti TC" w:eastAsia="Heiti TC" w:cs="Heiti TC"/>
                 <w:b w:val="0"/>
                 <w:sz w:val="20"/>
               </w:rPr>
@@ -4790,7 +4952,7 @@
             </w:pPr>
             <w:r>
               <w:rPr>
-                <w:rFonts w:ascii="PingFangTC-Regular" w:hAnsi="PingFangTC-Regular" w:eastAsia="PingFangTC-Regular" w:cs="PingFangTC-Regular"/>
+                <w:rFonts w:ascii="Heiti TC" w:hAnsi="Heiti TC" w:eastAsia="Heiti TC" w:cs="Heiti TC"/>
                 <w:b w:val="0"/>
                 <w:sz w:val="20"/>
               </w:rPr>
@@ -4808,7 +4970,7 @@
             </w:pPr>
             <w:r>
               <w:rPr>
-                <w:rFonts w:ascii="PingFangTC-Regular" w:hAnsi="PingFangTC-Regular" w:eastAsia="PingFangTC-Regular" w:cs="PingFangTC-Regular"/>
+                <w:rFonts w:ascii="Heiti TC" w:hAnsi="Heiti TC" w:eastAsia="Heiti TC" w:cs="Heiti TC"/>
                 <w:b w:val="0"/>
                 <w:sz w:val="20"/>
               </w:rPr>
@@ -4826,7 +4988,7 @@
             </w:pPr>
             <w:r>
               <w:rPr>
-                <w:rFonts w:ascii="PingFangTC-Regular" w:hAnsi="PingFangTC-Regular" w:eastAsia="PingFangTC-Regular" w:cs="PingFangTC-Regular"/>
+                <w:rFonts w:ascii="Heiti TC" w:hAnsi="Heiti TC" w:eastAsia="Heiti TC" w:cs="Heiti TC"/>
                 <w:b w:val="0"/>
                 <w:sz w:val="20"/>
               </w:rPr>
@@ -4844,7 +5006,7 @@
             </w:pPr>
             <w:r>
               <w:rPr>
-                <w:rFonts w:ascii="PingFangTC-Regular" w:hAnsi="PingFangTC-Regular" w:eastAsia="PingFangTC-Regular" w:cs="PingFangTC-Regular"/>
+                <w:rFonts w:ascii="Heiti TC" w:hAnsi="Heiti TC" w:eastAsia="Heiti TC" w:cs="Heiti TC"/>
                 <w:b w:val="0"/>
                 <w:sz w:val="20"/>
               </w:rPr>
@@ -4862,7 +5024,7 @@
             </w:pPr>
             <w:r>
               <w:rPr>
-                <w:rFonts w:ascii="PingFangTC-Regular" w:hAnsi="PingFangTC-Regular" w:eastAsia="PingFangTC-Regular" w:cs="PingFangTC-Regular"/>
+                <w:rFonts w:ascii="Heiti TC" w:hAnsi="Heiti TC" w:eastAsia="Heiti TC" w:cs="Heiti TC"/>
                 <w:b w:val="0"/>
                 <w:sz w:val="20"/>
               </w:rPr>
@@ -4880,7 +5042,7 @@
             </w:pPr>
             <w:r>
               <w:rPr>
-                <w:rFonts w:ascii="PingFangTC-Regular" w:hAnsi="PingFangTC-Regular" w:eastAsia="PingFangTC-Regular" w:cs="PingFangTC-Regular"/>
+                <w:rFonts w:ascii="Heiti TC" w:hAnsi="Heiti TC" w:eastAsia="Heiti TC" w:cs="Heiti TC"/>
                 <w:b w:val="0"/>
                 <w:sz w:val="20"/>
               </w:rPr>
@@ -4898,7 +5060,7 @@
             </w:pPr>
             <w:r>
               <w:rPr>
-                <w:rFonts w:ascii="PingFangTC-Regular" w:hAnsi="PingFangTC-Regular" w:eastAsia="PingFangTC-Regular" w:cs="PingFangTC-Regular"/>
+                <w:rFonts w:ascii="Heiti TC" w:hAnsi="Heiti TC" w:eastAsia="Heiti TC" w:cs="Heiti TC"/>
                 <w:b w:val="0"/>
                 <w:sz w:val="20"/>
               </w:rPr>
@@ -4915,7 +5077,7 @@
             </w:pPr>
             <w:r>
               <w:rPr>
-                <w:rFonts w:ascii="PingFangTC-Regular" w:hAnsi="PingFangTC-Regular" w:eastAsia="PingFangTC-Regular" w:cs="PingFangTC-Regular"/>
+                <w:rFonts w:ascii="Heiti TC" w:hAnsi="Heiti TC" w:eastAsia="Heiti TC" w:cs="Heiti TC"/>
                 <w:b w:val="0"/>
                 <w:sz w:val="20"/>
               </w:rPr>
@@ -4934,7 +5096,7 @@
             </w:pPr>
             <w:r>
               <w:rPr>
-                <w:rFonts w:ascii="PingFangTC-Regular" w:hAnsi="PingFangTC-Regular" w:eastAsia="PingFangTC-Regular" w:cs="PingFangTC-Regular"/>
+                <w:rFonts w:ascii="Heiti TC" w:hAnsi="Heiti TC" w:eastAsia="Heiti TC" w:cs="Heiti TC"/>
                 <w:b w:val="0"/>
                 <w:sz w:val="20"/>
               </w:rPr>
@@ -4952,7 +5114,7 @@
             </w:pPr>
             <w:r>
               <w:rPr>
-                <w:rFonts w:ascii="PingFangTC-Regular" w:hAnsi="PingFangTC-Regular" w:eastAsia="PingFangTC-Regular" w:cs="PingFangTC-Regular"/>
+                <w:rFonts w:ascii="Heiti TC" w:hAnsi="Heiti TC" w:eastAsia="Heiti TC" w:cs="Heiti TC"/>
                 <w:b w:val="0"/>
                 <w:sz w:val="20"/>
               </w:rPr>
@@ -4970,7 +5132,7 @@
             </w:pPr>
             <w:r>
               <w:rPr>
-                <w:rFonts w:ascii="PingFangTC-Regular" w:hAnsi="PingFangTC-Regular" w:eastAsia="PingFangTC-Regular" w:cs="PingFangTC-Regular"/>
+                <w:rFonts w:ascii="Heiti TC" w:hAnsi="Heiti TC" w:eastAsia="Heiti TC" w:cs="Heiti TC"/>
                 <w:b w:val="0"/>
                 <w:sz w:val="20"/>
               </w:rPr>
@@ -4988,7 +5150,7 @@
             </w:pPr>
             <w:r>
               <w:rPr>
-                <w:rFonts w:ascii="PingFangTC-Regular" w:hAnsi="PingFangTC-Regular" w:eastAsia="PingFangTC-Regular" w:cs="PingFangTC-Regular"/>
+                <w:rFonts w:ascii="Heiti TC" w:hAnsi="Heiti TC" w:eastAsia="Heiti TC" w:cs="Heiti TC"/>
                 <w:b w:val="0"/>
                 <w:sz w:val="20"/>
               </w:rPr>
@@ -5006,7 +5168,7 @@
             </w:pPr>
             <w:r>
               <w:rPr>
-                <w:rFonts w:ascii="PingFangTC-Regular" w:hAnsi="PingFangTC-Regular" w:eastAsia="PingFangTC-Regular" w:cs="PingFangTC-Regular"/>
+                <w:rFonts w:ascii="Heiti TC" w:hAnsi="Heiti TC" w:eastAsia="Heiti TC" w:cs="Heiti TC"/>
                 <w:b w:val="0"/>
                 <w:sz w:val="20"/>
               </w:rPr>
@@ -5024,7 +5186,7 @@
             </w:pPr>
             <w:r>
               <w:rPr>
-                <w:rFonts w:ascii="PingFangTC-Regular" w:hAnsi="PingFangTC-Regular" w:eastAsia="PingFangTC-Regular" w:cs="PingFangTC-Regular"/>
+                <w:rFonts w:ascii="Heiti TC" w:hAnsi="Heiti TC" w:eastAsia="Heiti TC" w:cs="Heiti TC"/>
                 <w:b w:val="0"/>
                 <w:sz w:val="20"/>
               </w:rPr>
@@ -5042,7 +5204,7 @@
             </w:pPr>
             <w:r>
               <w:rPr>
-                <w:rFonts w:ascii="PingFangTC-Regular" w:hAnsi="PingFangTC-Regular" w:eastAsia="PingFangTC-Regular" w:cs="PingFangTC-Regular"/>
+                <w:rFonts w:ascii="Heiti TC" w:hAnsi="Heiti TC" w:eastAsia="Heiti TC" w:cs="Heiti TC"/>
                 <w:b w:val="0"/>
                 <w:sz w:val="20"/>
               </w:rPr>
@@ -5060,7 +5222,7 @@
             </w:pPr>
             <w:r>
               <w:rPr>
-                <w:rFonts w:ascii="PingFangTC-Regular" w:hAnsi="PingFangTC-Regular" w:eastAsia="PingFangTC-Regular" w:cs="PingFangTC-Regular"/>
+                <w:rFonts w:ascii="Heiti TC" w:hAnsi="Heiti TC" w:eastAsia="Heiti TC" w:cs="Heiti TC"/>
                 <w:b w:val="0"/>
                 <w:sz w:val="20"/>
               </w:rPr>
@@ -5078,7 +5240,7 @@
             </w:pPr>
             <w:r>
               <w:rPr>
-                <w:rFonts w:ascii="PingFangTC-Regular" w:hAnsi="PingFangTC-Regular" w:eastAsia="PingFangTC-Regular" w:cs="PingFangTC-Regular"/>
+                <w:rFonts w:ascii="Heiti TC" w:hAnsi="Heiti TC" w:eastAsia="Heiti TC" w:cs="Heiti TC"/>
                 <w:b w:val="0"/>
                 <w:sz w:val="20"/>
               </w:rPr>
@@ -5097,7 +5259,7 @@
             </w:pPr>
             <w:r>
               <w:rPr>
-                <w:rFonts w:ascii="PingFangTC-Regular" w:hAnsi="PingFangTC-Regular" w:eastAsia="PingFangTC-Regular" w:cs="PingFangTC-Regular"/>
+                <w:rFonts w:ascii="Heiti TC" w:hAnsi="Heiti TC" w:eastAsia="Heiti TC" w:cs="Heiti TC"/>
                 <w:b w:val="0"/>
                 <w:sz w:val="20"/>
               </w:rPr>
@@ -5115,7 +5277,7 @@
             </w:pPr>
             <w:r>
               <w:rPr>
-                <w:rFonts w:ascii="PingFangTC-Regular" w:hAnsi="PingFangTC-Regular" w:eastAsia="PingFangTC-Regular" w:cs="PingFangTC-Regular"/>
+                <w:rFonts w:ascii="Heiti TC" w:hAnsi="Heiti TC" w:eastAsia="Heiti TC" w:cs="Heiti TC"/>
                 <w:b w:val="0"/>
                 <w:sz w:val="20"/>
               </w:rPr>
@@ -5133,7 +5295,7 @@
             </w:pPr>
             <w:r>
               <w:rPr>
-                <w:rFonts w:ascii="PingFangTC-Regular" w:hAnsi="PingFangTC-Regular" w:eastAsia="PingFangTC-Regular" w:cs="PingFangTC-Regular"/>
+                <w:rFonts w:ascii="Heiti TC" w:hAnsi="Heiti TC" w:eastAsia="Heiti TC" w:cs="Heiti TC"/>
                 <w:b w:val="0"/>
                 <w:sz w:val="20"/>
               </w:rPr>
@@ -5151,7 +5313,7 @@
             </w:pPr>
             <w:r>
               <w:rPr>
-                <w:rFonts w:ascii="PingFangTC-Regular" w:hAnsi="PingFangTC-Regular" w:eastAsia="PingFangTC-Regular" w:cs="PingFangTC-Regular"/>
+                <w:rFonts w:ascii="Heiti TC" w:hAnsi="Heiti TC" w:eastAsia="Heiti TC" w:cs="Heiti TC"/>
                 <w:b w:val="0"/>
                 <w:sz w:val="20"/>
               </w:rPr>
@@ -5169,7 +5331,7 @@
             </w:pPr>
             <w:r>
               <w:rPr>
-                <w:rFonts w:ascii="PingFangTC-Regular" w:hAnsi="PingFangTC-Regular" w:eastAsia="PingFangTC-Regular" w:cs="PingFangTC-Regular"/>
+                <w:rFonts w:ascii="Heiti TC" w:hAnsi="Heiti TC" w:eastAsia="Heiti TC" w:cs="Heiti TC"/>
                 <w:b w:val="0"/>
                 <w:sz w:val="20"/>
               </w:rPr>
@@ -5187,7 +5349,7 @@
             </w:pPr>
             <w:r>
               <w:rPr>
-                <w:rFonts w:ascii="PingFangTC-Regular" w:hAnsi="PingFangTC-Regular" w:eastAsia="PingFangTC-Regular" w:cs="PingFangTC-Regular"/>
+                <w:rFonts w:ascii="Heiti TC" w:hAnsi="Heiti TC" w:eastAsia="Heiti TC" w:cs="Heiti TC"/>
                 <w:b w:val="0"/>
                 <w:sz w:val="20"/>
               </w:rPr>
@@ -5205,7 +5367,7 @@
             </w:pPr>
             <w:r>
               <w:rPr>
-                <w:rFonts w:ascii="PingFangTC-Regular" w:hAnsi="PingFangTC-Regular" w:eastAsia="PingFangTC-Regular" w:cs="PingFangTC-Regular"/>
+                <w:rFonts w:ascii="Heiti TC" w:hAnsi="Heiti TC" w:eastAsia="Heiti TC" w:cs="Heiti TC"/>
                 <w:b w:val="0"/>
                 <w:sz w:val="20"/>
               </w:rPr>
@@ -5223,7 +5385,7 @@
             </w:pPr>
             <w:r>
               <w:rPr>
-                <w:rFonts w:ascii="PingFangTC-Regular" w:hAnsi="PingFangTC-Regular" w:eastAsia="PingFangTC-Regular" w:cs="PingFangTC-Regular"/>
+                <w:rFonts w:ascii="Heiti TC" w:hAnsi="Heiti TC" w:eastAsia="Heiti TC" w:cs="Heiti TC"/>
                 <w:b w:val="0"/>
                 <w:sz w:val="20"/>
               </w:rPr>
@@ -5241,7 +5403,7 @@
             </w:pPr>
             <w:r>
               <w:rPr>
-                <w:rFonts w:ascii="PingFangTC-Regular" w:hAnsi="PingFangTC-Regular" w:eastAsia="PingFangTC-Regular" w:cs="PingFangTC-Regular"/>
+                <w:rFonts w:ascii="Heiti TC" w:hAnsi="Heiti TC" w:eastAsia="Heiti TC" w:cs="Heiti TC"/>
                 <w:b w:val="0"/>
                 <w:sz w:val="20"/>
               </w:rPr>
@@ -5260,7 +5422,7 @@
             </w:pPr>
             <w:r>
               <w:rPr>
-                <w:rFonts w:ascii="PingFangTC-Regular" w:hAnsi="PingFangTC-Regular" w:eastAsia="PingFangTC-Regular" w:cs="PingFangTC-Regular"/>
+                <w:rFonts w:ascii="Heiti TC" w:hAnsi="Heiti TC" w:eastAsia="Heiti TC" w:cs="Heiti TC"/>
                 <w:b w:val="0"/>
                 <w:sz w:val="20"/>
               </w:rPr>
@@ -5278,7 +5440,7 @@
             </w:pPr>
             <w:r>
               <w:rPr>
-                <w:rFonts w:ascii="PingFangTC-Regular" w:hAnsi="PingFangTC-Regular" w:eastAsia="PingFangTC-Regular" w:cs="PingFangTC-Regular"/>
+                <w:rFonts w:ascii="Heiti TC" w:hAnsi="Heiti TC" w:eastAsia="Heiti TC" w:cs="Heiti TC"/>
                 <w:b w:val="0"/>
                 <w:sz w:val="20"/>
               </w:rPr>
@@ -5296,7 +5458,7 @@
             </w:pPr>
             <w:r>
               <w:rPr>
-                <w:rFonts w:ascii="PingFangTC-Regular" w:hAnsi="PingFangTC-Regular" w:eastAsia="PingFangTC-Regular" w:cs="PingFangTC-Regular"/>
+                <w:rFonts w:ascii="Heiti TC" w:hAnsi="Heiti TC" w:eastAsia="Heiti TC" w:cs="Heiti TC"/>
                 <w:b w:val="0"/>
                 <w:sz w:val="20"/>
               </w:rPr>
@@ -5314,7 +5476,7 @@
             </w:pPr>
             <w:r>
               <w:rPr>
-                <w:rFonts w:ascii="PingFangTC-Regular" w:hAnsi="PingFangTC-Regular" w:eastAsia="PingFangTC-Regular" w:cs="PingFangTC-Regular"/>
+                <w:rFonts w:ascii="Heiti TC" w:hAnsi="Heiti TC" w:eastAsia="Heiti TC" w:cs="Heiti TC"/>
                 <w:b w:val="0"/>
                 <w:sz w:val="20"/>
               </w:rPr>
@@ -5332,7 +5494,7 @@
             </w:pPr>
             <w:r>
               <w:rPr>
-                <w:rFonts w:ascii="PingFangTC-Regular" w:hAnsi="PingFangTC-Regular" w:eastAsia="PingFangTC-Regular" w:cs="PingFangTC-Regular"/>
+                <w:rFonts w:ascii="Heiti TC" w:hAnsi="Heiti TC" w:eastAsia="Heiti TC" w:cs="Heiti TC"/>
                 <w:b w:val="0"/>
                 <w:sz w:val="20"/>
               </w:rPr>
@@ -5350,7 +5512,7 @@
             </w:pPr>
             <w:r>
               <w:rPr>
-                <w:rFonts w:ascii="PingFangTC-Regular" w:hAnsi="PingFangTC-Regular" w:eastAsia="PingFangTC-Regular" w:cs="PingFangTC-Regular"/>
+                <w:rFonts w:ascii="Heiti TC" w:hAnsi="Heiti TC" w:eastAsia="Heiti TC" w:cs="Heiti TC"/>
                 <w:b w:val="0"/>
                 <w:sz w:val="20"/>
               </w:rPr>
@@ -5368,7 +5530,7 @@
             </w:pPr>
             <w:r>
               <w:rPr>
-                <w:rFonts w:ascii="PingFangTC-Regular" w:hAnsi="PingFangTC-Regular" w:eastAsia="PingFangTC-Regular" w:cs="PingFangTC-Regular"/>
+                <w:rFonts w:ascii="Heiti TC" w:hAnsi="Heiti TC" w:eastAsia="Heiti TC" w:cs="Heiti TC"/>
                 <w:b w:val="0"/>
                 <w:sz w:val="20"/>
               </w:rPr>
@@ -5386,7 +5548,7 @@
             </w:pPr>
             <w:r>
               <w:rPr>
-                <w:rFonts w:ascii="PingFangTC-Regular" w:hAnsi="PingFangTC-Regular" w:eastAsia="PingFangTC-Regular" w:cs="PingFangTC-Regular"/>
+                <w:rFonts w:ascii="Heiti TC" w:hAnsi="Heiti TC" w:eastAsia="Heiti TC" w:cs="Heiti TC"/>
                 <w:b w:val="0"/>
                 <w:sz w:val="20"/>
               </w:rPr>
@@ -5404,7 +5566,7 @@
             </w:pPr>
             <w:r>
               <w:rPr>
-                <w:rFonts w:ascii="PingFangTC-Regular" w:hAnsi="PingFangTC-Regular" w:eastAsia="PingFangTC-Regular" w:cs="PingFangTC-Regular"/>
+                <w:rFonts w:ascii="Heiti TC" w:hAnsi="Heiti TC" w:eastAsia="Heiti TC" w:cs="Heiti TC"/>
                 <w:b w:val="0"/>
                 <w:sz w:val="20"/>
               </w:rPr>
@@ -5423,7 +5585,7 @@
             </w:pPr>
             <w:r>
               <w:rPr>
-                <w:rFonts w:ascii="PingFangTC-Regular" w:hAnsi="PingFangTC-Regular" w:eastAsia="PingFangTC-Regular" w:cs="PingFangTC-Regular"/>
+                <w:rFonts w:ascii="Heiti TC" w:hAnsi="Heiti TC" w:eastAsia="Heiti TC" w:cs="Heiti TC"/>
                 <w:b w:val="0"/>
                 <w:sz w:val="20"/>
               </w:rPr>
@@ -5441,7 +5603,7 @@
             </w:pPr>
             <w:r>
               <w:rPr>
-                <w:rFonts w:ascii="PingFangTC-Regular" w:hAnsi="PingFangTC-Regular" w:eastAsia="PingFangTC-Regular" w:cs="PingFangTC-Regular"/>
+                <w:rFonts w:ascii="Heiti TC" w:hAnsi="Heiti TC" w:eastAsia="Heiti TC" w:cs="Heiti TC"/>
                 <w:b w:val="0"/>
                 <w:sz w:val="20"/>
               </w:rPr>
@@ -5459,7 +5621,7 @@
             </w:pPr>
             <w:r>
               <w:rPr>
-                <w:rFonts w:ascii="PingFangTC-Regular" w:hAnsi="PingFangTC-Regular" w:eastAsia="PingFangTC-Regular" w:cs="PingFangTC-Regular"/>
+                <w:rFonts w:ascii="Heiti TC" w:hAnsi="Heiti TC" w:eastAsia="Heiti TC" w:cs="Heiti TC"/>
                 <w:b w:val="0"/>
                 <w:sz w:val="20"/>
               </w:rPr>
@@ -5477,7 +5639,7 @@
             </w:pPr>
             <w:r>
               <w:rPr>
-                <w:rFonts w:ascii="PingFangTC-Regular" w:hAnsi="PingFangTC-Regular" w:eastAsia="PingFangTC-Regular" w:cs="PingFangTC-Regular"/>
+                <w:rFonts w:ascii="Heiti TC" w:hAnsi="Heiti TC" w:eastAsia="Heiti TC" w:cs="Heiti TC"/>
                 <w:b w:val="0"/>
                 <w:sz w:val="20"/>
               </w:rPr>
@@ -5495,7 +5657,7 @@
             </w:pPr>
             <w:r>
               <w:rPr>
-                <w:rFonts w:ascii="PingFangTC-Regular" w:hAnsi="PingFangTC-Regular" w:eastAsia="PingFangTC-Regular" w:cs="PingFangTC-Regular"/>
+                <w:rFonts w:ascii="Heiti TC" w:hAnsi="Heiti TC" w:eastAsia="Heiti TC" w:cs="Heiti TC"/>
                 <w:b w:val="0"/>
                 <w:sz w:val="20"/>
               </w:rPr>
@@ -5513,7 +5675,7 @@
             </w:pPr>
             <w:r>
               <w:rPr>
-                <w:rFonts w:ascii="PingFangTC-Regular" w:hAnsi="PingFangTC-Regular" w:eastAsia="PingFangTC-Regular" w:cs="PingFangTC-Regular"/>
+                <w:rFonts w:ascii="Heiti TC" w:hAnsi="Heiti TC" w:eastAsia="Heiti TC" w:cs="Heiti TC"/>
                 <w:b w:val="0"/>
                 <w:sz w:val="20"/>
               </w:rPr>
@@ -5531,7 +5693,7 @@
             </w:pPr>
             <w:r>
               <w:rPr>
-                <w:rFonts w:ascii="PingFangTC-Regular" w:hAnsi="PingFangTC-Regular" w:eastAsia="PingFangTC-Regular" w:cs="PingFangTC-Regular"/>
+                <w:rFonts w:ascii="Heiti TC" w:hAnsi="Heiti TC" w:eastAsia="Heiti TC" w:cs="Heiti TC"/>
                 <w:b w:val="0"/>
                 <w:sz w:val="20"/>
               </w:rPr>
@@ -5549,7 +5711,7 @@
             </w:pPr>
             <w:r>
               <w:rPr>
-                <w:rFonts w:ascii="PingFangTC-Regular" w:hAnsi="PingFangTC-Regular" w:eastAsia="PingFangTC-Regular" w:cs="PingFangTC-Regular"/>
+                <w:rFonts w:ascii="Heiti TC" w:hAnsi="Heiti TC" w:eastAsia="Heiti TC" w:cs="Heiti TC"/>
                 <w:b w:val="0"/>
                 <w:sz w:val="20"/>
               </w:rPr>
@@ -5567,7 +5729,7 @@
             </w:pPr>
             <w:r>
               <w:rPr>
-                <w:rFonts w:ascii="PingFangTC-Regular" w:hAnsi="PingFangTC-Regular" w:eastAsia="PingFangTC-Regular" w:cs="PingFangTC-Regular"/>
+                <w:rFonts w:ascii="Heiti TC" w:hAnsi="Heiti TC" w:eastAsia="Heiti TC" w:cs="Heiti TC"/>
                 <w:b w:val="0"/>
                 <w:sz w:val="20"/>
               </w:rPr>
@@ -5586,7 +5748,7 @@
             </w:pPr>
             <w:r>
               <w:rPr>
-                <w:rFonts w:ascii="PingFangTC-Regular" w:hAnsi="PingFangTC-Regular" w:eastAsia="PingFangTC-Regular" w:cs="PingFangTC-Regular"/>
+                <w:rFonts w:ascii="Heiti TC" w:hAnsi="Heiti TC" w:eastAsia="Heiti TC" w:cs="Heiti TC"/>
                 <w:b w:val="0"/>
                 <w:sz w:val="20"/>
               </w:rPr>
@@ -5604,7 +5766,7 @@
             </w:pPr>
             <w:r>
               <w:rPr>
-                <w:rFonts w:ascii="PingFangTC-Regular" w:hAnsi="PingFangTC-Regular" w:eastAsia="PingFangTC-Regular" w:cs="PingFangTC-Regular"/>
+                <w:rFonts w:ascii="Heiti TC" w:hAnsi="Heiti TC" w:eastAsia="Heiti TC" w:cs="Heiti TC"/>
                 <w:b w:val="0"/>
                 <w:sz w:val="20"/>
               </w:rPr>
@@ -5622,7 +5784,7 @@
             </w:pPr>
             <w:r>
               <w:rPr>
-                <w:rFonts w:ascii="PingFangTC-Regular" w:hAnsi="PingFangTC-Regular" w:eastAsia="PingFangTC-Regular" w:cs="PingFangTC-Regular"/>
+                <w:rFonts w:ascii="Heiti TC" w:hAnsi="Heiti TC" w:eastAsia="Heiti TC" w:cs="Heiti TC"/>
                 <w:b w:val="0"/>
                 <w:sz w:val="20"/>
               </w:rPr>
@@ -5640,7 +5802,7 @@
             </w:pPr>
             <w:r>
               <w:rPr>
-                <w:rFonts w:ascii="PingFangTC-Regular" w:hAnsi="PingFangTC-Regular" w:eastAsia="PingFangTC-Regular" w:cs="PingFangTC-Regular"/>
+                <w:rFonts w:ascii="Heiti TC" w:hAnsi="Heiti TC" w:eastAsia="Heiti TC" w:cs="Heiti TC"/>
                 <w:b w:val="0"/>
                 <w:sz w:val="20"/>
               </w:rPr>
@@ -5658,7 +5820,7 @@
             </w:pPr>
             <w:r>
               <w:rPr>
-                <w:rFonts w:ascii="PingFangTC-Regular" w:hAnsi="PingFangTC-Regular" w:eastAsia="PingFangTC-Regular" w:cs="PingFangTC-Regular"/>
+                <w:rFonts w:ascii="Heiti TC" w:hAnsi="Heiti TC" w:eastAsia="Heiti TC" w:cs="Heiti TC"/>
                 <w:b w:val="0"/>
                 <w:sz w:val="20"/>
               </w:rPr>
@@ -5676,7 +5838,7 @@
             </w:pPr>
             <w:r>
               <w:rPr>
-                <w:rFonts w:ascii="PingFangTC-Regular" w:hAnsi="PingFangTC-Regular" w:eastAsia="PingFangTC-Regular" w:cs="PingFangTC-Regular"/>
+                <w:rFonts w:ascii="Heiti TC" w:hAnsi="Heiti TC" w:eastAsia="Heiti TC" w:cs="Heiti TC"/>
                 <w:b w:val="0"/>
                 <w:sz w:val="20"/>
               </w:rPr>
@@ -5694,7 +5856,7 @@
             </w:pPr>
             <w:r>
               <w:rPr>
-                <w:rFonts w:ascii="PingFangTC-Regular" w:hAnsi="PingFangTC-Regular" w:eastAsia="PingFangTC-Regular" w:cs="PingFangTC-Regular"/>
+                <w:rFonts w:ascii="Heiti TC" w:hAnsi="Heiti TC" w:eastAsia="Heiti TC" w:cs="Heiti TC"/>
                 <w:b w:val="0"/>
                 <w:sz w:val="20"/>
               </w:rPr>
@@ -5712,7 +5874,7 @@
             </w:pPr>
             <w:r>
               <w:rPr>
-                <w:rFonts w:ascii="PingFangTC-Regular" w:hAnsi="PingFangTC-Regular" w:eastAsia="PingFangTC-Regular" w:cs="PingFangTC-Regular"/>
+                <w:rFonts w:ascii="Heiti TC" w:hAnsi="Heiti TC" w:eastAsia="Heiti TC" w:cs="Heiti TC"/>
                 <w:b w:val="0"/>
                 <w:sz w:val="20"/>
               </w:rPr>
@@ -5730,7 +5892,7 @@
             </w:pPr>
             <w:r>
               <w:rPr>
-                <w:rFonts w:ascii="PingFangTC-Regular" w:hAnsi="PingFangTC-Regular" w:eastAsia="PingFangTC-Regular" w:cs="PingFangTC-Regular"/>
+                <w:rFonts w:ascii="Heiti TC" w:hAnsi="Heiti TC" w:eastAsia="Heiti TC" w:cs="Heiti TC"/>
                 <w:b w:val="0"/>
                 <w:sz w:val="20"/>
               </w:rPr>
@@ -5749,7 +5911,7 @@
             </w:pPr>
             <w:r>
               <w:rPr>
-                <w:rFonts w:ascii="PingFangTC-Regular" w:hAnsi="PingFangTC-Regular" w:eastAsia="PingFangTC-Regular" w:cs="PingFangTC-Regular"/>
+                <w:rFonts w:ascii="Heiti TC" w:hAnsi="Heiti TC" w:eastAsia="Heiti TC" w:cs="Heiti TC"/>
                 <w:b w:val="0"/>
                 <w:sz w:val="20"/>
               </w:rPr>
@@ -5767,7 +5929,7 @@
             </w:pPr>
             <w:r>
               <w:rPr>
-                <w:rFonts w:ascii="PingFangTC-Regular" w:hAnsi="PingFangTC-Regular" w:eastAsia="PingFangTC-Regular" w:cs="PingFangTC-Regular"/>
+                <w:rFonts w:ascii="Heiti TC" w:hAnsi="Heiti TC" w:eastAsia="Heiti TC" w:cs="Heiti TC"/>
                 <w:b w:val="0"/>
                 <w:sz w:val="20"/>
               </w:rPr>
@@ -5785,7 +5947,7 @@
             </w:pPr>
             <w:r>
               <w:rPr>
-                <w:rFonts w:ascii="PingFangTC-Regular" w:hAnsi="PingFangTC-Regular" w:eastAsia="PingFangTC-Regular" w:cs="PingFangTC-Regular"/>
+                <w:rFonts w:ascii="Heiti TC" w:hAnsi="Heiti TC" w:eastAsia="Heiti TC" w:cs="Heiti TC"/>
                 <w:b w:val="0"/>
                 <w:sz w:val="20"/>
               </w:rPr>
@@ -5803,7 +5965,7 @@
             </w:pPr>
             <w:r>
               <w:rPr>
-                <w:rFonts w:ascii="PingFangTC-Regular" w:hAnsi="PingFangTC-Regular" w:eastAsia="PingFangTC-Regular" w:cs="PingFangTC-Regular"/>
+                <w:rFonts w:ascii="Heiti TC" w:hAnsi="Heiti TC" w:eastAsia="Heiti TC" w:cs="Heiti TC"/>
                 <w:b w:val="0"/>
                 <w:sz w:val="20"/>
               </w:rPr>
@@ -5821,7 +5983,7 @@
             </w:pPr>
             <w:r>
               <w:rPr>
-                <w:rFonts w:ascii="PingFangTC-Regular" w:hAnsi="PingFangTC-Regular" w:eastAsia="PingFangTC-Regular" w:cs="PingFangTC-Regular"/>
+                <w:rFonts w:ascii="Heiti TC" w:hAnsi="Heiti TC" w:eastAsia="Heiti TC" w:cs="Heiti TC"/>
                 <w:b w:val="0"/>
                 <w:sz w:val="20"/>
               </w:rPr>
@@ -5839,7 +6001,7 @@
             </w:pPr>
             <w:r>
               <w:rPr>
-                <w:rFonts w:ascii="PingFangTC-Regular" w:hAnsi="PingFangTC-Regular" w:eastAsia="PingFangTC-Regular" w:cs="PingFangTC-Regular"/>
+                <w:rFonts w:ascii="Heiti TC" w:hAnsi="Heiti TC" w:eastAsia="Heiti TC" w:cs="Heiti TC"/>
                 <w:b w:val="0"/>
                 <w:sz w:val="20"/>
               </w:rPr>
@@ -5857,7 +6019,7 @@
             </w:pPr>
             <w:r>
               <w:rPr>
-                <w:rFonts w:ascii="PingFangTC-Regular" w:hAnsi="PingFangTC-Regular" w:eastAsia="PingFangTC-Regular" w:cs="PingFangTC-Regular"/>
+                <w:rFonts w:ascii="Heiti TC" w:hAnsi="Heiti TC" w:eastAsia="Heiti TC" w:cs="Heiti TC"/>
                 <w:b w:val="0"/>
                 <w:sz w:val="20"/>
               </w:rPr>
@@ -5875,7 +6037,7 @@
             </w:pPr>
             <w:r>
               <w:rPr>
-                <w:rFonts w:ascii="PingFangTC-Regular" w:hAnsi="PingFangTC-Regular" w:eastAsia="PingFangTC-Regular" w:cs="PingFangTC-Regular"/>
+                <w:rFonts w:ascii="Heiti TC" w:hAnsi="Heiti TC" w:eastAsia="Heiti TC" w:cs="Heiti TC"/>
                 <w:b w:val="0"/>
                 <w:sz w:val="20"/>
               </w:rPr>
@@ -5893,7 +6055,7 @@
             </w:pPr>
             <w:r>
               <w:rPr>
-                <w:rFonts w:ascii="PingFangTC-Regular" w:hAnsi="PingFangTC-Regular" w:eastAsia="PingFangTC-Regular" w:cs="PingFangTC-Regular"/>
+                <w:rFonts w:ascii="Heiti TC" w:hAnsi="Heiti TC" w:eastAsia="Heiti TC" w:cs="Heiti TC"/>
                 <w:b w:val="0"/>
                 <w:sz w:val="20"/>
               </w:rPr>
@@ -5912,7 +6074,7 @@
             </w:pPr>
             <w:r>
               <w:rPr>
-                <w:rFonts w:ascii="PingFangTC-Regular" w:hAnsi="PingFangTC-Regular" w:eastAsia="PingFangTC-Regular" w:cs="PingFangTC-Regular"/>
+                <w:rFonts w:ascii="Heiti TC" w:hAnsi="Heiti TC" w:eastAsia="Heiti TC" w:cs="Heiti TC"/>
                 <w:b w:val="0"/>
                 <w:sz w:val="20"/>
               </w:rPr>
@@ -5930,7 +6092,7 @@
             </w:pPr>
             <w:r>
               <w:rPr>
-                <w:rFonts w:ascii="PingFangTC-Regular" w:hAnsi="PingFangTC-Regular" w:eastAsia="PingFangTC-Regular" w:cs="PingFangTC-Regular"/>
+                <w:rFonts w:ascii="Heiti TC" w:hAnsi="Heiti TC" w:eastAsia="Heiti TC" w:cs="Heiti TC"/>
                 <w:b w:val="0"/>
                 <w:sz w:val="20"/>
               </w:rPr>
@@ -5948,7 +6110,7 @@
             </w:pPr>
             <w:r>
               <w:rPr>
-                <w:rFonts w:ascii="PingFangTC-Regular" w:hAnsi="PingFangTC-Regular" w:eastAsia="PingFangTC-Regular" w:cs="PingFangTC-Regular"/>
+                <w:rFonts w:ascii="Heiti TC" w:hAnsi="Heiti TC" w:eastAsia="Heiti TC" w:cs="Heiti TC"/>
                 <w:b w:val="0"/>
                 <w:sz w:val="20"/>
               </w:rPr>
@@ -5966,7 +6128,7 @@
             </w:pPr>
             <w:r>
               <w:rPr>
-                <w:rFonts w:ascii="PingFangTC-Regular" w:hAnsi="PingFangTC-Regular" w:eastAsia="PingFangTC-Regular" w:cs="PingFangTC-Regular"/>
+                <w:rFonts w:ascii="Heiti TC" w:hAnsi="Heiti TC" w:eastAsia="Heiti TC" w:cs="Heiti TC"/>
                 <w:b w:val="0"/>
                 <w:sz w:val="20"/>
               </w:rPr>
@@ -5984,7 +6146,7 @@
             </w:pPr>
             <w:r>
               <w:rPr>
-                <w:rFonts w:ascii="PingFangTC-Regular" w:hAnsi="PingFangTC-Regular" w:eastAsia="PingFangTC-Regular" w:cs="PingFangTC-Regular"/>
+                <w:rFonts w:ascii="Heiti TC" w:hAnsi="Heiti TC" w:eastAsia="Heiti TC" w:cs="Heiti TC"/>
                 <w:b w:val="0"/>
                 <w:sz w:val="20"/>
               </w:rPr>
@@ -6002,7 +6164,7 @@
             </w:pPr>
             <w:r>
               <w:rPr>
-                <w:rFonts w:ascii="PingFangTC-Regular" w:hAnsi="PingFangTC-Regular" w:eastAsia="PingFangTC-Regular" w:cs="PingFangTC-Regular"/>
+                <w:rFonts w:ascii="Heiti TC" w:hAnsi="Heiti TC" w:eastAsia="Heiti TC" w:cs="Heiti TC"/>
                 <w:b w:val="0"/>
                 <w:sz w:val="20"/>
               </w:rPr>
@@ -6020,7 +6182,7 @@
             </w:pPr>
             <w:r>
               <w:rPr>
-                <w:rFonts w:ascii="PingFangTC-Regular" w:hAnsi="PingFangTC-Regular" w:eastAsia="PingFangTC-Regular" w:cs="PingFangTC-Regular"/>
+                <w:rFonts w:ascii="Heiti TC" w:hAnsi="Heiti TC" w:eastAsia="Heiti TC" w:cs="Heiti TC"/>
                 <w:b w:val="0"/>
                 <w:sz w:val="20"/>
               </w:rPr>
@@ -6038,7 +6200,7 @@
             </w:pPr>
             <w:r>
               <w:rPr>
-                <w:rFonts w:ascii="PingFangTC-Regular" w:hAnsi="PingFangTC-Regular" w:eastAsia="PingFangTC-Regular" w:cs="PingFangTC-Regular"/>
+                <w:rFonts w:ascii="Heiti TC" w:hAnsi="Heiti TC" w:eastAsia="Heiti TC" w:cs="Heiti TC"/>
                 <w:b w:val="0"/>
                 <w:sz w:val="20"/>
               </w:rPr>
@@ -6056,7 +6218,7 @@
             </w:pPr>
             <w:r>
               <w:rPr>
-                <w:rFonts w:ascii="PingFangTC-Regular" w:hAnsi="PingFangTC-Regular" w:eastAsia="PingFangTC-Regular" w:cs="PingFangTC-Regular"/>
+                <w:rFonts w:ascii="Heiti TC" w:hAnsi="Heiti TC" w:eastAsia="Heiti TC" w:cs="Heiti TC"/>
                 <w:b w:val="0"/>
                 <w:sz w:val="20"/>
               </w:rPr>
@@ -6075,7 +6237,7 @@
             </w:pPr>
             <w:r>
               <w:rPr>
-                <w:rFonts w:ascii="PingFangTC-Regular" w:hAnsi="PingFangTC-Regular" w:eastAsia="PingFangTC-Regular" w:cs="PingFangTC-Regular"/>
+                <w:rFonts w:ascii="Heiti TC" w:hAnsi="Heiti TC" w:eastAsia="Heiti TC" w:cs="Heiti TC"/>
                 <w:b w:val="0"/>
                 <w:sz w:val="20"/>
               </w:rPr>
@@ -6093,7 +6255,7 @@
             </w:pPr>
             <w:r>
               <w:rPr>
-                <w:rFonts w:ascii="PingFangTC-Regular" w:hAnsi="PingFangTC-Regular" w:eastAsia="PingFangTC-Regular" w:cs="PingFangTC-Regular"/>
+                <w:rFonts w:ascii="Heiti TC" w:hAnsi="Heiti TC" w:eastAsia="Heiti TC" w:cs="Heiti TC"/>
                 <w:b w:val="0"/>
                 <w:sz w:val="20"/>
               </w:rPr>
@@ -6111,7 +6273,7 @@
             </w:pPr>
             <w:r>
               <w:rPr>
-                <w:rFonts w:ascii="PingFangTC-Regular" w:hAnsi="PingFangTC-Regular" w:eastAsia="PingFangTC-Regular" w:cs="PingFangTC-Regular"/>
+                <w:rFonts w:ascii="Heiti TC" w:hAnsi="Heiti TC" w:eastAsia="Heiti TC" w:cs="Heiti TC"/>
                 <w:b w:val="0"/>
                 <w:sz w:val="20"/>
               </w:rPr>
@@ -6129,7 +6291,7 @@
             </w:pPr>
             <w:r>
               <w:rPr>
-                <w:rFonts w:ascii="PingFangTC-Regular" w:hAnsi="PingFangTC-Regular" w:eastAsia="PingFangTC-Regular" w:cs="PingFangTC-Regular"/>
+                <w:rFonts w:ascii="Heiti TC" w:hAnsi="Heiti TC" w:eastAsia="Heiti TC" w:cs="Heiti TC"/>
                 <w:b w:val="0"/>
                 <w:sz w:val="20"/>
               </w:rPr>
@@ -6147,7 +6309,7 @@
             </w:pPr>
             <w:r>
               <w:rPr>
-                <w:rFonts w:ascii="PingFangTC-Regular" w:hAnsi="PingFangTC-Regular" w:eastAsia="PingFangTC-Regular" w:cs="PingFangTC-Regular"/>
+                <w:rFonts w:ascii="Heiti TC" w:hAnsi="Heiti TC" w:eastAsia="Heiti TC" w:cs="Heiti TC"/>
                 <w:b w:val="0"/>
                 <w:sz w:val="20"/>
               </w:rPr>
@@ -6165,7 +6327,7 @@
             </w:pPr>
             <w:r>
               <w:rPr>
-                <w:rFonts w:ascii="PingFangTC-Regular" w:hAnsi="PingFangTC-Regular" w:eastAsia="PingFangTC-Regular" w:cs="PingFangTC-Regular"/>
+                <w:rFonts w:ascii="Heiti TC" w:hAnsi="Heiti TC" w:eastAsia="Heiti TC" w:cs="Heiti TC"/>
                 <w:b w:val="0"/>
                 <w:sz w:val="20"/>
               </w:rPr>
@@ -6183,7 +6345,7 @@
             </w:pPr>
             <w:r>
               <w:rPr>
-                <w:rFonts w:ascii="PingFangTC-Regular" w:hAnsi="PingFangTC-Regular" w:eastAsia="PingFangTC-Regular" w:cs="PingFangTC-Regular"/>
+                <w:rFonts w:ascii="Heiti TC" w:hAnsi="Heiti TC" w:eastAsia="Heiti TC" w:cs="Heiti TC"/>
                 <w:b w:val="0"/>
                 <w:sz w:val="20"/>
               </w:rPr>
@@ -6201,7 +6363,7 @@
             </w:pPr>
             <w:r>
               <w:rPr>
-                <w:rFonts w:ascii="PingFangTC-Regular" w:hAnsi="PingFangTC-Regular" w:eastAsia="PingFangTC-Regular" w:cs="PingFangTC-Regular"/>
+                <w:rFonts w:ascii="Heiti TC" w:hAnsi="Heiti TC" w:eastAsia="Heiti TC" w:cs="Heiti TC"/>
                 <w:b w:val="0"/>
                 <w:sz w:val="20"/>
               </w:rPr>
@@ -6219,7 +6381,7 @@
             </w:pPr>
             <w:r>
               <w:rPr>
-                <w:rFonts w:ascii="PingFangTC-Regular" w:hAnsi="PingFangTC-Regular" w:eastAsia="PingFangTC-Regular" w:cs="PingFangTC-Regular"/>
+                <w:rFonts w:ascii="Heiti TC" w:hAnsi="Heiti TC" w:eastAsia="Heiti TC" w:cs="Heiti TC"/>
                 <w:b w:val="0"/>
                 <w:sz w:val="20"/>
               </w:rPr>
@@ -6238,7 +6400,7 @@
             </w:pPr>
             <w:r>
               <w:rPr>
-                <w:rFonts w:ascii="PingFangTC-Regular" w:hAnsi="PingFangTC-Regular" w:eastAsia="PingFangTC-Regular" w:cs="PingFangTC-Regular"/>
+                <w:rFonts w:ascii="Heiti TC" w:hAnsi="Heiti TC" w:eastAsia="Heiti TC" w:cs="Heiti TC"/>
                 <w:b w:val="0"/>
                 <w:sz w:val="20"/>
               </w:rPr>
@@ -6256,7 +6418,7 @@
             </w:pPr>
             <w:r>
               <w:rPr>
-                <w:rFonts w:ascii="PingFangTC-Regular" w:hAnsi="PingFangTC-Regular" w:eastAsia="PingFangTC-Regular" w:cs="PingFangTC-Regular"/>
+                <w:rFonts w:ascii="Heiti TC" w:hAnsi="Heiti TC" w:eastAsia="Heiti TC" w:cs="Heiti TC"/>
                 <w:b w:val="0"/>
                 <w:sz w:val="20"/>
               </w:rPr>
@@ -6274,7 +6436,7 @@
             </w:pPr>
             <w:r>
               <w:rPr>
-                <w:rFonts w:ascii="PingFangTC-Regular" w:hAnsi="PingFangTC-Regular" w:eastAsia="PingFangTC-Regular" w:cs="PingFangTC-Regular"/>
+                <w:rFonts w:ascii="Heiti TC" w:hAnsi="Heiti TC" w:eastAsia="Heiti TC" w:cs="Heiti TC"/>
                 <w:b w:val="0"/>
                 <w:sz w:val="20"/>
               </w:rPr>
@@ -6292,7 +6454,7 @@
             </w:pPr>
             <w:r>
               <w:rPr>
-                <w:rFonts w:ascii="PingFangTC-Regular" w:hAnsi="PingFangTC-Regular" w:eastAsia="PingFangTC-Regular" w:cs="PingFangTC-Regular"/>
+                <w:rFonts w:ascii="Heiti TC" w:hAnsi="Heiti TC" w:eastAsia="Heiti TC" w:cs="Heiti TC"/>
                 <w:b w:val="0"/>
                 <w:sz w:val="20"/>
               </w:rPr>
@@ -6310,7 +6472,7 @@
             </w:pPr>
             <w:r>
               <w:rPr>
-                <w:rFonts w:ascii="PingFangTC-Regular" w:hAnsi="PingFangTC-Regular" w:eastAsia="PingFangTC-Regular" w:cs="PingFangTC-Regular"/>
+                <w:rFonts w:ascii="Heiti TC" w:hAnsi="Heiti TC" w:eastAsia="Heiti TC" w:cs="Heiti TC"/>
                 <w:b w:val="0"/>
                 <w:sz w:val="20"/>
               </w:rPr>
@@ -6328,7 +6490,7 @@
             </w:pPr>
             <w:r>
               <w:rPr>
-                <w:rFonts w:ascii="PingFangTC-Regular" w:hAnsi="PingFangTC-Regular" w:eastAsia="PingFangTC-Regular" w:cs="PingFangTC-Regular"/>
+                <w:rFonts w:ascii="Heiti TC" w:hAnsi="Heiti TC" w:eastAsia="Heiti TC" w:cs="Heiti TC"/>
                 <w:b w:val="0"/>
                 <w:sz w:val="20"/>
               </w:rPr>
@@ -6346,7 +6508,7 @@
             </w:pPr>
             <w:r>
               <w:rPr>
-                <w:rFonts w:ascii="PingFangTC-Regular" w:hAnsi="PingFangTC-Regular" w:eastAsia="PingFangTC-Regular" w:cs="PingFangTC-Regular"/>
+                <w:rFonts w:ascii="Heiti TC" w:hAnsi="Heiti TC" w:eastAsia="Heiti TC" w:cs="Heiti TC"/>
                 <w:b w:val="0"/>
                 <w:sz w:val="20"/>
               </w:rPr>
@@ -6364,7 +6526,7 @@
             </w:pPr>
             <w:r>
               <w:rPr>
-                <w:rFonts w:ascii="PingFangTC-Regular" w:hAnsi="PingFangTC-Regular" w:eastAsia="PingFangTC-Regular" w:cs="PingFangTC-Regular"/>
+                <w:rFonts w:ascii="Heiti TC" w:hAnsi="Heiti TC" w:eastAsia="Heiti TC" w:cs="Heiti TC"/>
                 <w:b w:val="0"/>
                 <w:sz w:val="20"/>
               </w:rPr>
@@ -6382,7 +6544,333 @@
             </w:pPr>
             <w:r>
               <w:rPr>
-                <w:rFonts w:ascii="PingFangTC-Regular" w:hAnsi="PingFangTC-Regular" w:eastAsia="PingFangTC-Regular" w:cs="PingFangTC-Regular"/>
+                <w:rFonts w:ascii="Heiti TC" w:hAnsi="Heiti TC" w:eastAsia="Heiti TC" w:cs="Heiti TC"/>
+                <w:b w:val="0"/>
+                <w:sz w:val="20"/>
+              </w:rPr>
+            </w:r>
+          </w:p>
+        </w:tc>
+      </w:tr>
+      <w:tr>
+        <w:tc>
+          <w:tcPr>
+            <w:tcW w:type="dxa" w:w="1040"/>
+          </w:tcPr>
+          <w:p>
+            <w:pPr>
+              <w:jc w:val="left"/>
+            </w:pPr>
+            <w:r>
+              <w:rPr>
+                <w:rFonts w:ascii="Heiti TC" w:hAnsi="Heiti TC" w:eastAsia="Heiti TC" w:cs="Heiti TC"/>
+                <w:b w:val="0"/>
+                <w:sz w:val="20"/>
+              </w:rPr>
+              <w:t>D-019</w:t>
+            </w:r>
+          </w:p>
+        </w:tc>
+        <w:tc>
+          <w:tcPr>
+            <w:tcW w:type="dxa" w:w="1040"/>
+          </w:tcPr>
+          <w:p>
+            <w:pPr>
+              <w:jc w:val="left"/>
+            </w:pPr>
+            <w:r>
+              <w:rPr>
+                <w:rFonts w:ascii="Heiti TC" w:hAnsi="Heiti TC" w:eastAsia="Heiti TC" w:cs="Heiti TC"/>
+                <w:b w:val="0"/>
+                <w:sz w:val="20"/>
+              </w:rPr>
+              <w:t>2026-10-21</w:t>
+            </w:r>
+          </w:p>
+        </w:tc>
+        <w:tc>
+          <w:tcPr>
+            <w:tcW w:type="dxa" w:w="1040"/>
+          </w:tcPr>
+          <w:p>
+            <w:pPr>
+              <w:jc w:val="left"/>
+            </w:pPr>
+            <w:r>
+              <w:rPr>
+                <w:rFonts w:ascii="Heiti TC" w:hAnsi="Heiti TC" w:eastAsia="Heiti TC" w:cs="Heiti TC"/>
+                <w:b w:val="0"/>
+                <w:sz w:val="20"/>
+              </w:rPr>
+              <w:t>已執行</w:t>
+            </w:r>
+          </w:p>
+        </w:tc>
+        <w:tc>
+          <w:tcPr>
+            <w:tcW w:type="dxa" w:w="1040"/>
+          </w:tcPr>
+          <w:p>
+            <w:pPr>
+              <w:jc w:val="left"/>
+            </w:pPr>
+            <w:r>
+              <w:rPr>
+                <w:rFonts w:ascii="Heiti TC" w:hAnsi="Heiti TC" w:eastAsia="Heiti TC" w:cs="Heiti TC"/>
+                <w:b w:val="0"/>
+                <w:sz w:val="20"/>
+              </w:rPr>
+              <w:t>LSTM</w:t>
+            </w:r>
+          </w:p>
+        </w:tc>
+        <w:tc>
+          <w:tcPr>
+            <w:tcW w:type="dxa" w:w="1040"/>
+          </w:tcPr>
+          <w:p>
+            <w:pPr>
+              <w:jc w:val="left"/>
+            </w:pPr>
+            <w:r>
+              <w:rPr>
+                <w:rFonts w:ascii="Heiti TC" w:hAnsi="Heiti TC" w:eastAsia="Heiti TC" w:cs="Heiti TC"/>
+                <w:b w:val="0"/>
+                <w:sz w:val="20"/>
+              </w:rPr>
+              <w:t>八檔共享模型與 TSLA 專屬模型</w:t>
+            </w:r>
+          </w:p>
+        </w:tc>
+        <w:tc>
+          <w:tcPr>
+            <w:tcW w:type="dxa" w:w="1040"/>
+          </w:tcPr>
+          <w:p>
+            <w:pPr>
+              <w:jc w:val="left"/>
+            </w:pPr>
+            <w:r>
+              <w:rPr>
+                <w:rFonts w:ascii="Heiti TC" w:hAnsi="Heiti TC" w:eastAsia="Heiti TC" w:cs="Heiti TC"/>
+                <w:b w:val="0"/>
+                <w:sz w:val="20"/>
+              </w:rPr>
+              <w:t>建立 AAPL、MSFT、NVDA、AMD、META、GOOGL、AMZN、TSLA 八檔共享模型，另保留 TSLA 專屬模型；使用 2013 年起的多市場週期資料、5 日取樣、20 日預測目標與時間序列隔離回測。</w:t>
+            </w:r>
+          </w:p>
+        </w:tc>
+        <w:tc>
+          <w:tcPr>
+            <w:tcW w:type="dxa" w:w="1040"/>
+          </w:tcPr>
+          <w:p>
+            <w:pPr>
+              <w:jc w:val="left"/>
+            </w:pPr>
+            <w:r>
+              <w:rPr>
+                <w:rFonts w:ascii="Heiti TC" w:hAnsi="Heiti TC" w:eastAsia="Heiti TC" w:cs="Heiti TC"/>
+                <w:b w:val="0"/>
+                <w:sz w:val="20"/>
+              </w:rPr>
+              <w:t>增加跨個股樣本與不同市場環境，同時保留 TSLA 的個別行為；評估不得只看準確率，還要比較持續偏多基準、QQQ 方向、個股表現、機率校準與低信心不交易。</w:t>
+            </w:r>
+          </w:p>
+        </w:tc>
+        <w:tc>
+          <w:tcPr>
+            <w:tcW w:type="dxa" w:w="1040"/>
+          </w:tcPr>
+          <w:p>
+            <w:pPr>
+              <w:jc w:val="left"/>
+            </w:pPr>
+            <w:r>
+              <w:rPr>
+                <w:rFonts w:ascii="Heiti TC" w:hAnsi="Heiti TC" w:eastAsia="Heiti TC" w:cs="Heiti TC"/>
+                <w:b w:val="0"/>
+                <w:sz w:val="20"/>
+              </w:rPr>
+              <w:t>LSTM 訓練、即時推論、回測、模型評估與預測驗證頁</w:t>
+            </w:r>
+          </w:p>
+        </w:tc>
+        <w:tc>
+          <w:tcPr>
+            <w:tcW w:type="dxa" w:w="1040"/>
+          </w:tcPr>
+          <w:p>
+            <w:pPr>
+              <w:jc w:val="left"/>
+            </w:pPr>
+            <w:r>
+              <w:rPr>
+                <w:rFonts w:ascii="Heiti TC" w:hAnsi="Heiti TC" w:eastAsia="Heiti TC" w:cs="Heiti TC"/>
+                <w:b w:val="0"/>
+                <w:sz w:val="20"/>
+              </w:rPr>
+            </w:r>
+          </w:p>
+        </w:tc>
+      </w:tr>
+      <w:tr>
+        <w:tc>
+          <w:tcPr>
+            <w:tcW w:type="dxa" w:w="1040"/>
+          </w:tcPr>
+          <w:p>
+            <w:pPr>
+              <w:jc w:val="left"/>
+            </w:pPr>
+            <w:r>
+              <w:rPr>
+                <w:rFonts w:ascii="Heiti TC" w:hAnsi="Heiti TC" w:eastAsia="Heiti TC" w:cs="Heiti TC"/>
+                <w:b w:val="0"/>
+                <w:sz w:val="20"/>
+              </w:rPr>
+              <w:t>D-020</w:t>
+            </w:r>
+          </w:p>
+        </w:tc>
+        <w:tc>
+          <w:tcPr>
+            <w:tcW w:type="dxa" w:w="1040"/>
+          </w:tcPr>
+          <w:p>
+            <w:pPr>
+              <w:jc w:val="left"/>
+            </w:pPr>
+            <w:r>
+              <w:rPr>
+                <w:rFonts w:ascii="Heiti TC" w:hAnsi="Heiti TC" w:eastAsia="Heiti TC" w:cs="Heiti TC"/>
+                <w:b w:val="0"/>
+                <w:sz w:val="20"/>
+              </w:rPr>
+              <w:t>2026-10-21</w:t>
+            </w:r>
+          </w:p>
+        </w:tc>
+        <w:tc>
+          <w:tcPr>
+            <w:tcW w:type="dxa" w:w="1040"/>
+          </w:tcPr>
+          <w:p>
+            <w:pPr>
+              <w:jc w:val="left"/>
+            </w:pPr>
+            <w:r>
+              <w:rPr>
+                <w:rFonts w:ascii="Heiti TC" w:hAnsi="Heiti TC" w:eastAsia="Heiti TC" w:cs="Heiti TC"/>
+                <w:b w:val="0"/>
+                <w:sz w:val="20"/>
+              </w:rPr>
+              <w:t>已執行</w:t>
+            </w:r>
+          </w:p>
+        </w:tc>
+        <w:tc>
+          <w:tcPr>
+            <w:tcW w:type="dxa" w:w="1040"/>
+          </w:tcPr>
+          <w:p>
+            <w:pPr>
+              <w:jc w:val="left"/>
+            </w:pPr>
+            <w:r>
+              <w:rPr>
+                <w:rFonts w:ascii="Heiti TC" w:hAnsi="Heiti TC" w:eastAsia="Heiti TC" w:cs="Heiti TC"/>
+                <w:b w:val="0"/>
+                <w:sz w:val="20"/>
+              </w:rPr>
+              <w:t>部署</w:t>
+            </w:r>
+          </w:p>
+        </w:tc>
+        <w:tc>
+          <w:tcPr>
+            <w:tcW w:type="dxa" w:w="1040"/>
+          </w:tcPr>
+          <w:p>
+            <w:pPr>
+              <w:jc w:val="left"/>
+            </w:pPr>
+            <w:r>
+              <w:rPr>
+                <w:rFonts w:ascii="Heiti TC" w:hAnsi="Heiti TC" w:eastAsia="Heiti TC" w:cs="Heiti TC"/>
+                <w:b w:val="0"/>
+                <w:sz w:val="20"/>
+              </w:rPr>
+              <w:t>模型快取精簡發布與 40 MB 安全門檻</w:t>
+            </w:r>
+          </w:p>
+        </w:tc>
+        <w:tc>
+          <w:tcPr>
+            <w:tcW w:type="dxa" w:w="1040"/>
+          </w:tcPr>
+          <w:p>
+            <w:pPr>
+              <w:jc w:val="left"/>
+            </w:pPr>
+            <w:r>
+              <w:rPr>
+                <w:rFonts w:ascii="Heiti TC" w:hAnsi="Heiti TC" w:eastAsia="Heiti TC" w:cs="Heiti TC"/>
+                <w:b w:val="0"/>
+                <w:sz w:val="20"/>
+              </w:rPr>
+              <w:t>可重建的大型 LSTM 訓練特徵與切分中間檔不納入日常 GitHub 提交；只發布模型、即時預測、回測、評估與狀態等前台需要的成果，並對單次暫存提交設定 40 MB 安全門檻。</w:t>
+            </w:r>
+          </w:p>
+        </w:tc>
+        <w:tc>
+          <w:tcPr>
+            <w:tcW w:type="dxa" w:w="1040"/>
+          </w:tcPr>
+          <w:p>
+            <w:pPr>
+              <w:jc w:val="left"/>
+            </w:pPr>
+            <w:r>
+              <w:rPr>
+                <w:rFonts w:ascii="Heiti TC" w:hAnsi="Heiti TC" w:eastAsia="Heiti TC" w:cs="Heiti TC"/>
+                <w:b w:val="0"/>
+                <w:sz w:val="20"/>
+              </w:rPr>
+              <w:t>避免大型特徵檔造成 GitHub 推送逾時、並行更新衝突、Streamlit 部署延遲與儲存庫持續膨脹。</w:t>
+            </w:r>
+          </w:p>
+        </w:tc>
+        <w:tc>
+          <w:tcPr>
+            <w:tcW w:type="dxa" w:w="1040"/>
+          </w:tcPr>
+          <w:p>
+            <w:pPr>
+              <w:jc w:val="left"/>
+            </w:pPr>
+            <w:r>
+              <w:rPr>
+                <w:rFonts w:ascii="Heiti TC" w:hAnsi="Heiti TC" w:eastAsia="Heiti TC" w:cs="Heiti TC"/>
+                <w:b w:val="0"/>
+                <w:sz w:val="20"/>
+              </w:rPr>
+              <w:t>GitHub Actions、LSTM 快取、GitHub 發布與 Streamlit 部署</w:t>
+            </w:r>
+          </w:p>
+        </w:tc>
+        <w:tc>
+          <w:tcPr>
+            <w:tcW w:type="dxa" w:w="1040"/>
+          </w:tcPr>
+          <w:p>
+            <w:pPr>
+              <w:jc w:val="left"/>
+            </w:pPr>
+            <w:r>
+              <w:rPr>
+                <w:rFonts w:ascii="Heiti TC" w:hAnsi="Heiti TC" w:eastAsia="Heiti TC" w:cs="Heiti TC"/>
                 <w:b w:val="0"/>
                 <w:sz w:val="20"/>
               </w:rPr>
@@ -6397,7 +6885,7 @@
       </w:pPr>
       <w:r>
         <w:rPr>
-          <w:rFonts w:ascii="PingFangTC-Regular" w:hAnsi="PingFangTC-Regular" w:eastAsia="PingFangTC-Regular" w:cs="PingFangTC-Regular"/>
+          <w:rFonts w:ascii="Heiti TC" w:hAnsi="Heiti TC" w:eastAsia="Heiti TC" w:cs="Heiti TC"/>
           <w:b w:val="0"/>
           <w:sz w:val="26"/>
         </w:rPr>
@@ -6428,7 +6916,7 @@
             </w:pPr>
             <w:r>
               <w:rPr>
-                <w:rFonts w:ascii="PingFangTC-Regular" w:hAnsi="PingFangTC-Regular" w:eastAsia="PingFangTC-Regular" w:cs="PingFangTC-Regular"/>
+                <w:rFonts w:ascii="Heiti TC" w:hAnsi="Heiti TC" w:eastAsia="Heiti TC" w:cs="Heiti TC"/>
                 <w:b/>
                 <w:sz w:val="20"/>
               </w:rPr>
@@ -6446,7 +6934,7 @@
             </w:pPr>
             <w:r>
               <w:rPr>
-                <w:rFonts w:ascii="PingFangTC-Regular" w:hAnsi="PingFangTC-Regular" w:eastAsia="PingFangTC-Regular" w:cs="PingFangTC-Regular"/>
+                <w:rFonts w:ascii="Heiti TC" w:hAnsi="Heiti TC" w:eastAsia="Heiti TC" w:cs="Heiti TC"/>
                 <w:b/>
                 <w:sz w:val="20"/>
               </w:rPr>
@@ -6464,7 +6952,7 @@
             </w:pPr>
             <w:r>
               <w:rPr>
-                <w:rFonts w:ascii="PingFangTC-Regular" w:hAnsi="PingFangTC-Regular" w:eastAsia="PingFangTC-Regular" w:cs="PingFangTC-Regular"/>
+                <w:rFonts w:ascii="Heiti TC" w:hAnsi="Heiti TC" w:eastAsia="Heiti TC" w:cs="Heiti TC"/>
                 <w:b/>
                 <w:sz w:val="20"/>
               </w:rPr>
@@ -6482,7 +6970,7 @@
             </w:pPr>
             <w:r>
               <w:rPr>
-                <w:rFonts w:ascii="PingFangTC-Regular" w:hAnsi="PingFangTC-Regular" w:eastAsia="PingFangTC-Regular" w:cs="PingFangTC-Regular"/>
+                <w:rFonts w:ascii="Heiti TC" w:hAnsi="Heiti TC" w:eastAsia="Heiti TC" w:cs="Heiti TC"/>
                 <w:b/>
                 <w:sz w:val="20"/>
               </w:rPr>
@@ -6502,7 +6990,7 @@
             </w:pPr>
             <w:r>
               <w:rPr>
-                <w:rFonts w:ascii="PingFangTC-Regular" w:hAnsi="PingFangTC-Regular" w:eastAsia="PingFangTC-Regular" w:cs="PingFangTC-Regular"/>
+                <w:rFonts w:ascii="Heiti TC" w:hAnsi="Heiti TC" w:eastAsia="Heiti TC" w:cs="Heiti TC"/>
                 <w:b w:val="0"/>
                 <w:sz w:val="20"/>
               </w:rPr>
@@ -6520,7 +7008,7 @@
             </w:pPr>
             <w:r>
               <w:rPr>
-                <w:rFonts w:ascii="PingFangTC-Regular" w:hAnsi="PingFangTC-Regular" w:eastAsia="PingFangTC-Regular" w:cs="PingFangTC-Regular"/>
+                <w:rFonts w:ascii="Heiti TC" w:hAnsi="Heiti TC" w:eastAsia="Heiti TC" w:cs="Heiti TC"/>
                 <w:b w:val="0"/>
                 <w:sz w:val="20"/>
               </w:rPr>
@@ -6538,7 +7026,7 @@
             </w:pPr>
             <w:r>
               <w:rPr>
-                <w:rFonts w:ascii="PingFangTC-Regular" w:hAnsi="PingFangTC-Regular" w:eastAsia="PingFangTC-Regular" w:cs="PingFangTC-Regular"/>
+                <w:rFonts w:ascii="Heiti TC" w:hAnsi="Heiti TC" w:eastAsia="Heiti TC" w:cs="Heiti TC"/>
                 <w:b w:val="0"/>
                 <w:sz w:val="20"/>
               </w:rPr>
@@ -6556,7 +7044,7 @@
             </w:pPr>
             <w:r>
               <w:rPr>
-                <w:rFonts w:ascii="PingFangTC-Regular" w:hAnsi="PingFangTC-Regular" w:eastAsia="PingFangTC-Regular" w:cs="PingFangTC-Regular"/>
+                <w:rFonts w:ascii="Heiti TC" w:hAnsi="Heiti TC" w:eastAsia="Heiti TC" w:cs="Heiti TC"/>
                 <w:b w:val="0"/>
                 <w:sz w:val="20"/>
               </w:rPr>
@@ -6576,7 +7064,7 @@
             </w:pPr>
             <w:r>
               <w:rPr>
-                <w:rFonts w:ascii="PingFangTC-Regular" w:hAnsi="PingFangTC-Regular" w:eastAsia="PingFangTC-Regular" w:cs="PingFangTC-Regular"/>
+                <w:rFonts w:ascii="Heiti TC" w:hAnsi="Heiti TC" w:eastAsia="Heiti TC" w:cs="Heiti TC"/>
                 <w:b w:val="0"/>
                 <w:sz w:val="20"/>
               </w:rPr>
@@ -6594,7 +7082,7 @@
             </w:pPr>
             <w:r>
               <w:rPr>
-                <w:rFonts w:ascii="PingFangTC-Regular" w:hAnsi="PingFangTC-Regular" w:eastAsia="PingFangTC-Regular" w:cs="PingFangTC-Regular"/>
+                <w:rFonts w:ascii="Heiti TC" w:hAnsi="Heiti TC" w:eastAsia="Heiti TC" w:cs="Heiti TC"/>
                 <w:b w:val="0"/>
                 <w:sz w:val="20"/>
               </w:rPr>
@@ -6612,7 +7100,7 @@
             </w:pPr>
             <w:r>
               <w:rPr>
-                <w:rFonts w:ascii="PingFangTC-Regular" w:hAnsi="PingFangTC-Regular" w:eastAsia="PingFangTC-Regular" w:cs="PingFangTC-Regular"/>
+                <w:rFonts w:ascii="Heiti TC" w:hAnsi="Heiti TC" w:eastAsia="Heiti TC" w:cs="Heiti TC"/>
                 <w:b w:val="0"/>
                 <w:sz w:val="20"/>
               </w:rPr>
@@ -6630,7 +7118,7 @@
             </w:pPr>
             <w:r>
               <w:rPr>
-                <w:rFonts w:ascii="PingFangTC-Regular" w:hAnsi="PingFangTC-Regular" w:eastAsia="PingFangTC-Regular" w:cs="PingFangTC-Regular"/>
+                <w:rFonts w:ascii="Heiti TC" w:hAnsi="Heiti TC" w:eastAsia="Heiti TC" w:cs="Heiti TC"/>
                 <w:b w:val="0"/>
                 <w:sz w:val="20"/>
               </w:rPr>
@@ -6650,7 +7138,7 @@
             </w:pPr>
             <w:r>
               <w:rPr>
-                <w:rFonts w:ascii="PingFangTC-Regular" w:hAnsi="PingFangTC-Regular" w:eastAsia="PingFangTC-Regular" w:cs="PingFangTC-Regular"/>
+                <w:rFonts w:ascii="Heiti TC" w:hAnsi="Heiti TC" w:eastAsia="Heiti TC" w:cs="Heiti TC"/>
                 <w:b w:val="0"/>
                 <w:sz w:val="20"/>
               </w:rPr>
@@ -6668,7 +7156,7 @@
             </w:pPr>
             <w:r>
               <w:rPr>
-                <w:rFonts w:ascii="PingFangTC-Regular" w:hAnsi="PingFangTC-Regular" w:eastAsia="PingFangTC-Regular" w:cs="PingFangTC-Regular"/>
+                <w:rFonts w:ascii="Heiti TC" w:hAnsi="Heiti TC" w:eastAsia="Heiti TC" w:cs="Heiti TC"/>
                 <w:b w:val="0"/>
                 <w:sz w:val="20"/>
               </w:rPr>
@@ -6686,7 +7174,7 @@
             </w:pPr>
             <w:r>
               <w:rPr>
-                <w:rFonts w:ascii="PingFangTC-Regular" w:hAnsi="PingFangTC-Regular" w:eastAsia="PingFangTC-Regular" w:cs="PingFangTC-Regular"/>
+                <w:rFonts w:ascii="Heiti TC" w:hAnsi="Heiti TC" w:eastAsia="Heiti TC" w:cs="Heiti TC"/>
                 <w:b w:val="0"/>
                 <w:sz w:val="20"/>
               </w:rPr>
@@ -6704,7 +7192,7 @@
             </w:pPr>
             <w:r>
               <w:rPr>
-                <w:rFonts w:ascii="PingFangTC-Regular" w:hAnsi="PingFangTC-Regular" w:eastAsia="PingFangTC-Regular" w:cs="PingFangTC-Regular"/>
+                <w:rFonts w:ascii="Heiti TC" w:hAnsi="Heiti TC" w:eastAsia="Heiti TC" w:cs="Heiti TC"/>
                 <w:b w:val="0"/>
                 <w:sz w:val="20"/>
               </w:rPr>
@@ -6724,7 +7212,7 @@
             </w:pPr>
             <w:r>
               <w:rPr>
-                <w:rFonts w:ascii="PingFangTC-Regular" w:hAnsi="PingFangTC-Regular" w:eastAsia="PingFangTC-Regular" w:cs="PingFangTC-Regular"/>
+                <w:rFonts w:ascii="Heiti TC" w:hAnsi="Heiti TC" w:eastAsia="Heiti TC" w:cs="Heiti TC"/>
                 <w:b w:val="0"/>
                 <w:sz w:val="20"/>
               </w:rPr>
@@ -6742,7 +7230,7 @@
             </w:pPr>
             <w:r>
               <w:rPr>
-                <w:rFonts w:ascii="PingFangTC-Regular" w:hAnsi="PingFangTC-Regular" w:eastAsia="PingFangTC-Regular" w:cs="PingFangTC-Regular"/>
+                <w:rFonts w:ascii="Heiti TC" w:hAnsi="Heiti TC" w:eastAsia="Heiti TC" w:cs="Heiti TC"/>
                 <w:b w:val="0"/>
                 <w:sz w:val="20"/>
               </w:rPr>
@@ -6760,7 +7248,7 @@
             </w:pPr>
             <w:r>
               <w:rPr>
-                <w:rFonts w:ascii="PingFangTC-Regular" w:hAnsi="PingFangTC-Regular" w:eastAsia="PingFangTC-Regular" w:cs="PingFangTC-Regular"/>
+                <w:rFonts w:ascii="Heiti TC" w:hAnsi="Heiti TC" w:eastAsia="Heiti TC" w:cs="Heiti TC"/>
                 <w:b w:val="0"/>
                 <w:sz w:val="20"/>
               </w:rPr>
@@ -6778,7 +7266,7 @@
             </w:pPr>
             <w:r>
               <w:rPr>
-                <w:rFonts w:ascii="PingFangTC-Regular" w:hAnsi="PingFangTC-Regular" w:eastAsia="PingFangTC-Regular" w:cs="PingFangTC-Regular"/>
+                <w:rFonts w:ascii="Heiti TC" w:hAnsi="Heiti TC" w:eastAsia="Heiti TC" w:cs="Heiti TC"/>
                 <w:b w:val="0"/>
                 <w:sz w:val="20"/>
               </w:rPr>
@@ -6798,7 +7286,7 @@
             </w:pPr>
             <w:r>
               <w:rPr>
-                <w:rFonts w:ascii="PingFangTC-Regular" w:hAnsi="PingFangTC-Regular" w:eastAsia="PingFangTC-Regular" w:cs="PingFangTC-Regular"/>
+                <w:rFonts w:ascii="Heiti TC" w:hAnsi="Heiti TC" w:eastAsia="Heiti TC" w:cs="Heiti TC"/>
                 <w:b w:val="0"/>
                 <w:sz w:val="20"/>
               </w:rPr>
@@ -6816,7 +7304,7 @@
             </w:pPr>
             <w:r>
               <w:rPr>
-                <w:rFonts w:ascii="PingFangTC-Regular" w:hAnsi="PingFangTC-Regular" w:eastAsia="PingFangTC-Regular" w:cs="PingFangTC-Regular"/>
+                <w:rFonts w:ascii="Heiti TC" w:hAnsi="Heiti TC" w:eastAsia="Heiti TC" w:cs="Heiti TC"/>
                 <w:b w:val="0"/>
                 <w:sz w:val="20"/>
               </w:rPr>
@@ -6834,7 +7322,7 @@
             </w:pPr>
             <w:r>
               <w:rPr>
-                <w:rFonts w:ascii="PingFangTC-Regular" w:hAnsi="PingFangTC-Regular" w:eastAsia="PingFangTC-Regular" w:cs="PingFangTC-Regular"/>
+                <w:rFonts w:ascii="Heiti TC" w:hAnsi="Heiti TC" w:eastAsia="Heiti TC" w:cs="Heiti TC"/>
                 <w:b w:val="0"/>
                 <w:sz w:val="20"/>
               </w:rPr>
@@ -6852,7 +7340,7 @@
             </w:pPr>
             <w:r>
               <w:rPr>
-                <w:rFonts w:ascii="PingFangTC-Regular" w:hAnsi="PingFangTC-Regular" w:eastAsia="PingFangTC-Regular" w:cs="PingFangTC-Regular"/>
+                <w:rFonts w:ascii="Heiti TC" w:hAnsi="Heiti TC" w:eastAsia="Heiti TC" w:cs="Heiti TC"/>
                 <w:b w:val="0"/>
                 <w:sz w:val="20"/>
               </w:rPr>
@@ -6872,7 +7360,7 @@
             </w:pPr>
             <w:r>
               <w:rPr>
-                <w:rFonts w:ascii="PingFangTC-Regular" w:hAnsi="PingFangTC-Regular" w:eastAsia="PingFangTC-Regular" w:cs="PingFangTC-Regular"/>
+                <w:rFonts w:ascii="Heiti TC" w:hAnsi="Heiti TC" w:eastAsia="Heiti TC" w:cs="Heiti TC"/>
                 <w:b w:val="0"/>
                 <w:sz w:val="20"/>
               </w:rPr>
@@ -6890,7 +7378,7 @@
             </w:pPr>
             <w:r>
               <w:rPr>
-                <w:rFonts w:ascii="PingFangTC-Regular" w:hAnsi="PingFangTC-Regular" w:eastAsia="PingFangTC-Regular" w:cs="PingFangTC-Regular"/>
+                <w:rFonts w:ascii="Heiti TC" w:hAnsi="Heiti TC" w:eastAsia="Heiti TC" w:cs="Heiti TC"/>
                 <w:b w:val="0"/>
                 <w:sz w:val="20"/>
               </w:rPr>
@@ -6908,7 +7396,7 @@
             </w:pPr>
             <w:r>
               <w:rPr>
-                <w:rFonts w:ascii="PingFangTC-Regular" w:hAnsi="PingFangTC-Regular" w:eastAsia="PingFangTC-Regular" w:cs="PingFangTC-Regular"/>
+                <w:rFonts w:ascii="Heiti TC" w:hAnsi="Heiti TC" w:eastAsia="Heiti TC" w:cs="Heiti TC"/>
                 <w:b w:val="0"/>
                 <w:sz w:val="20"/>
               </w:rPr>
@@ -6926,7 +7414,7 @@
             </w:pPr>
             <w:r>
               <w:rPr>
-                <w:rFonts w:ascii="PingFangTC-Regular" w:hAnsi="PingFangTC-Regular" w:eastAsia="PingFangTC-Regular" w:cs="PingFangTC-Regular"/>
+                <w:rFonts w:ascii="Heiti TC" w:hAnsi="Heiti TC" w:eastAsia="Heiti TC" w:cs="Heiti TC"/>
                 <w:b w:val="0"/>
                 <w:sz w:val="20"/>
               </w:rPr>
@@ -6946,7 +7434,7 @@
             </w:pPr>
             <w:r>
               <w:rPr>
-                <w:rFonts w:ascii="PingFangTC-Regular" w:hAnsi="PingFangTC-Regular" w:eastAsia="PingFangTC-Regular" w:cs="PingFangTC-Regular"/>
+                <w:rFonts w:ascii="Heiti TC" w:hAnsi="Heiti TC" w:eastAsia="Heiti TC" w:cs="Heiti TC"/>
                 <w:b w:val="0"/>
                 <w:sz w:val="20"/>
               </w:rPr>
@@ -6964,7 +7452,7 @@
             </w:pPr>
             <w:r>
               <w:rPr>
-                <w:rFonts w:ascii="PingFangTC-Regular" w:hAnsi="PingFangTC-Regular" w:eastAsia="PingFangTC-Regular" w:cs="PingFangTC-Regular"/>
+                <w:rFonts w:ascii="Heiti TC" w:hAnsi="Heiti TC" w:eastAsia="Heiti TC" w:cs="Heiti TC"/>
                 <w:b w:val="0"/>
                 <w:sz w:val="20"/>
               </w:rPr>
@@ -6982,7 +7470,7 @@
             </w:pPr>
             <w:r>
               <w:rPr>
-                <w:rFonts w:ascii="PingFangTC-Regular" w:hAnsi="PingFangTC-Regular" w:eastAsia="PingFangTC-Regular" w:cs="PingFangTC-Regular"/>
+                <w:rFonts w:ascii="Heiti TC" w:hAnsi="Heiti TC" w:eastAsia="Heiti TC" w:cs="Heiti TC"/>
                 <w:b w:val="0"/>
                 <w:sz w:val="20"/>
               </w:rPr>
@@ -7000,7 +7488,7 @@
             </w:pPr>
             <w:r>
               <w:rPr>
-                <w:rFonts w:ascii="PingFangTC-Regular" w:hAnsi="PingFangTC-Regular" w:eastAsia="PingFangTC-Regular" w:cs="PingFangTC-Regular"/>
+                <w:rFonts w:ascii="Heiti TC" w:hAnsi="Heiti TC" w:eastAsia="Heiti TC" w:cs="Heiti TC"/>
                 <w:b w:val="0"/>
                 <w:sz w:val="20"/>
               </w:rPr>
@@ -7020,7 +7508,7 @@
             </w:pPr>
             <w:r>
               <w:rPr>
-                <w:rFonts w:ascii="PingFangTC-Regular" w:hAnsi="PingFangTC-Regular" w:eastAsia="PingFangTC-Regular" w:cs="PingFangTC-Regular"/>
+                <w:rFonts w:ascii="Heiti TC" w:hAnsi="Heiti TC" w:eastAsia="Heiti TC" w:cs="Heiti TC"/>
                 <w:b w:val="0"/>
                 <w:sz w:val="20"/>
               </w:rPr>
@@ -7038,7 +7526,7 @@
             </w:pPr>
             <w:r>
               <w:rPr>
-                <w:rFonts w:ascii="PingFangTC-Regular" w:hAnsi="PingFangTC-Regular" w:eastAsia="PingFangTC-Regular" w:cs="PingFangTC-Regular"/>
+                <w:rFonts w:ascii="Heiti TC" w:hAnsi="Heiti TC" w:eastAsia="Heiti TC" w:cs="Heiti TC"/>
                 <w:b w:val="0"/>
                 <w:sz w:val="20"/>
               </w:rPr>
@@ -7056,7 +7544,7 @@
             </w:pPr>
             <w:r>
               <w:rPr>
-                <w:rFonts w:ascii="PingFangTC-Regular" w:hAnsi="PingFangTC-Regular" w:eastAsia="PingFangTC-Regular" w:cs="PingFangTC-Regular"/>
+                <w:rFonts w:ascii="Heiti TC" w:hAnsi="Heiti TC" w:eastAsia="Heiti TC" w:cs="Heiti TC"/>
                 <w:b w:val="0"/>
                 <w:sz w:val="20"/>
               </w:rPr>
@@ -7074,7 +7562,7 @@
             </w:pPr>
             <w:r>
               <w:rPr>
-                <w:rFonts w:ascii="PingFangTC-Regular" w:hAnsi="PingFangTC-Regular" w:eastAsia="PingFangTC-Regular" w:cs="PingFangTC-Regular"/>
+                <w:rFonts w:ascii="Heiti TC" w:hAnsi="Heiti TC" w:eastAsia="Heiti TC" w:cs="Heiti TC"/>
                 <w:b w:val="0"/>
                 <w:sz w:val="20"/>
               </w:rPr>
@@ -7094,7 +7582,7 @@
             </w:pPr>
             <w:r>
               <w:rPr>
-                <w:rFonts w:ascii="PingFangTC-Regular" w:hAnsi="PingFangTC-Regular" w:eastAsia="PingFangTC-Regular" w:cs="PingFangTC-Regular"/>
+                <w:rFonts w:ascii="Heiti TC" w:hAnsi="Heiti TC" w:eastAsia="Heiti TC" w:cs="Heiti TC"/>
                 <w:b w:val="0"/>
                 <w:sz w:val="20"/>
               </w:rPr>
@@ -7112,7 +7600,7 @@
             </w:pPr>
             <w:r>
               <w:rPr>
-                <w:rFonts w:ascii="PingFangTC-Regular" w:hAnsi="PingFangTC-Regular" w:eastAsia="PingFangTC-Regular" w:cs="PingFangTC-Regular"/>
+                <w:rFonts w:ascii="Heiti TC" w:hAnsi="Heiti TC" w:eastAsia="Heiti TC" w:cs="Heiti TC"/>
                 <w:b w:val="0"/>
                 <w:sz w:val="20"/>
               </w:rPr>
@@ -7130,7 +7618,7 @@
             </w:pPr>
             <w:r>
               <w:rPr>
-                <w:rFonts w:ascii="PingFangTC-Regular" w:hAnsi="PingFangTC-Regular" w:eastAsia="PingFangTC-Regular" w:cs="PingFangTC-Regular"/>
+                <w:rFonts w:ascii="Heiti TC" w:hAnsi="Heiti TC" w:eastAsia="Heiti TC" w:cs="Heiti TC"/>
                 <w:b w:val="0"/>
                 <w:sz w:val="20"/>
               </w:rPr>
@@ -7148,7 +7636,7 @@
             </w:pPr>
             <w:r>
               <w:rPr>
-                <w:rFonts w:ascii="PingFangTC-Regular" w:hAnsi="PingFangTC-Regular" w:eastAsia="PingFangTC-Regular" w:cs="PingFangTC-Regular"/>
+                <w:rFonts w:ascii="Heiti TC" w:hAnsi="Heiti TC" w:eastAsia="Heiti TC" w:cs="Heiti TC"/>
                 <w:b w:val="0"/>
                 <w:sz w:val="20"/>
               </w:rPr>
@@ -7168,7 +7656,7 @@
             </w:pPr>
             <w:r>
               <w:rPr>
-                <w:rFonts w:ascii="PingFangTC-Regular" w:hAnsi="PingFangTC-Regular" w:eastAsia="PingFangTC-Regular" w:cs="PingFangTC-Regular"/>
+                <w:rFonts w:ascii="Heiti TC" w:hAnsi="Heiti TC" w:eastAsia="Heiti TC" w:cs="Heiti TC"/>
                 <w:b w:val="0"/>
                 <w:sz w:val="20"/>
               </w:rPr>
@@ -7186,7 +7674,7 @@
             </w:pPr>
             <w:r>
               <w:rPr>
-                <w:rFonts w:ascii="PingFangTC-Regular" w:hAnsi="PingFangTC-Regular" w:eastAsia="PingFangTC-Regular" w:cs="PingFangTC-Regular"/>
+                <w:rFonts w:ascii="Heiti TC" w:hAnsi="Heiti TC" w:eastAsia="Heiti TC" w:cs="Heiti TC"/>
                 <w:b w:val="0"/>
                 <w:sz w:val="20"/>
               </w:rPr>
@@ -7204,7 +7692,7 @@
             </w:pPr>
             <w:r>
               <w:rPr>
-                <w:rFonts w:ascii="PingFangTC-Regular" w:hAnsi="PingFangTC-Regular" w:eastAsia="PingFangTC-Regular" w:cs="PingFangTC-Regular"/>
+                <w:rFonts w:ascii="Heiti TC" w:hAnsi="Heiti TC" w:eastAsia="Heiti TC" w:cs="Heiti TC"/>
                 <w:b w:val="0"/>
                 <w:sz w:val="20"/>
               </w:rPr>
@@ -7222,7 +7710,7 @@
             </w:pPr>
             <w:r>
               <w:rPr>
-                <w:rFonts w:ascii="PingFangTC-Regular" w:hAnsi="PingFangTC-Regular" w:eastAsia="PingFangTC-Regular" w:cs="PingFangTC-Regular"/>
+                <w:rFonts w:ascii="Heiti TC" w:hAnsi="Heiti TC" w:eastAsia="Heiti TC" w:cs="Heiti TC"/>
                 <w:b w:val="0"/>
                 <w:sz w:val="20"/>
               </w:rPr>
@@ -7242,7 +7730,7 @@
             </w:pPr>
             <w:r>
               <w:rPr>
-                <w:rFonts w:ascii="PingFangTC-Regular" w:hAnsi="PingFangTC-Regular" w:eastAsia="PingFangTC-Regular" w:cs="PingFangTC-Regular"/>
+                <w:rFonts w:ascii="Heiti TC" w:hAnsi="Heiti TC" w:eastAsia="Heiti TC" w:cs="Heiti TC"/>
                 <w:b w:val="0"/>
                 <w:sz w:val="20"/>
               </w:rPr>
@@ -7260,7 +7748,7 @@
             </w:pPr>
             <w:r>
               <w:rPr>
-                <w:rFonts w:ascii="PingFangTC-Regular" w:hAnsi="PingFangTC-Regular" w:eastAsia="PingFangTC-Regular" w:cs="PingFangTC-Regular"/>
+                <w:rFonts w:ascii="Heiti TC" w:hAnsi="Heiti TC" w:eastAsia="Heiti TC" w:cs="Heiti TC"/>
                 <w:b w:val="0"/>
                 <w:sz w:val="20"/>
               </w:rPr>
@@ -7278,7 +7766,7 @@
             </w:pPr>
             <w:r>
               <w:rPr>
-                <w:rFonts w:ascii="PingFangTC-Regular" w:hAnsi="PingFangTC-Regular" w:eastAsia="PingFangTC-Regular" w:cs="PingFangTC-Regular"/>
+                <w:rFonts w:ascii="Heiti TC" w:hAnsi="Heiti TC" w:eastAsia="Heiti TC" w:cs="Heiti TC"/>
                 <w:b w:val="0"/>
                 <w:sz w:val="20"/>
               </w:rPr>
@@ -7296,7 +7784,7 @@
             </w:pPr>
             <w:r>
               <w:rPr>
-                <w:rFonts w:ascii="PingFangTC-Regular" w:hAnsi="PingFangTC-Regular" w:eastAsia="PingFangTC-Regular" w:cs="PingFangTC-Regular"/>
+                <w:rFonts w:ascii="Heiti TC" w:hAnsi="Heiti TC" w:eastAsia="Heiti TC" w:cs="Heiti TC"/>
                 <w:b w:val="0"/>
                 <w:sz w:val="20"/>
               </w:rPr>
@@ -7316,7 +7804,7 @@
             </w:pPr>
             <w:r>
               <w:rPr>
-                <w:rFonts w:ascii="PingFangTC-Regular" w:hAnsi="PingFangTC-Regular" w:eastAsia="PingFangTC-Regular" w:cs="PingFangTC-Regular"/>
+                <w:rFonts w:ascii="Heiti TC" w:hAnsi="Heiti TC" w:eastAsia="Heiti TC" w:cs="Heiti TC"/>
                 <w:b w:val="0"/>
                 <w:sz w:val="20"/>
               </w:rPr>
@@ -7334,7 +7822,7 @@
             </w:pPr>
             <w:r>
               <w:rPr>
-                <w:rFonts w:ascii="PingFangTC-Regular" w:hAnsi="PingFangTC-Regular" w:eastAsia="PingFangTC-Regular" w:cs="PingFangTC-Regular"/>
+                <w:rFonts w:ascii="Heiti TC" w:hAnsi="Heiti TC" w:eastAsia="Heiti TC" w:cs="Heiti TC"/>
                 <w:b w:val="0"/>
                 <w:sz w:val="20"/>
               </w:rPr>
@@ -7352,7 +7840,7 @@
             </w:pPr>
             <w:r>
               <w:rPr>
-                <w:rFonts w:ascii="PingFangTC-Regular" w:hAnsi="PingFangTC-Regular" w:eastAsia="PingFangTC-Regular" w:cs="PingFangTC-Regular"/>
+                <w:rFonts w:ascii="Heiti TC" w:hAnsi="Heiti TC" w:eastAsia="Heiti TC" w:cs="Heiti TC"/>
                 <w:b w:val="0"/>
                 <w:sz w:val="20"/>
               </w:rPr>
@@ -7370,7 +7858,7 @@
             </w:pPr>
             <w:r>
               <w:rPr>
-                <w:rFonts w:ascii="PingFangTC-Regular" w:hAnsi="PingFangTC-Regular" w:eastAsia="PingFangTC-Regular" w:cs="PingFangTC-Regular"/>
+                <w:rFonts w:ascii="Heiti TC" w:hAnsi="Heiti TC" w:eastAsia="Heiti TC" w:cs="Heiti TC"/>
                 <w:b w:val="0"/>
                 <w:sz w:val="20"/>
               </w:rPr>
@@ -7390,7 +7878,7 @@
             </w:pPr>
             <w:r>
               <w:rPr>
-                <w:rFonts w:ascii="PingFangTC-Regular" w:hAnsi="PingFangTC-Regular" w:eastAsia="PingFangTC-Regular" w:cs="PingFangTC-Regular"/>
+                <w:rFonts w:ascii="Heiti TC" w:hAnsi="Heiti TC" w:eastAsia="Heiti TC" w:cs="Heiti TC"/>
                 <w:b w:val="0"/>
                 <w:sz w:val="20"/>
               </w:rPr>
@@ -7408,7 +7896,7 @@
             </w:pPr>
             <w:r>
               <w:rPr>
-                <w:rFonts w:ascii="PingFangTC-Regular" w:hAnsi="PingFangTC-Regular" w:eastAsia="PingFangTC-Regular" w:cs="PingFangTC-Regular"/>
+                <w:rFonts w:ascii="Heiti TC" w:hAnsi="Heiti TC" w:eastAsia="Heiti TC" w:cs="Heiti TC"/>
                 <w:b w:val="0"/>
                 <w:sz w:val="20"/>
               </w:rPr>
@@ -7426,7 +7914,7 @@
             </w:pPr>
             <w:r>
               <w:rPr>
-                <w:rFonts w:ascii="PingFangTC-Regular" w:hAnsi="PingFangTC-Regular" w:eastAsia="PingFangTC-Regular" w:cs="PingFangTC-Regular"/>
+                <w:rFonts w:ascii="Heiti TC" w:hAnsi="Heiti TC" w:eastAsia="Heiti TC" w:cs="Heiti TC"/>
                 <w:b w:val="0"/>
                 <w:sz w:val="20"/>
               </w:rPr>
@@ -7444,7 +7932,7 @@
             </w:pPr>
             <w:r>
               <w:rPr>
-                <w:rFonts w:ascii="PingFangTC-Regular" w:hAnsi="PingFangTC-Regular" w:eastAsia="PingFangTC-Regular" w:cs="PingFangTC-Regular"/>
+                <w:rFonts w:ascii="Heiti TC" w:hAnsi="Heiti TC" w:eastAsia="Heiti TC" w:cs="Heiti TC"/>
                 <w:b w:val="0"/>
                 <w:sz w:val="20"/>
               </w:rPr>
@@ -7464,7 +7952,7 @@
             </w:pPr>
             <w:r>
               <w:rPr>
-                <w:rFonts w:ascii="PingFangTC-Regular" w:hAnsi="PingFangTC-Regular" w:eastAsia="PingFangTC-Regular" w:cs="PingFangTC-Regular"/>
+                <w:rFonts w:ascii="Heiti TC" w:hAnsi="Heiti TC" w:eastAsia="Heiti TC" w:cs="Heiti TC"/>
                 <w:b w:val="0"/>
                 <w:sz w:val="20"/>
               </w:rPr>
@@ -7482,7 +7970,7 @@
             </w:pPr>
             <w:r>
               <w:rPr>
-                <w:rFonts w:ascii="PingFangTC-Regular" w:hAnsi="PingFangTC-Regular" w:eastAsia="PingFangTC-Regular" w:cs="PingFangTC-Regular"/>
+                <w:rFonts w:ascii="Heiti TC" w:hAnsi="Heiti TC" w:eastAsia="Heiti TC" w:cs="Heiti TC"/>
                 <w:b w:val="0"/>
                 <w:sz w:val="20"/>
               </w:rPr>
@@ -7500,7 +7988,7 @@
             </w:pPr>
             <w:r>
               <w:rPr>
-                <w:rFonts w:ascii="PingFangTC-Regular" w:hAnsi="PingFangTC-Regular" w:eastAsia="PingFangTC-Regular" w:cs="PingFangTC-Regular"/>
+                <w:rFonts w:ascii="Heiti TC" w:hAnsi="Heiti TC" w:eastAsia="Heiti TC" w:cs="Heiti TC"/>
                 <w:b w:val="0"/>
                 <w:sz w:val="20"/>
               </w:rPr>
@@ -7518,7 +8006,7 @@
             </w:pPr>
             <w:r>
               <w:rPr>
-                <w:rFonts w:ascii="PingFangTC-Regular" w:hAnsi="PingFangTC-Regular" w:eastAsia="PingFangTC-Regular" w:cs="PingFangTC-Regular"/>
+                <w:rFonts w:ascii="Heiti TC" w:hAnsi="Heiti TC" w:eastAsia="Heiti TC" w:cs="Heiti TC"/>
                 <w:b w:val="0"/>
                 <w:sz w:val="20"/>
               </w:rPr>
@@ -7538,7 +8026,7 @@
             </w:pPr>
             <w:r>
               <w:rPr>
-                <w:rFonts w:ascii="PingFangTC-Regular" w:hAnsi="PingFangTC-Regular" w:eastAsia="PingFangTC-Regular" w:cs="PingFangTC-Regular"/>
+                <w:rFonts w:ascii="Heiti TC" w:hAnsi="Heiti TC" w:eastAsia="Heiti TC" w:cs="Heiti TC"/>
                 <w:b w:val="0"/>
                 <w:sz w:val="20"/>
               </w:rPr>
@@ -7556,7 +8044,7 @@
             </w:pPr>
             <w:r>
               <w:rPr>
-                <w:rFonts w:ascii="PingFangTC-Regular" w:hAnsi="PingFangTC-Regular" w:eastAsia="PingFangTC-Regular" w:cs="PingFangTC-Regular"/>
+                <w:rFonts w:ascii="Heiti TC" w:hAnsi="Heiti TC" w:eastAsia="Heiti TC" w:cs="Heiti TC"/>
                 <w:b w:val="0"/>
                 <w:sz w:val="20"/>
               </w:rPr>
@@ -7574,7 +8062,7 @@
             </w:pPr>
             <w:r>
               <w:rPr>
-                <w:rFonts w:ascii="PingFangTC-Regular" w:hAnsi="PingFangTC-Regular" w:eastAsia="PingFangTC-Regular" w:cs="PingFangTC-Regular"/>
+                <w:rFonts w:ascii="Heiti TC" w:hAnsi="Heiti TC" w:eastAsia="Heiti TC" w:cs="Heiti TC"/>
                 <w:b w:val="0"/>
                 <w:sz w:val="20"/>
               </w:rPr>
@@ -7592,7 +8080,155 @@
             </w:pPr>
             <w:r>
               <w:rPr>
-                <w:rFonts w:ascii="PingFangTC-Regular" w:hAnsi="PingFangTC-Regular" w:eastAsia="PingFangTC-Regular" w:cs="PingFangTC-Regular"/>
+                <w:rFonts w:ascii="Heiti TC" w:hAnsi="Heiti TC" w:eastAsia="Heiti TC" w:cs="Heiti TC"/>
+                <w:b w:val="0"/>
+                <w:sz w:val="20"/>
+              </w:rPr>
+              <w:t>Codex 已確認決策</w:t>
+            </w:r>
+          </w:p>
+        </w:tc>
+      </w:tr>
+      <w:tr>
+        <w:tc>
+          <w:tcPr>
+            <w:tcW w:type="dxa" w:w="2340"/>
+          </w:tcPr>
+          <w:p>
+            <w:pPr>
+              <w:jc w:val="left"/>
+            </w:pPr>
+            <w:r>
+              <w:rPr>
+                <w:rFonts w:ascii="Heiti TC" w:hAnsi="Heiti TC" w:eastAsia="Heiti TC" w:cs="Heiti TC"/>
+                <w:b w:val="0"/>
+                <w:sz w:val="20"/>
+              </w:rPr>
+              <w:t>2026-10-21</w:t>
+            </w:r>
+          </w:p>
+        </w:tc>
+        <w:tc>
+          <w:tcPr>
+            <w:tcW w:type="dxa" w:w="2340"/>
+          </w:tcPr>
+          <w:p>
+            <w:pPr>
+              <w:jc w:val="left"/>
+            </w:pPr>
+            <w:r>
+              <w:rPr>
+                <w:rFonts w:ascii="Heiti TC" w:hAnsi="Heiti TC" w:eastAsia="Heiti TC" w:cs="Heiti TC"/>
+                <w:b w:val="0"/>
+                <w:sz w:val="20"/>
+              </w:rPr>
+              <w:t>八檔共享模型與 TSLA 專屬模型</w:t>
+            </w:r>
+          </w:p>
+        </w:tc>
+        <w:tc>
+          <w:tcPr>
+            <w:tcW w:type="dxa" w:w="2340"/>
+          </w:tcPr>
+          <w:p>
+            <w:pPr>
+              <w:jc w:val="left"/>
+            </w:pPr>
+            <w:r>
+              <w:rPr>
+                <w:rFonts w:ascii="Heiti TC" w:hAnsi="Heiti TC" w:eastAsia="Heiti TC" w:cs="Heiti TC"/>
+                <w:b w:val="0"/>
+                <w:sz w:val="20"/>
+              </w:rPr>
+              <w:t>增加跨個股樣本與不同市場環境，同時保留 TSLA 的個別行為；評估不得只看準確率，還要比較持續偏多基準、QQQ 方向、個股表現、機率校準與低信心不交易。</w:t>
+            </w:r>
+          </w:p>
+        </w:tc>
+        <w:tc>
+          <w:tcPr>
+            <w:tcW w:type="dxa" w:w="2340"/>
+          </w:tcPr>
+          <w:p>
+            <w:pPr>
+              <w:jc w:val="left"/>
+            </w:pPr>
+            <w:r>
+              <w:rPr>
+                <w:rFonts w:ascii="Heiti TC" w:hAnsi="Heiti TC" w:eastAsia="Heiti TC" w:cs="Heiti TC"/>
+                <w:b w:val="0"/>
+                <w:sz w:val="20"/>
+              </w:rPr>
+              <w:t>Codex 已確認決策</w:t>
+            </w:r>
+          </w:p>
+        </w:tc>
+      </w:tr>
+      <w:tr>
+        <w:tc>
+          <w:tcPr>
+            <w:tcW w:type="dxa" w:w="2340"/>
+          </w:tcPr>
+          <w:p>
+            <w:pPr>
+              <w:jc w:val="left"/>
+            </w:pPr>
+            <w:r>
+              <w:rPr>
+                <w:rFonts w:ascii="Heiti TC" w:hAnsi="Heiti TC" w:eastAsia="Heiti TC" w:cs="Heiti TC"/>
+                <w:b w:val="0"/>
+                <w:sz w:val="20"/>
+              </w:rPr>
+              <w:t>2026-10-21</w:t>
+            </w:r>
+          </w:p>
+        </w:tc>
+        <w:tc>
+          <w:tcPr>
+            <w:tcW w:type="dxa" w:w="2340"/>
+          </w:tcPr>
+          <w:p>
+            <w:pPr>
+              <w:jc w:val="left"/>
+            </w:pPr>
+            <w:r>
+              <w:rPr>
+                <w:rFonts w:ascii="Heiti TC" w:hAnsi="Heiti TC" w:eastAsia="Heiti TC" w:cs="Heiti TC"/>
+                <w:b w:val="0"/>
+                <w:sz w:val="20"/>
+              </w:rPr>
+              <w:t>模型快取精簡發布與 40 MB 安全門檻</w:t>
+            </w:r>
+          </w:p>
+        </w:tc>
+        <w:tc>
+          <w:tcPr>
+            <w:tcW w:type="dxa" w:w="2340"/>
+          </w:tcPr>
+          <w:p>
+            <w:pPr>
+              <w:jc w:val="left"/>
+            </w:pPr>
+            <w:r>
+              <w:rPr>
+                <w:rFonts w:ascii="Heiti TC" w:hAnsi="Heiti TC" w:eastAsia="Heiti TC" w:cs="Heiti TC"/>
+                <w:b w:val="0"/>
+                <w:sz w:val="20"/>
+              </w:rPr>
+              <w:t>避免大型特徵檔造成 GitHub 推送逾時、並行更新衝突、Streamlit 部署延遲與儲存庫持續膨脹。</w:t>
+            </w:r>
+          </w:p>
+        </w:tc>
+        <w:tc>
+          <w:tcPr>
+            <w:tcW w:type="dxa" w:w="2340"/>
+          </w:tcPr>
+          <w:p>
+            <w:pPr>
+              <w:jc w:val="left"/>
+            </w:pPr>
+            <w:r>
+              <w:rPr>
+                <w:rFonts w:ascii="Heiti TC" w:hAnsi="Heiti TC" w:eastAsia="Heiti TC" w:cs="Heiti TC"/>
                 <w:b w:val="0"/>
                 <w:sz w:val="20"/>
               </w:rPr>
@@ -7608,7 +8244,7 @@
       </w:pPr>
       <w:r>
         <w:rPr>
-          <w:rFonts w:ascii="PingFangTC-Regular" w:hAnsi="PingFangTC-Regular" w:eastAsia="PingFangTC-Regular" w:cs="PingFangTC-Regular"/>
+          <w:rFonts w:ascii="Heiti TC" w:hAnsi="Heiti TC" w:eastAsia="Heiti TC" w:cs="Heiti TC"/>
           <w:b w:val="0"/>
           <w:sz w:val="18"/>
         </w:rPr>

</xml_diff>

<commit_message>
Add historical event backfill and KG validation
</commit_message>
<xml_diff>
--- a/data/觀察版資料/13_專案記憶/專案記憶與討論摘要.docx
+++ b/data/觀察版資料/13_專案記憶/專案記憶與討論摘要.docx
@@ -26,7 +26,7 @@
           <w:b w:val="0"/>
           <w:sz w:val="20"/>
         </w:rPr>
-        <w:t>產生時間：2026-10-21 11:19 UTC｜來源：專案記憶資料夾</w:t>
+        <w:t>產生時間：2026-10-21 12:06 UTC｜來源：專案記憶資料夾</w:t>
       </w:r>
     </w:p>
     <w:p>
@@ -156,7 +156,7 @@
                 <w:b w:val="0"/>
                 <w:sz w:val="20"/>
               </w:rPr>
-              <w:t>20</w:t>
+              <w:t>21</w:t>
             </w:r>
           </w:p>
         </w:tc>
@@ -212,7 +212,7 @@
                 <w:b w:val="0"/>
                 <w:sz w:val="20"/>
               </w:rPr>
-              <w:t>19</w:t>
+              <w:t>21</w:t>
             </w:r>
           </w:p>
         </w:tc>
@@ -268,7 +268,7 @@
                 <w:b w:val="0"/>
                 <w:sz w:val="20"/>
               </w:rPr>
-              <w:t>1</w:t>
+              <w:t>0</w:t>
             </w:r>
           </w:p>
         </w:tc>
@@ -499,7 +499,7 @@
                 <w:b w:val="0"/>
                 <w:sz w:val="20"/>
               </w:rPr>
-              <w:t>模型快取精簡發布與 40 MB 安全門檻</w:t>
+              <w:t>歷史多來源事件回補與 KG 回測管線</w:t>
             </w:r>
           </w:p>
         </w:tc>
@@ -573,7 +573,7 @@
                 <w:b w:val="0"/>
                 <w:sz w:val="20"/>
               </w:rPr>
-              <w:t>八檔共享模型與 TSLA 專屬模型</w:t>
+              <w:t>模型快取精簡發布與 40 MB 安全門檻</w:t>
             </w:r>
           </w:p>
         </w:tc>
@@ -629,7 +629,7 @@
                 <w:b w:val="0"/>
                 <w:sz w:val="20"/>
               </w:rPr>
-              <w:t>2026-08-02</w:t>
+              <w:t>2026-10-21</w:t>
             </w:r>
           </w:p>
         </w:tc>
@@ -647,7 +647,7 @@
                 <w:b w:val="0"/>
                 <w:sz w:val="20"/>
               </w:rPr>
-              <w:t>AI 摘要改為個人研究優先模式</w:t>
+              <w:t>八檔共享模型與 TSLA 專屬模型</w:t>
             </w:r>
           </w:p>
         </w:tc>
@@ -703,7 +703,7 @@
                 <w:b w:val="0"/>
                 <w:sz w:val="20"/>
               </w:rPr>
-              <w:t>2026-07-26</w:t>
+              <w:t>2026-08-02</w:t>
             </w:r>
           </w:p>
         </w:tc>
@@ -721,7 +721,7 @@
                 <w:b w:val="0"/>
                 <w:sz w:val="20"/>
               </w:rPr>
-              <w:t>LSTM 基準比較與機率校準</w:t>
+              <w:t>AI 摘要改為個人研究優先模式</w:t>
             </w:r>
           </w:p>
         </w:tc>
@@ -795,7 +795,7 @@
                 <w:b w:val="0"/>
                 <w:sz w:val="20"/>
               </w:rPr>
-              <w:t>KG 歷史回測資格與因子有效性報告</w:t>
+              <w:t>LSTM 基準比較與機率校準</w:t>
             </w:r>
           </w:p>
         </w:tc>
@@ -869,7 +869,7 @@
                 <w:b w:val="0"/>
                 <w:sz w:val="20"/>
               </w:rPr>
-              <w:t>模型快取精簡發布與 40 MB 安全門檻</w:t>
+              <w:t>歷史多來源事件回補與 KG 回測管線</w:t>
             </w:r>
           </w:p>
         </w:tc>
@@ -943,7 +943,7 @@
                 <w:b w:val="0"/>
                 <w:sz w:val="20"/>
               </w:rPr>
-              <w:t>八檔共享模型與 TSLA 專屬模型</w:t>
+              <w:t>模型快取精簡發布與 40 MB 安全門檻</w:t>
             </w:r>
           </w:p>
         </w:tc>
@@ -999,7 +999,7 @@
                 <w:b w:val="0"/>
                 <w:sz w:val="20"/>
               </w:rPr>
-              <w:t>2026-08-02</w:t>
+              <w:t>2026-10-21</w:t>
             </w:r>
           </w:p>
         </w:tc>
@@ -1017,7 +1017,7 @@
                 <w:b w:val="0"/>
                 <w:sz w:val="20"/>
               </w:rPr>
-              <w:t>AI 摘要改為個人研究優先模式</w:t>
+              <w:t>八檔共享模型與 TSLA 專屬模型</w:t>
             </w:r>
           </w:p>
         </w:tc>
@@ -1073,7 +1073,7 @@
                 <w:b w:val="0"/>
                 <w:sz w:val="20"/>
               </w:rPr>
-              <w:t>2026-07-26</w:t>
+              <w:t>2026-08-02</w:t>
             </w:r>
           </w:p>
         </w:tc>
@@ -1091,7 +1091,7 @@
                 <w:b w:val="0"/>
                 <w:sz w:val="20"/>
               </w:rPr>
-              <w:t>LSTM 基準比較與機率校準</w:t>
+              <w:t>AI 摘要改為個人研究優先模式</w:t>
             </w:r>
           </w:p>
         </w:tc>
@@ -1165,7 +1165,7 @@
                 <w:b w:val="0"/>
                 <w:sz w:val="20"/>
               </w:rPr>
-              <w:t>KG 歷史回測資格與因子有效性報告</w:t>
+              <w:t>LSTM 基準比較與機率校準</w:t>
             </w:r>
           </w:p>
         </w:tc>
@@ -1943,6 +1943,33 @@
     </w:p>
     <w:p>
       <w:pPr>
+        <w:spacing w:before="200" w:after="120"/>
+      </w:pPr>
+      <w:r>
+        <w:rPr>
+          <w:rFonts w:ascii="Heiti TC" w:hAnsi="Heiti TC" w:eastAsia="Heiti TC" w:cs="Heiti TC"/>
+          <w:b w:val="0"/>
+          <w:sz w:val="26"/>
+        </w:rPr>
+        <w:t>2026-10-21｜歷史多來源事件回補與 KG 回測管線</w:t>
+      </w:r>
+    </w:p>
+    <w:p>
+      <w:pPr>
+        <w:pStyle w:val="ListBullet"/>
+        <w:spacing w:after="60" w:line="276" w:lineRule="auto"/>
+      </w:pPr>
+      <w:r>
+        <w:rPr>
+          <w:rFonts w:ascii="Heiti TC" w:hAnsi="Heiti TC" w:eastAsia="Heiti TC" w:cs="Heiti TC"/>
+          <w:b w:val="0"/>
+          <w:sz w:val="22"/>
+        </w:rPr>
+        <w:t>歷史事件回補與日常正式預測必須分離；回測應持續顯示樣本數、市場狀態分布、方向一致率、實際報酬與回撤。</w:t>
+      </w:r>
+    </w:p>
+    <w:p>
+      <w:pPr>
         <w:spacing w:before="280" w:after="120"/>
       </w:pPr>
       <w:r>
@@ -2857,6 +2884,33 @@
     </w:p>
     <w:p>
       <w:pPr>
+        <w:spacing w:before="200" w:after="120"/>
+      </w:pPr>
+      <w:r>
+        <w:rPr>
+          <w:rFonts w:ascii="Heiti TC" w:hAnsi="Heiti TC" w:eastAsia="Heiti TC" w:cs="Heiti TC"/>
+          <w:b w:val="0"/>
+          <w:sz w:val="26"/>
+        </w:rPr>
+        <w:t>2026-10-21｜歷史多來源事件回補與 KG 回測管線</w:t>
+      </w:r>
+    </w:p>
+    <w:p>
+      <w:pPr>
+        <w:pStyle w:val="ListBullet"/>
+        <w:spacing w:after="60" w:line="276" w:lineRule="auto"/>
+      </w:pPr>
+      <w:r>
+        <w:rPr>
+          <w:rFonts w:ascii="Heiti TC" w:hAnsi="Heiti TC" w:eastAsia="Heiti TC" w:cs="Heiti TC"/>
+          <w:b w:val="0"/>
+          <w:sz w:val="22"/>
+        </w:rPr>
+        <w:t>首輪已掃描 23 個日期並取得 992 筆原始證據，22 筆具完整 KG 回測資格；初步方向一致率僅 36.4%，維持低信心，不調權重美化結果。</w:t>
+      </w:r>
+    </w:p>
+    <w:p>
+      <w:pPr>
         <w:spacing w:before="280" w:after="120"/>
       </w:pPr>
       <w:r>
@@ -3207,7 +3261,7 @@
           <w:b w:val="0"/>
           <w:sz w:val="22"/>
         </w:rPr>
-        <w:t>待執行：先盤點可取得的歷史價格、官方事件、基本面與多來源新聞覆蓋，再建立獨立回測資料集，不混入日常正式預測。</w:t>
+        <w:t>已由 D-021 完成第一階段：建立獨立歷史事件證據層、低速回補排程與 KG 回測資料集，不混入日常正式預測。</w:t>
       </w:r>
     </w:p>
     <w:p>
@@ -3234,7 +3288,7 @@
           <w:b w:val="0"/>
           <w:sz w:val="22"/>
         </w:rPr>
-        <w:t>已執行：500 個市場技術基線樣本已建立並自動接入六小時更新。待執行：歷史多來源事件與 point-in-time 基本面回補。</w:t>
+        <w:t>已執行：500 個市場技術基線樣本已建立；point-in-time 基本面已接入，歷史多來源事件由每日低速排程持續回補。</w:t>
       </w:r>
     </w:p>
     <w:p>
@@ -3424,6 +3478,33 @@
           <w:sz w:val="22"/>
         </w:rPr>
         <w:t>GitHub Actions 第 732 次已成功驗證：八檔共享模型、TSLA 專屬模型、快取精簡、自動暫存同步與推送均成功。後續若觸發 40 MB 門檻，應由資料健康檢查列出大型檔案並判斷排除或分批保存。</w:t>
+      </w:r>
+    </w:p>
+    <w:p>
+      <w:pPr>
+        <w:spacing w:before="200" w:after="120"/>
+      </w:pPr>
+      <w:r>
+        <w:rPr>
+          <w:rFonts w:ascii="Heiti TC" w:hAnsi="Heiti TC" w:eastAsia="Heiti TC" w:cs="Heiti TC"/>
+          <w:b w:val="0"/>
+          <w:sz w:val="26"/>
+        </w:rPr>
+        <w:t>2026-10-21｜歷史多來源事件回補與 KG 回測管線</w:t>
+      </w:r>
+    </w:p>
+    <w:p>
+      <w:pPr>
+        <w:pStyle w:val="ListBullet"/>
+        <w:spacing w:after="60" w:line="276" w:lineRule="auto"/>
+      </w:pPr>
+      <w:r>
+        <w:rPr>
+          <w:rFonts w:ascii="Heiti TC" w:hAnsi="Heiti TC" w:eastAsia="Heiti TC" w:cs="Heiti TC"/>
+          <w:b w:val="0"/>
+          <w:sz w:val="22"/>
+        </w:rPr>
+        <w:t>每日排程每次最多回補 8 個平衡市場狀態樣本；Google News RSS 為主要歷史索引，GDELT 僅作備援，來源不足時保留缺口。</w:t>
       </w:r>
     </w:p>
     <w:p>
@@ -5462,7 +5543,7 @@
                 <w:b w:val="0"/>
                 <w:sz w:val="20"/>
               </w:rPr>
-              <w:t>待執行</w:t>
+              <w:t>已執行</w:t>
             </w:r>
           </w:p>
         </w:tc>
@@ -5570,6 +5651,7 @@
                 <w:b w:val="0"/>
                 <w:sz w:val="20"/>
               </w:rPr>
+              <w:t>D-021</w:t>
             </w:r>
           </w:p>
         </w:tc>
@@ -6857,6 +6939,169 @@
                 <w:sz w:val="20"/>
               </w:rPr>
               <w:t>GitHub Actions、LSTM 快取、GitHub 發布與 Streamlit 部署</w:t>
+            </w:r>
+          </w:p>
+        </w:tc>
+        <w:tc>
+          <w:tcPr>
+            <w:tcW w:type="dxa" w:w="1040"/>
+          </w:tcPr>
+          <w:p>
+            <w:pPr>
+              <w:jc w:val="left"/>
+            </w:pPr>
+            <w:r>
+              <w:rPr>
+                <w:rFonts w:ascii="Heiti TC" w:hAnsi="Heiti TC" w:eastAsia="Heiti TC" w:cs="Heiti TC"/>
+                <w:b w:val="0"/>
+                <w:sz w:val="20"/>
+              </w:rPr>
+            </w:r>
+          </w:p>
+        </w:tc>
+      </w:tr>
+      <w:tr>
+        <w:tc>
+          <w:tcPr>
+            <w:tcW w:type="dxa" w:w="1040"/>
+          </w:tcPr>
+          <w:p>
+            <w:pPr>
+              <w:jc w:val="left"/>
+            </w:pPr>
+            <w:r>
+              <w:rPr>
+                <w:rFonts w:ascii="Heiti TC" w:hAnsi="Heiti TC" w:eastAsia="Heiti TC" w:cs="Heiti TC"/>
+                <w:b w:val="0"/>
+                <w:sz w:val="20"/>
+              </w:rPr>
+              <w:t>D-021</w:t>
+            </w:r>
+          </w:p>
+        </w:tc>
+        <w:tc>
+          <w:tcPr>
+            <w:tcW w:type="dxa" w:w="1040"/>
+          </w:tcPr>
+          <w:p>
+            <w:pPr>
+              <w:jc w:val="left"/>
+            </w:pPr>
+            <w:r>
+              <w:rPr>
+                <w:rFonts w:ascii="Heiti TC" w:hAnsi="Heiti TC" w:eastAsia="Heiti TC" w:cs="Heiti TC"/>
+                <w:b w:val="0"/>
+                <w:sz w:val="20"/>
+              </w:rPr>
+              <w:t>2026-10-21</w:t>
+            </w:r>
+          </w:p>
+        </w:tc>
+        <w:tc>
+          <w:tcPr>
+            <w:tcW w:type="dxa" w:w="1040"/>
+          </w:tcPr>
+          <w:p>
+            <w:pPr>
+              <w:jc w:val="left"/>
+            </w:pPr>
+            <w:r>
+              <w:rPr>
+                <w:rFonts w:ascii="Heiti TC" w:hAnsi="Heiti TC" w:eastAsia="Heiti TC" w:cs="Heiti TC"/>
+                <w:b w:val="0"/>
+                <w:sz w:val="20"/>
+              </w:rPr>
+              <w:t>已執行</w:t>
+            </w:r>
+          </w:p>
+        </w:tc>
+        <w:tc>
+          <w:tcPr>
+            <w:tcW w:type="dxa" w:w="1040"/>
+          </w:tcPr>
+          <w:p>
+            <w:pPr>
+              <w:jc w:val="left"/>
+            </w:pPr>
+            <w:r>
+              <w:rPr>
+                <w:rFonts w:ascii="Heiti TC" w:hAnsi="Heiti TC" w:eastAsia="Heiti TC" w:cs="Heiti TC"/>
+                <w:b w:val="0"/>
+                <w:sz w:val="20"/>
+              </w:rPr>
+              <w:t>回測</w:t>
+            </w:r>
+          </w:p>
+        </w:tc>
+        <w:tc>
+          <w:tcPr>
+            <w:tcW w:type="dxa" w:w="1040"/>
+          </w:tcPr>
+          <w:p>
+            <w:pPr>
+              <w:jc w:val="left"/>
+            </w:pPr>
+            <w:r>
+              <w:rPr>
+                <w:rFonts w:ascii="Heiti TC" w:hAnsi="Heiti TC" w:eastAsia="Heiti TC" w:cs="Heiti TC"/>
+                <w:b w:val="0"/>
+                <w:sz w:val="20"/>
+              </w:rPr>
+              <w:t>歷史多來源事件回補與 KG 回測管線</w:t>
+            </w:r>
+          </w:p>
+        </w:tc>
+        <w:tc>
+          <w:tcPr>
+            <w:tcW w:type="dxa" w:w="1040"/>
+          </w:tcPr>
+          <w:p>
+            <w:pPr>
+              <w:jc w:val="left"/>
+            </w:pPr>
+            <w:r>
+              <w:rPr>
+                <w:rFonts w:ascii="Heiti TC" w:hAnsi="Heiti TC" w:eastAsia="Heiti TC" w:cs="Heiti TC"/>
+                <w:b w:val="0"/>
+                <w:sz w:val="20"/>
+              </w:rPr>
+              <w:t>建立獨立的歷史事件證據層、每日低速回補排程與完整 KG 回測結果；只有同日期以前、相同核心事件且至少兩個獨立出版者的證據可進入回測。</w:t>
+            </w:r>
+          </w:p>
+        </w:tc>
+        <w:tc>
+          <w:tcPr>
+            <w:tcW w:type="dxa" w:w="1040"/>
+          </w:tcPr>
+          <w:p>
+            <w:pPr>
+              <w:jc w:val="left"/>
+            </w:pPr>
+            <w:r>
+              <w:rPr>
+                <w:rFonts w:ascii="Heiti TC" w:hAnsi="Heiti TC" w:eastAsia="Heiti TC" w:cs="Heiti TC"/>
+                <w:b w:val="0"/>
+                <w:sz w:val="20"/>
+              </w:rPr>
+              <w:t>補足 500 個分層歷史樣本的消息面缺口，同時避免未來資訊、同源轉載與單一市場狀態造成假準確率。</w:t>
+            </w:r>
+          </w:p>
+        </w:tc>
+        <w:tc>
+          <w:tcPr>
+            <w:tcW w:type="dxa" w:w="1040"/>
+          </w:tcPr>
+          <w:p>
+            <w:pPr>
+              <w:jc w:val="left"/>
+            </w:pPr>
+            <w:r>
+              <w:rPr>
+                <w:rFonts w:ascii="Heiti TC" w:hAnsi="Heiti TC" w:eastAsia="Heiti TC" w:cs="Heiti TC"/>
+                <w:b w:val="0"/>
+                <w:sz w:val="20"/>
+              </w:rPr>
+              <w:t>歷史新聞、KG 回測、資料治理、GitHub Actions、Streamlit 金融知識圖譜頁</w:t>
             </w:r>
           </w:p>
         </w:tc>
@@ -8215,6 +8460,80 @@
                 <w:sz w:val="20"/>
               </w:rPr>
               <w:t>避免大型特徵檔造成 GitHub 推送逾時、並行更新衝突、Streamlit 部署延遲與儲存庫持續膨脹。</w:t>
+            </w:r>
+          </w:p>
+        </w:tc>
+        <w:tc>
+          <w:tcPr>
+            <w:tcW w:type="dxa" w:w="2340"/>
+          </w:tcPr>
+          <w:p>
+            <w:pPr>
+              <w:jc w:val="left"/>
+            </w:pPr>
+            <w:r>
+              <w:rPr>
+                <w:rFonts w:ascii="Heiti TC" w:hAnsi="Heiti TC" w:eastAsia="Heiti TC" w:cs="Heiti TC"/>
+                <w:b w:val="0"/>
+                <w:sz w:val="20"/>
+              </w:rPr>
+              <w:t>Codex 已確認決策</w:t>
+            </w:r>
+          </w:p>
+        </w:tc>
+      </w:tr>
+      <w:tr>
+        <w:tc>
+          <w:tcPr>
+            <w:tcW w:type="dxa" w:w="2340"/>
+          </w:tcPr>
+          <w:p>
+            <w:pPr>
+              <w:jc w:val="left"/>
+            </w:pPr>
+            <w:r>
+              <w:rPr>
+                <w:rFonts w:ascii="Heiti TC" w:hAnsi="Heiti TC" w:eastAsia="Heiti TC" w:cs="Heiti TC"/>
+                <w:b w:val="0"/>
+                <w:sz w:val="20"/>
+              </w:rPr>
+              <w:t>2026-10-21</w:t>
+            </w:r>
+          </w:p>
+        </w:tc>
+        <w:tc>
+          <w:tcPr>
+            <w:tcW w:type="dxa" w:w="2340"/>
+          </w:tcPr>
+          <w:p>
+            <w:pPr>
+              <w:jc w:val="left"/>
+            </w:pPr>
+            <w:r>
+              <w:rPr>
+                <w:rFonts w:ascii="Heiti TC" w:hAnsi="Heiti TC" w:eastAsia="Heiti TC" w:cs="Heiti TC"/>
+                <w:b w:val="0"/>
+                <w:sz w:val="20"/>
+              </w:rPr>
+              <w:t>歷史多來源事件回補與 KG 回測管線</w:t>
+            </w:r>
+          </w:p>
+        </w:tc>
+        <w:tc>
+          <w:tcPr>
+            <w:tcW w:type="dxa" w:w="2340"/>
+          </w:tcPr>
+          <w:p>
+            <w:pPr>
+              <w:jc w:val="left"/>
+            </w:pPr>
+            <w:r>
+              <w:rPr>
+                <w:rFonts w:ascii="Heiti TC" w:hAnsi="Heiti TC" w:eastAsia="Heiti TC" w:cs="Heiti TC"/>
+                <w:b w:val="0"/>
+                <w:sz w:val="20"/>
+              </w:rPr>
+              <w:t>補足 500 個分層歷史樣本的消息面缺口，同時避免未來資訊、同源轉載與單一市場狀態造成假準確率。</w:t>
             </w:r>
           </w:p>
         </w:tc>

</xml_diff>

<commit_message>
Record KG factor tuning readiness criteria
</commit_message>
<xml_diff>
--- a/data/觀察版資料/13_專案記憶/專案記憶與討論摘要.docx
+++ b/data/觀察版資料/13_專案記憶/專案記憶與討論摘要.docx
@@ -26,7 +26,7 @@
           <w:b w:val="0"/>
           <w:sz w:val="20"/>
         </w:rPr>
-        <w:t>產生時間：2026-10-21 12:12 UTC｜來源：專案記憶資料夾</w:t>
+        <w:t>產生時間：2026-10-21 12:15 UTC｜來源：專案記憶資料夾</w:t>
       </w:r>
     </w:p>
     <w:p>
@@ -156,7 +156,7 @@
                 <w:b w:val="0"/>
                 <w:sz w:val="20"/>
               </w:rPr>
-              <w:t>21</w:t>
+              <w:t>22</w:t>
             </w:r>
           </w:p>
         </w:tc>
@@ -268,7 +268,7 @@
                 <w:b w:val="0"/>
                 <w:sz w:val="20"/>
               </w:rPr>
-              <w:t>0</w:t>
+              <w:t>1</w:t>
             </w:r>
           </w:p>
         </w:tc>
@@ -499,7 +499,7 @@
                 <w:b w:val="0"/>
                 <w:sz w:val="20"/>
               </w:rPr>
-              <w:t>歷史多來源事件回補與 KG 回測管線</w:t>
+              <w:t>KG 因子有效性與模型權重調整啟動門檻</w:t>
             </w:r>
           </w:p>
         </w:tc>
@@ -517,7 +517,7 @@
                 <w:b w:val="0"/>
                 <w:sz w:val="20"/>
               </w:rPr>
-              <w:t>已執行</w:t>
+              <w:t>待執行</w:t>
             </w:r>
           </w:p>
         </w:tc>
@@ -573,7 +573,7 @@
                 <w:b w:val="0"/>
                 <w:sz w:val="20"/>
               </w:rPr>
-              <w:t>模型快取精簡發布與 40 MB 安全門檻</w:t>
+              <w:t>歷史多來源事件回補與 KG 回測管線</w:t>
             </w:r>
           </w:p>
         </w:tc>
@@ -647,7 +647,7 @@
                 <w:b w:val="0"/>
                 <w:sz w:val="20"/>
               </w:rPr>
-              <w:t>八檔共享模型與 TSLA 專屬模型</w:t>
+              <w:t>模型快取精簡發布與 40 MB 安全門檻</w:t>
             </w:r>
           </w:p>
         </w:tc>
@@ -703,7 +703,7 @@
                 <w:b w:val="0"/>
                 <w:sz w:val="20"/>
               </w:rPr>
-              <w:t>2026-08-02</w:t>
+              <w:t>2026-10-21</w:t>
             </w:r>
           </w:p>
         </w:tc>
@@ -721,7 +721,7 @@
                 <w:b w:val="0"/>
                 <w:sz w:val="20"/>
               </w:rPr>
-              <w:t>AI 摘要改為個人研究優先模式</w:t>
+              <w:t>八檔共享模型與 TSLA 專屬模型</w:t>
             </w:r>
           </w:p>
         </w:tc>
@@ -777,7 +777,7 @@
                 <w:b w:val="0"/>
                 <w:sz w:val="20"/>
               </w:rPr>
-              <w:t>2026-07-26</w:t>
+              <w:t>2026-08-02</w:t>
             </w:r>
           </w:p>
         </w:tc>
@@ -795,7 +795,7 @@
                 <w:b w:val="0"/>
                 <w:sz w:val="20"/>
               </w:rPr>
-              <w:t>LSTM 基準比較與機率校準</w:t>
+              <w:t>AI 摘要改為個人研究優先模式</w:t>
             </w:r>
           </w:p>
         </w:tc>
@@ -869,7 +869,7 @@
                 <w:b w:val="0"/>
                 <w:sz w:val="20"/>
               </w:rPr>
-              <w:t>歷史多來源事件回補與 KG 回測管線</w:t>
+              <w:t>KG 因子有效性與模型權重調整啟動門檻</w:t>
             </w:r>
           </w:p>
         </w:tc>
@@ -943,7 +943,7 @@
                 <w:b w:val="0"/>
                 <w:sz w:val="20"/>
               </w:rPr>
-              <w:t>模型快取精簡發布與 40 MB 安全門檻</w:t>
+              <w:t>歷史多來源事件回補與 KG 回測管線</w:t>
             </w:r>
           </w:p>
         </w:tc>
@@ -1017,7 +1017,7 @@
                 <w:b w:val="0"/>
                 <w:sz w:val="20"/>
               </w:rPr>
-              <w:t>八檔共享模型與 TSLA 專屬模型</w:t>
+              <w:t>模型快取精簡發布與 40 MB 安全門檻</w:t>
             </w:r>
           </w:p>
         </w:tc>
@@ -1073,7 +1073,7 @@
                 <w:b w:val="0"/>
                 <w:sz w:val="20"/>
               </w:rPr>
-              <w:t>2026-08-02</w:t>
+              <w:t>2026-10-21</w:t>
             </w:r>
           </w:p>
         </w:tc>
@@ -1091,7 +1091,7 @@
                 <w:b w:val="0"/>
                 <w:sz w:val="20"/>
               </w:rPr>
-              <w:t>AI 摘要改為個人研究優先模式</w:t>
+              <w:t>八檔共享模型與 TSLA 專屬模型</w:t>
             </w:r>
           </w:p>
         </w:tc>
@@ -1147,7 +1147,7 @@
                 <w:b w:val="0"/>
                 <w:sz w:val="20"/>
               </w:rPr>
-              <w:t>2026-07-26</w:t>
+              <w:t>2026-08-02</w:t>
             </w:r>
           </w:p>
         </w:tc>
@@ -1165,7 +1165,7 @@
                 <w:b w:val="0"/>
                 <w:sz w:val="20"/>
               </w:rPr>
-              <w:t>LSTM 基準比較與機率校準</w:t>
+              <w:t>AI 摘要改為個人研究優先模式</w:t>
             </w:r>
           </w:p>
         </w:tc>
@@ -1970,6 +1970,33 @@
     </w:p>
     <w:p>
       <w:pPr>
+        <w:spacing w:before="200" w:after="120"/>
+      </w:pPr>
+      <w:r>
+        <w:rPr>
+          <w:rFonts w:ascii="Heiti TC" w:hAnsi="Heiti TC" w:eastAsia="Heiti TC" w:cs="Heiti TC"/>
+          <w:b w:val="0"/>
+          <w:sz w:val="26"/>
+        </w:rPr>
+        <w:t>2026-10-21｜KG 因子有效性與模型權重調整啟動門檻</w:t>
+      </w:r>
+    </w:p>
+    <w:p>
+      <w:pPr>
+        <w:pStyle w:val="ListBullet"/>
+        <w:spacing w:after="60" w:line="276" w:lineRule="auto"/>
+      </w:pPr>
+      <w:r>
+        <w:rPr>
+          <w:rFonts w:ascii="Heiti TC" w:hAnsi="Heiti TC" w:eastAsia="Heiti TC" w:cs="Heiti TC"/>
+          <w:b w:val="0"/>
+          <w:sz w:val="22"/>
+        </w:rPr>
+        <w:t>KG 權重不得只依總體命中率調整。必須分市場環境檢查樣本數、方向一致率、後續報酬、最大回撤、基準比較與信心校準；未達樣本門檻時維持資料累積，不更動正式權重。</w:t>
+      </w:r>
+    </w:p>
+    <w:p>
+      <w:pPr>
         <w:spacing w:before="280" w:after="120"/>
       </w:pPr>
       <w:r>
@@ -2911,6 +2938,33 @@
     </w:p>
     <w:p>
       <w:pPr>
+        <w:spacing w:before="200" w:after="120"/>
+      </w:pPr>
+      <w:r>
+        <w:rPr>
+          <w:rFonts w:ascii="Heiti TC" w:hAnsi="Heiti TC" w:eastAsia="Heiti TC" w:cs="Heiti TC"/>
+          <w:b w:val="0"/>
+          <w:sz w:val="26"/>
+        </w:rPr>
+        <w:t>2026-10-21｜KG 因子有效性與模型權重調整啟動門檻</w:t>
+      </w:r>
+    </w:p>
+    <w:p>
+      <w:pPr>
+        <w:pStyle w:val="ListBullet"/>
+        <w:spacing w:after="60" w:line="276" w:lineRule="auto"/>
+      </w:pPr>
+      <w:r>
+        <w:rPr>
+          <w:rFonts w:ascii="Heiti TC" w:hAnsi="Heiti TC" w:eastAsia="Heiti TC" w:cs="Heiti TC"/>
+          <w:b w:val="0"/>
+          <w:sz w:val="22"/>
+        </w:rPr>
+        <w:t>使用者要求將『等不同市場環境都有足夠樣本後，再做因子有效性與模型權重調整』設為待辦。確立兩階段門檻：30 筆/環境做診斷，50 筆/環境且總數 250 筆後才允許提出權重調整。</w:t>
+      </w:r>
+    </w:p>
+    <w:p>
+      <w:pPr>
         <w:spacing w:before="280" w:after="120"/>
       </w:pPr>
       <w:r>
@@ -3505,6 +3559,33 @@
           <w:sz w:val="22"/>
         </w:rPr>
         <w:t>每日排程每次最多回補 8 個平衡市場狀態樣本；Google News RSS 為主要歷史索引，GDELT 僅作備援，來源不足時保留缺口。</w:t>
+      </w:r>
+    </w:p>
+    <w:p>
+      <w:pPr>
+        <w:spacing w:before="200" w:after="120"/>
+      </w:pPr>
+      <w:r>
+        <w:rPr>
+          <w:rFonts w:ascii="Heiti TC" w:hAnsi="Heiti TC" w:eastAsia="Heiti TC" w:cs="Heiti TC"/>
+          <w:b w:val="0"/>
+          <w:sz w:val="26"/>
+        </w:rPr>
+        <w:t>2026-10-21｜KG 因子有效性與模型權重調整啟動門檻</w:t>
+      </w:r>
+    </w:p>
+    <w:p>
+      <w:pPr>
+        <w:pStyle w:val="ListBullet"/>
+        <w:spacing w:after="60" w:line="276" w:lineRule="auto"/>
+      </w:pPr>
+      <w:r>
+        <w:rPr>
+          <w:rFonts w:ascii="Heiti TC" w:hAnsi="Heiti TC" w:eastAsia="Heiti TC" w:cs="Heiti TC"/>
+          <w:b w:val="0"/>
+          <w:sz w:val="22"/>
+        </w:rPr>
+        <w:t>待執行：每日歷史回補持續運行。達到每種環境 30 個合格樣本時啟動初步因子報告；達到每種環境 50 個且總數至少 250 筆時，才執行權重候選調整與獨立驗證。</w:t>
       </w:r>
     </w:p>
     <w:p>
@@ -7123,6 +7204,169 @@
           </w:p>
         </w:tc>
       </w:tr>
+      <w:tr>
+        <w:tc>
+          <w:tcPr>
+            <w:tcW w:type="dxa" w:w="1040"/>
+          </w:tcPr>
+          <w:p>
+            <w:pPr>
+              <w:jc w:val="left"/>
+            </w:pPr>
+            <w:r>
+              <w:rPr>
+                <w:rFonts w:ascii="Heiti TC" w:hAnsi="Heiti TC" w:eastAsia="Heiti TC" w:cs="Heiti TC"/>
+                <w:b w:val="0"/>
+                <w:sz w:val="20"/>
+              </w:rPr>
+              <w:t>D-022</w:t>
+            </w:r>
+          </w:p>
+        </w:tc>
+        <w:tc>
+          <w:tcPr>
+            <w:tcW w:type="dxa" w:w="1040"/>
+          </w:tcPr>
+          <w:p>
+            <w:pPr>
+              <w:jc w:val="left"/>
+            </w:pPr>
+            <w:r>
+              <w:rPr>
+                <w:rFonts w:ascii="Heiti TC" w:hAnsi="Heiti TC" w:eastAsia="Heiti TC" w:cs="Heiti TC"/>
+                <w:b w:val="0"/>
+                <w:sz w:val="20"/>
+              </w:rPr>
+              <w:t>2026-10-21</w:t>
+            </w:r>
+          </w:p>
+        </w:tc>
+        <w:tc>
+          <w:tcPr>
+            <w:tcW w:type="dxa" w:w="1040"/>
+          </w:tcPr>
+          <w:p>
+            <w:pPr>
+              <w:jc w:val="left"/>
+            </w:pPr>
+            <w:r>
+              <w:rPr>
+                <w:rFonts w:ascii="Heiti TC" w:hAnsi="Heiti TC" w:eastAsia="Heiti TC" w:cs="Heiti TC"/>
+                <w:b w:val="0"/>
+                <w:sz w:val="20"/>
+              </w:rPr>
+              <w:t>待執行</w:t>
+            </w:r>
+          </w:p>
+        </w:tc>
+        <w:tc>
+          <w:tcPr>
+            <w:tcW w:type="dxa" w:w="1040"/>
+          </w:tcPr>
+          <w:p>
+            <w:pPr>
+              <w:jc w:val="left"/>
+            </w:pPr>
+            <w:r>
+              <w:rPr>
+                <w:rFonts w:ascii="Heiti TC" w:hAnsi="Heiti TC" w:eastAsia="Heiti TC" w:cs="Heiti TC"/>
+                <w:b w:val="0"/>
+                <w:sz w:val="20"/>
+              </w:rPr>
+              <w:t>模型驗證</w:t>
+            </w:r>
+          </w:p>
+        </w:tc>
+        <w:tc>
+          <w:tcPr>
+            <w:tcW w:type="dxa" w:w="1040"/>
+          </w:tcPr>
+          <w:p>
+            <w:pPr>
+              <w:jc w:val="left"/>
+            </w:pPr>
+            <w:r>
+              <w:rPr>
+                <w:rFonts w:ascii="Heiti TC" w:hAnsi="Heiti TC" w:eastAsia="Heiti TC" w:cs="Heiti TC"/>
+                <w:b w:val="0"/>
+                <w:sz w:val="20"/>
+              </w:rPr>
+              <w:t>KG 因子有效性與模型權重調整啟動門檻</w:t>
+            </w:r>
+          </w:p>
+        </w:tc>
+        <w:tc>
+          <w:tcPr>
+            <w:tcW w:type="dxa" w:w="1040"/>
+          </w:tcPr>
+          <w:p>
+            <w:pPr>
+              <w:jc w:val="left"/>
+            </w:pPr>
+            <w:r>
+              <w:rPr>
+                <w:rFonts w:ascii="Heiti TC" w:hAnsi="Heiti TC" w:eastAsia="Heiti TC" w:cs="Heiti TC"/>
+                <w:b w:val="0"/>
+                <w:sz w:val="20"/>
+              </w:rPr>
+              <w:t>持續回補不同市場環境的歷史多來源事件；每種市場環境至少 30 個合格 KG 樣本且總數至少 150 筆時先產生初步因子有效性報告。每種環境至少 50 個且總數至少 250 筆後，才進行模型權重候選調整；新權重必須通過獨立保留期間或 walk-forward 驗證後才能取代正式版本。</w:t>
+            </w:r>
+          </w:p>
+        </w:tc>
+        <w:tc>
+          <w:tcPr>
+            <w:tcW w:type="dxa" w:w="1040"/>
+          </w:tcPr>
+          <w:p>
+            <w:pPr>
+              <w:jc w:val="left"/>
+            </w:pPr>
+            <w:r>
+              <w:rPr>
+                <w:rFonts w:ascii="Heiti TC" w:hAnsi="Heiti TC" w:eastAsia="Heiti TC" w:cs="Heiti TC"/>
+                <w:b w:val="0"/>
+                <w:sz w:val="20"/>
+              </w:rPr>
+              <w:t>目前只有 29 個完整 KG 回測樣本，直接調權重容易過度擬合；以分市場環境門檻與獨立驗證避免樣本集中於單一多空週期。</w:t>
+            </w:r>
+          </w:p>
+        </w:tc>
+        <w:tc>
+          <w:tcPr>
+            <w:tcW w:type="dxa" w:w="1040"/>
+          </w:tcPr>
+          <w:p>
+            <w:pPr>
+              <w:jc w:val="left"/>
+            </w:pPr>
+            <w:r>
+              <w:rPr>
+                <w:rFonts w:ascii="Heiti TC" w:hAnsi="Heiti TC" w:eastAsia="Heiti TC" w:cs="Heiti TC"/>
+                <w:b w:val="0"/>
+                <w:sz w:val="20"/>
+              </w:rPr>
+              <w:t>KG 歷史回測、因子有效性報告、模型權重版本、Streamlit 研究成熟度</w:t>
+            </w:r>
+          </w:p>
+        </w:tc>
+        <w:tc>
+          <w:tcPr>
+            <w:tcW w:type="dxa" w:w="1040"/>
+          </w:tcPr>
+          <w:p>
+            <w:pPr>
+              <w:jc w:val="left"/>
+            </w:pPr>
+            <w:r>
+              <w:rPr>
+                <w:rFonts w:ascii="Heiti TC" w:hAnsi="Heiti TC" w:eastAsia="Heiti TC" w:cs="Heiti TC"/>
+                <w:b w:val="0"/>
+                <w:sz w:val="20"/>
+              </w:rPr>
+            </w:r>
+          </w:p>
+        </w:tc>
+      </w:tr>
     </w:tbl>
     <w:p>
       <w:pPr>
@@ -8534,6 +8778,80 @@
                 <w:sz w:val="20"/>
               </w:rPr>
               <w:t>補足 500 個分層歷史樣本的消息面缺口，同時避免未來資訊、同源轉載與單一市場狀態造成假準確率。</w:t>
+            </w:r>
+          </w:p>
+        </w:tc>
+        <w:tc>
+          <w:tcPr>
+            <w:tcW w:type="dxa" w:w="2340"/>
+          </w:tcPr>
+          <w:p>
+            <w:pPr>
+              <w:jc w:val="left"/>
+            </w:pPr>
+            <w:r>
+              <w:rPr>
+                <w:rFonts w:ascii="Heiti TC" w:hAnsi="Heiti TC" w:eastAsia="Heiti TC" w:cs="Heiti TC"/>
+                <w:b w:val="0"/>
+                <w:sz w:val="20"/>
+              </w:rPr>
+              <w:t>Codex 已確認決策</w:t>
+            </w:r>
+          </w:p>
+        </w:tc>
+      </w:tr>
+      <w:tr>
+        <w:tc>
+          <w:tcPr>
+            <w:tcW w:type="dxa" w:w="2340"/>
+          </w:tcPr>
+          <w:p>
+            <w:pPr>
+              <w:jc w:val="left"/>
+            </w:pPr>
+            <w:r>
+              <w:rPr>
+                <w:rFonts w:ascii="Heiti TC" w:hAnsi="Heiti TC" w:eastAsia="Heiti TC" w:cs="Heiti TC"/>
+                <w:b w:val="0"/>
+                <w:sz w:val="20"/>
+              </w:rPr>
+              <w:t>2026-10-21</w:t>
+            </w:r>
+          </w:p>
+        </w:tc>
+        <w:tc>
+          <w:tcPr>
+            <w:tcW w:type="dxa" w:w="2340"/>
+          </w:tcPr>
+          <w:p>
+            <w:pPr>
+              <w:jc w:val="left"/>
+            </w:pPr>
+            <w:r>
+              <w:rPr>
+                <w:rFonts w:ascii="Heiti TC" w:hAnsi="Heiti TC" w:eastAsia="Heiti TC" w:cs="Heiti TC"/>
+                <w:b w:val="0"/>
+                <w:sz w:val="20"/>
+              </w:rPr>
+              <w:t>KG 因子有效性與模型權重調整啟動門檻</w:t>
+            </w:r>
+          </w:p>
+        </w:tc>
+        <w:tc>
+          <w:tcPr>
+            <w:tcW w:type="dxa" w:w="2340"/>
+          </w:tcPr>
+          <w:p>
+            <w:pPr>
+              <w:jc w:val="left"/>
+            </w:pPr>
+            <w:r>
+              <w:rPr>
+                <w:rFonts w:ascii="Heiti TC" w:hAnsi="Heiti TC" w:eastAsia="Heiti TC" w:cs="Heiti TC"/>
+                <w:b w:val="0"/>
+                <w:sz w:val="20"/>
+              </w:rPr>
+              <w:t>目前只有 29 個完整 KG 回測樣本，直接調權重容易過度擬合；以分市場環境門檻與獨立驗證避免樣本集中於單一多空週期。</w:t>
             </w:r>
           </w:p>
         </w:tc>

</xml_diff>

<commit_message>
Add KG backfill quality controls
</commit_message>
<xml_diff>
--- a/data/觀察版資料/13_專案記憶/專案記憶與討論摘要.docx
+++ b/data/觀察版資料/13_專案記憶/專案記憶與討論摘要.docx
@@ -26,7 +26,7 @@
           <w:b w:val="0"/>
           <w:sz w:val="20"/>
         </w:rPr>
-        <w:t>產生時間：2026-10-21 12:15 UTC｜來源：專案記憶資料夾</w:t>
+        <w:t>產生時間：2026-10-21 12:19 UTC｜來源：專案記憶資料夾</w:t>
       </w:r>
     </w:p>
     <w:p>
@@ -156,7 +156,7 @@
                 <w:b w:val="0"/>
                 <w:sz w:val="20"/>
               </w:rPr>
-              <w:t>22</w:t>
+              <w:t>23</w:t>
             </w:r>
           </w:p>
         </w:tc>
@@ -212,7 +212,7 @@
                 <w:b w:val="0"/>
                 <w:sz w:val="20"/>
               </w:rPr>
-              <w:t>21</w:t>
+              <w:t>22</w:t>
             </w:r>
           </w:p>
         </w:tc>
@@ -499,7 +499,7 @@
                 <w:b w:val="0"/>
                 <w:sz w:val="20"/>
               </w:rPr>
-              <w:t>KG 因子有效性與模型權重調整啟動門檻</w:t>
+              <w:t>KG 歷史回補品質控制台與官方來源優先</w:t>
             </w:r>
           </w:p>
         </w:tc>
@@ -517,7 +517,7 @@
                 <w:b w:val="0"/>
                 <w:sz w:val="20"/>
               </w:rPr>
-              <w:t>待執行</w:t>
+              <w:t>已執行</w:t>
             </w:r>
           </w:p>
         </w:tc>
@@ -573,7 +573,7 @@
                 <w:b w:val="0"/>
                 <w:sz w:val="20"/>
               </w:rPr>
-              <w:t>歷史多來源事件回補與 KG 回測管線</w:t>
+              <w:t>KG 因子有效性與模型權重調整啟動門檻</w:t>
             </w:r>
           </w:p>
         </w:tc>
@@ -591,7 +591,7 @@
                 <w:b w:val="0"/>
                 <w:sz w:val="20"/>
               </w:rPr>
-              <w:t>已執行</w:t>
+              <w:t>待執行</w:t>
             </w:r>
           </w:p>
         </w:tc>
@@ -647,7 +647,7 @@
                 <w:b w:val="0"/>
                 <w:sz w:val="20"/>
               </w:rPr>
-              <w:t>模型快取精簡發布與 40 MB 安全門檻</w:t>
+              <w:t>歷史多來源事件回補與 KG 回測管線</w:t>
             </w:r>
           </w:p>
         </w:tc>
@@ -721,7 +721,7 @@
                 <w:b w:val="0"/>
                 <w:sz w:val="20"/>
               </w:rPr>
-              <w:t>八檔共享模型與 TSLA 專屬模型</w:t>
+              <w:t>模型快取精簡發布與 40 MB 安全門檻</w:t>
             </w:r>
           </w:p>
         </w:tc>
@@ -777,7 +777,7 @@
                 <w:b w:val="0"/>
                 <w:sz w:val="20"/>
               </w:rPr>
-              <w:t>2026-08-02</w:t>
+              <w:t>2026-10-21</w:t>
             </w:r>
           </w:p>
         </w:tc>
@@ -795,7 +795,7 @@
                 <w:b w:val="0"/>
                 <w:sz w:val="20"/>
               </w:rPr>
-              <w:t>AI 摘要改為個人研究優先模式</w:t>
+              <w:t>八檔共享模型與 TSLA 專屬模型</w:t>
             </w:r>
           </w:p>
         </w:tc>
@@ -869,7 +869,7 @@
                 <w:b w:val="0"/>
                 <w:sz w:val="20"/>
               </w:rPr>
-              <w:t>KG 因子有效性與模型權重調整啟動門檻</w:t>
+              <w:t>KG 歷史回補品質控制台與官方來源優先</w:t>
             </w:r>
           </w:p>
         </w:tc>
@@ -943,7 +943,7 @@
                 <w:b w:val="0"/>
                 <w:sz w:val="20"/>
               </w:rPr>
-              <w:t>歷史多來源事件回補與 KG 回測管線</w:t>
+              <w:t>KG 因子有效性與模型權重調整啟動門檻</w:t>
             </w:r>
           </w:p>
         </w:tc>
@@ -1017,7 +1017,7 @@
                 <w:b w:val="0"/>
                 <w:sz w:val="20"/>
               </w:rPr>
-              <w:t>模型快取精簡發布與 40 MB 安全門檻</w:t>
+              <w:t>歷史多來源事件回補與 KG 回測管線</w:t>
             </w:r>
           </w:p>
         </w:tc>
@@ -1091,7 +1091,7 @@
                 <w:b w:val="0"/>
                 <w:sz w:val="20"/>
               </w:rPr>
-              <w:t>八檔共享模型與 TSLA 專屬模型</w:t>
+              <w:t>模型快取精簡發布與 40 MB 安全門檻</w:t>
             </w:r>
           </w:p>
         </w:tc>
@@ -1147,7 +1147,7 @@
                 <w:b w:val="0"/>
                 <w:sz w:val="20"/>
               </w:rPr>
-              <w:t>2026-08-02</w:t>
+              <w:t>2026-10-21</w:t>
             </w:r>
           </w:p>
         </w:tc>
@@ -1165,7 +1165,7 @@
                 <w:b w:val="0"/>
                 <w:sz w:val="20"/>
               </w:rPr>
-              <w:t>AI 摘要改為個人研究優先模式</w:t>
+              <w:t>八檔共享模型與 TSLA 專屬模型</w:t>
             </w:r>
           </w:p>
         </w:tc>
@@ -1997,6 +1997,33 @@
     </w:p>
     <w:p>
       <w:pPr>
+        <w:spacing w:before="200" w:after="120"/>
+      </w:pPr>
+      <w:r>
+        <w:rPr>
+          <w:rFonts w:ascii="Heiti TC" w:hAnsi="Heiti TC" w:eastAsia="Heiti TC" w:cs="Heiti TC"/>
+          <w:b w:val="0"/>
+          <w:sz w:val="26"/>
+        </w:rPr>
+        <w:t>2026-10-21｜KG 歷史回補品質控制台與官方來源優先</w:t>
+      </w:r>
+    </w:p>
+    <w:p>
+      <w:pPr>
+        <w:pStyle w:val="ListBullet"/>
+        <w:spacing w:after="60" w:line="276" w:lineRule="auto"/>
+      </w:pPr>
+      <w:r>
+        <w:rPr>
+          <w:rFonts w:ascii="Heiti TC" w:hAnsi="Heiti TC" w:eastAsia="Heiti TC" w:cs="Heiti TC"/>
+          <w:b w:val="0"/>
+          <w:sz w:val="22"/>
+        </w:rPr>
+        <w:t>歷史 KG 資料必須持續檢查 point-in-time、跨來源確認、官方來源占比、重複事件與來源集中度。未達五種市場環境門檻時不得提前調整正式權重。</w:t>
+      </w:r>
+    </w:p>
+    <w:p>
+      <w:pPr>
         <w:spacing w:before="280" w:after="120"/>
       </w:pPr>
       <w:r>
@@ -2965,6 +2992,33 @@
     </w:p>
     <w:p>
       <w:pPr>
+        <w:spacing w:before="200" w:after="120"/>
+      </w:pPr>
+      <w:r>
+        <w:rPr>
+          <w:rFonts w:ascii="Heiti TC" w:hAnsi="Heiti TC" w:eastAsia="Heiti TC" w:cs="Heiti TC"/>
+          <w:b w:val="0"/>
+          <w:sz w:val="26"/>
+        </w:rPr>
+        <w:t>2026-10-21｜KG 歷史回補品質控制台與官方來源優先</w:t>
+      </w:r>
+    </w:p>
+    <w:p>
+      <w:pPr>
+        <w:pStyle w:val="ListBullet"/>
+        <w:spacing w:after="60" w:line="276" w:lineRule="auto"/>
+      </w:pPr>
+      <w:r>
+        <w:rPr>
+          <w:rFonts w:ascii="Heiti TC" w:hAnsi="Heiti TC" w:eastAsia="Heiti TC" w:cs="Heiti TC"/>
+          <w:b w:val="0"/>
+          <w:sz w:val="22"/>
+        </w:rPr>
+        <w:t>使用者確認執行六項 KG 品質監控。品質控制台會區分候選與合格樣本，顯示 30/50 門檻；缺少新聞、基本面與市場反應分開呈現。</w:t>
+      </w:r>
+    </w:p>
+    <w:p>
+      <w:pPr>
         <w:spacing w:before="280" w:after="120"/>
       </w:pPr>
       <w:r>
@@ -3586,6 +3640,33 @@
           <w:sz w:val="22"/>
         </w:rPr>
         <w:t>待執行：每日歷史回補持續運行。達到每種環境 30 個合格樣本時啟動初步因子報告；達到每種環境 50 個且總數至少 250 筆時，才執行權重候選調整與獨立驗證。</w:t>
+      </w:r>
+    </w:p>
+    <w:p>
+      <w:pPr>
+        <w:spacing w:before="200" w:after="120"/>
+      </w:pPr>
+      <w:r>
+        <w:rPr>
+          <w:rFonts w:ascii="Heiti TC" w:hAnsi="Heiti TC" w:eastAsia="Heiti TC" w:cs="Heiti TC"/>
+          <w:b w:val="0"/>
+          <w:sz w:val="26"/>
+        </w:rPr>
+        <w:t>2026-10-21｜KG 歷史回補品質控制台與官方來源優先</w:t>
+      </w:r>
+    </w:p>
+    <w:p>
+      <w:pPr>
+        <w:pStyle w:val="ListBullet"/>
+        <w:spacing w:after="60" w:line="276" w:lineRule="auto"/>
+      </w:pPr>
+      <w:r>
+        <w:rPr>
+          <w:rFonts w:ascii="Heiti TC" w:hAnsi="Heiti TC" w:eastAsia="Heiti TC" w:cs="Heiti TC"/>
+          <w:b w:val="0"/>
+          <w:sz w:val="22"/>
+        </w:rPr>
+        <w:t>已執行：KG 品質控制台、官方來源優先搜尋與寫入層去重。首次實測新增 73 筆證據，完整 KG 樣本增至 30，未來洩漏 0、重複事件 0。</w:t>
       </w:r>
     </w:p>
     <w:p>
@@ -7367,6 +7448,169 @@
           </w:p>
         </w:tc>
       </w:tr>
+      <w:tr>
+        <w:tc>
+          <w:tcPr>
+            <w:tcW w:type="dxa" w:w="1040"/>
+          </w:tcPr>
+          <w:p>
+            <w:pPr>
+              <w:jc w:val="left"/>
+            </w:pPr>
+            <w:r>
+              <w:rPr>
+                <w:rFonts w:ascii="Heiti TC" w:hAnsi="Heiti TC" w:eastAsia="Heiti TC" w:cs="Heiti TC"/>
+                <w:b w:val="0"/>
+                <w:sz w:val="20"/>
+              </w:rPr>
+              <w:t>D-023</w:t>
+            </w:r>
+          </w:p>
+        </w:tc>
+        <w:tc>
+          <w:tcPr>
+            <w:tcW w:type="dxa" w:w="1040"/>
+          </w:tcPr>
+          <w:p>
+            <w:pPr>
+              <w:jc w:val="left"/>
+            </w:pPr>
+            <w:r>
+              <w:rPr>
+                <w:rFonts w:ascii="Heiti TC" w:hAnsi="Heiti TC" w:eastAsia="Heiti TC" w:cs="Heiti TC"/>
+                <w:b w:val="0"/>
+                <w:sz w:val="20"/>
+              </w:rPr>
+              <w:t>2026-10-21</w:t>
+            </w:r>
+          </w:p>
+        </w:tc>
+        <w:tc>
+          <w:tcPr>
+            <w:tcW w:type="dxa" w:w="1040"/>
+          </w:tcPr>
+          <w:p>
+            <w:pPr>
+              <w:jc w:val="left"/>
+            </w:pPr>
+            <w:r>
+              <w:rPr>
+                <w:rFonts w:ascii="Heiti TC" w:hAnsi="Heiti TC" w:eastAsia="Heiti TC" w:cs="Heiti TC"/>
+                <w:b w:val="0"/>
+                <w:sz w:val="20"/>
+              </w:rPr>
+              <w:t>已執行</w:t>
+            </w:r>
+          </w:p>
+        </w:tc>
+        <w:tc>
+          <w:tcPr>
+            <w:tcW w:type="dxa" w:w="1040"/>
+          </w:tcPr>
+          <w:p>
+            <w:pPr>
+              <w:jc w:val="left"/>
+            </w:pPr>
+            <w:r>
+              <w:rPr>
+                <w:rFonts w:ascii="Heiti TC" w:hAnsi="Heiti TC" w:eastAsia="Heiti TC" w:cs="Heiti TC"/>
+                <w:b w:val="0"/>
+                <w:sz w:val="20"/>
+              </w:rPr>
+              <w:t>資料治理</w:t>
+            </w:r>
+          </w:p>
+        </w:tc>
+        <w:tc>
+          <w:tcPr>
+            <w:tcW w:type="dxa" w:w="1040"/>
+          </w:tcPr>
+          <w:p>
+            <w:pPr>
+              <w:jc w:val="left"/>
+            </w:pPr>
+            <w:r>
+              <w:rPr>
+                <w:rFonts w:ascii="Heiti TC" w:hAnsi="Heiti TC" w:eastAsia="Heiti TC" w:cs="Heiti TC"/>
+                <w:b w:val="0"/>
+                <w:sz w:val="20"/>
+              </w:rPr>
+              <w:t>KG 歷史回補品質控制台與官方來源優先</w:t>
+            </w:r>
+          </w:p>
+        </w:tc>
+        <w:tc>
+          <w:tcPr>
+            <w:tcW w:type="dxa" w:w="1040"/>
+          </w:tcPr>
+          <w:p>
+            <w:pPr>
+              <w:jc w:val="left"/>
+            </w:pPr>
+            <w:r>
+              <w:rPr>
+                <w:rFonts w:ascii="Heiti TC" w:hAnsi="Heiti TC" w:eastAsia="Heiti TC" w:cs="Heiti TC"/>
+                <w:b w:val="0"/>
+                <w:sz w:val="20"/>
+              </w:rPr>
+              <w:t>KG 歷史回補新增五種市場環境進度、來源品質、缺口原因、未來洩漏、重複事件與單一媒體集中檢查；官方資料搜尋優先 SEC、Fed、BLS、BEA 與主要公司 IR。</w:t>
+            </w:r>
+          </w:p>
+        </w:tc>
+        <w:tc>
+          <w:tcPr>
+            <w:tcW w:type="dxa" w:w="1040"/>
+          </w:tcPr>
+          <w:p>
+            <w:pPr>
+              <w:jc w:val="left"/>
+            </w:pPr>
+            <w:r>
+              <w:rPr>
+                <w:rFonts w:ascii="Heiti TC" w:hAnsi="Heiti TC" w:eastAsia="Heiti TC" w:cs="Heiti TC"/>
+                <w:b w:val="0"/>
+                <w:sz w:val="20"/>
+              </w:rPr>
+              <w:t>讓歷史回補是否可用能被直接檢查，並降低 Google News 歷史索引不完整、重複報導與單一媒體偏差。</w:t>
+            </w:r>
+          </w:p>
+        </w:tc>
+        <w:tc>
+          <w:tcPr>
+            <w:tcW w:type="dxa" w:w="1040"/>
+          </w:tcPr>
+          <w:p>
+            <w:pPr>
+              <w:jc w:val="left"/>
+            </w:pPr>
+            <w:r>
+              <w:rPr>
+                <w:rFonts w:ascii="Heiti TC" w:hAnsi="Heiti TC" w:eastAsia="Heiti TC" w:cs="Heiti TC"/>
+                <w:b w:val="0"/>
+                <w:sz w:val="20"/>
+              </w:rPr>
+              <w:t>歷史新聞回補、KG 回測、資料治理、Streamlit 金融知識圖譜頁、例行檢查</w:t>
+            </w:r>
+          </w:p>
+        </w:tc>
+        <w:tc>
+          <w:tcPr>
+            <w:tcW w:type="dxa" w:w="1040"/>
+          </w:tcPr>
+          <w:p>
+            <w:pPr>
+              <w:jc w:val="left"/>
+            </w:pPr>
+            <w:r>
+              <w:rPr>
+                <w:rFonts w:ascii="Heiti TC" w:hAnsi="Heiti TC" w:eastAsia="Heiti TC" w:cs="Heiti TC"/>
+                <w:b w:val="0"/>
+                <w:sz w:val="20"/>
+              </w:rPr>
+            </w:r>
+          </w:p>
+        </w:tc>
+      </w:tr>
     </w:tbl>
     <w:p>
       <w:pPr>
@@ -8852,6 +9096,80 @@
                 <w:sz w:val="20"/>
               </w:rPr>
               <w:t>目前只有 29 個完整 KG 回測樣本，直接調權重容易過度擬合；以分市場環境門檻與獨立驗證避免樣本集中於單一多空週期。</w:t>
+            </w:r>
+          </w:p>
+        </w:tc>
+        <w:tc>
+          <w:tcPr>
+            <w:tcW w:type="dxa" w:w="2340"/>
+          </w:tcPr>
+          <w:p>
+            <w:pPr>
+              <w:jc w:val="left"/>
+            </w:pPr>
+            <w:r>
+              <w:rPr>
+                <w:rFonts w:ascii="Heiti TC" w:hAnsi="Heiti TC" w:eastAsia="Heiti TC" w:cs="Heiti TC"/>
+                <w:b w:val="0"/>
+                <w:sz w:val="20"/>
+              </w:rPr>
+              <w:t>Codex 已確認決策</w:t>
+            </w:r>
+          </w:p>
+        </w:tc>
+      </w:tr>
+      <w:tr>
+        <w:tc>
+          <w:tcPr>
+            <w:tcW w:type="dxa" w:w="2340"/>
+          </w:tcPr>
+          <w:p>
+            <w:pPr>
+              <w:jc w:val="left"/>
+            </w:pPr>
+            <w:r>
+              <w:rPr>
+                <w:rFonts w:ascii="Heiti TC" w:hAnsi="Heiti TC" w:eastAsia="Heiti TC" w:cs="Heiti TC"/>
+                <w:b w:val="0"/>
+                <w:sz w:val="20"/>
+              </w:rPr>
+              <w:t>2026-10-21</w:t>
+            </w:r>
+          </w:p>
+        </w:tc>
+        <w:tc>
+          <w:tcPr>
+            <w:tcW w:type="dxa" w:w="2340"/>
+          </w:tcPr>
+          <w:p>
+            <w:pPr>
+              <w:jc w:val="left"/>
+            </w:pPr>
+            <w:r>
+              <w:rPr>
+                <w:rFonts w:ascii="Heiti TC" w:hAnsi="Heiti TC" w:eastAsia="Heiti TC" w:cs="Heiti TC"/>
+                <w:b w:val="0"/>
+                <w:sz w:val="20"/>
+              </w:rPr>
+              <w:t>KG 歷史回補品質控制台與官方來源優先</w:t>
+            </w:r>
+          </w:p>
+        </w:tc>
+        <w:tc>
+          <w:tcPr>
+            <w:tcW w:type="dxa" w:w="2340"/>
+          </w:tcPr>
+          <w:p>
+            <w:pPr>
+              <w:jc w:val="left"/>
+            </w:pPr>
+            <w:r>
+              <w:rPr>
+                <w:rFonts w:ascii="Heiti TC" w:hAnsi="Heiti TC" w:eastAsia="Heiti TC" w:cs="Heiti TC"/>
+                <w:b w:val="0"/>
+                <w:sz w:val="20"/>
+              </w:rPr>
+              <w:t>讓歷史回補是否可用能被直接檢查，並降低 Google News 歷史索引不完整、重複報導與單一媒體偏差。</w:t>
             </w:r>
           </w:p>
         </w:tc>

</xml_diff>

<commit_message>
Add official event layer and balanced KG backfill
</commit_message>
<xml_diff>
--- a/data/觀察版資料/13_專案記憶/專案記憶與討論摘要.docx
+++ b/data/觀察版資料/13_專案記憶/專案記憶與討論摘要.docx
@@ -26,7 +26,7 @@
           <w:b w:val="0"/>
           <w:sz w:val="20"/>
         </w:rPr>
-        <w:t>產生時間：2026-10-21 12:21 UTC｜來源：專案記憶資料夾</w:t>
+        <w:t>產生時間：2026-10-21 12:30 UTC｜來源：專案記憶資料夾</w:t>
       </w:r>
     </w:p>
     <w:p>
@@ -156,7 +156,7 @@
                 <w:b w:val="0"/>
                 <w:sz w:val="20"/>
               </w:rPr>
-              <w:t>23</w:t>
+              <w:t>24</w:t>
             </w:r>
           </w:p>
         </w:tc>
@@ -212,7 +212,7 @@
                 <w:b w:val="0"/>
                 <w:sz w:val="20"/>
               </w:rPr>
-              <w:t>22</w:t>
+              <w:t>23</w:t>
             </w:r>
           </w:p>
         </w:tc>
@@ -499,7 +499,7 @@
                 <w:b w:val="0"/>
                 <w:sz w:val="20"/>
               </w:rPr>
-              <w:t>KG 歷史回補品質控制台與官方來源優先</w:t>
+              <w:t>官方事件層、基本面歷史修復與平衡回補</w:t>
             </w:r>
           </w:p>
         </w:tc>
@@ -573,7 +573,7 @@
                 <w:b w:val="0"/>
                 <w:sz w:val="20"/>
               </w:rPr>
-              <w:t>KG 因子有效性與模型權重調整啟動門檻</w:t>
+              <w:t>KG 歷史回補品質控制台與官方來源優先</w:t>
             </w:r>
           </w:p>
         </w:tc>
@@ -591,7 +591,7 @@
                 <w:b w:val="0"/>
                 <w:sz w:val="20"/>
               </w:rPr>
-              <w:t>待執行</w:t>
+              <w:t>已執行</w:t>
             </w:r>
           </w:p>
         </w:tc>
@@ -647,7 +647,7 @@
                 <w:b w:val="0"/>
                 <w:sz w:val="20"/>
               </w:rPr>
-              <w:t>歷史多來源事件回補與 KG 回測管線</w:t>
+              <w:t>KG 因子有效性與模型權重調整啟動門檻</w:t>
             </w:r>
           </w:p>
         </w:tc>
@@ -665,7 +665,7 @@
                 <w:b w:val="0"/>
                 <w:sz w:val="20"/>
               </w:rPr>
-              <w:t>已執行</w:t>
+              <w:t>待執行</w:t>
             </w:r>
           </w:p>
         </w:tc>
@@ -721,7 +721,7 @@
                 <w:b w:val="0"/>
                 <w:sz w:val="20"/>
               </w:rPr>
-              <w:t>模型快取精簡發布與 40 MB 安全門檻</w:t>
+              <w:t>歷史多來源事件回補與 KG 回測管線</w:t>
             </w:r>
           </w:p>
         </w:tc>
@@ -795,7 +795,7 @@
                 <w:b w:val="0"/>
                 <w:sz w:val="20"/>
               </w:rPr>
-              <w:t>八檔共享模型與 TSLA 專屬模型</w:t>
+              <w:t>模型快取精簡發布與 40 MB 安全門檻</w:t>
             </w:r>
           </w:p>
         </w:tc>
@@ -869,7 +869,7 @@
                 <w:b w:val="0"/>
                 <w:sz w:val="20"/>
               </w:rPr>
-              <w:t>KG 歷史回補品質控制台與官方來源優先</w:t>
+              <w:t>官方事件層、基本面歷史修復與平衡回補</w:t>
             </w:r>
           </w:p>
         </w:tc>
@@ -943,7 +943,7 @@
                 <w:b w:val="0"/>
                 <w:sz w:val="20"/>
               </w:rPr>
-              <w:t>KG 因子有效性與模型權重調整啟動門檻</w:t>
+              <w:t>KG 歷史回補品質控制台與官方來源優先</w:t>
             </w:r>
           </w:p>
         </w:tc>
@@ -1017,7 +1017,7 @@
                 <w:b w:val="0"/>
                 <w:sz w:val="20"/>
               </w:rPr>
-              <w:t>歷史多來源事件回補與 KG 回測管線</w:t>
+              <w:t>KG 因子有效性與模型權重調整啟動門檻</w:t>
             </w:r>
           </w:p>
         </w:tc>
@@ -1091,7 +1091,7 @@
                 <w:b w:val="0"/>
                 <w:sz w:val="20"/>
               </w:rPr>
-              <w:t>模型快取精簡發布與 40 MB 安全門檻</w:t>
+              <w:t>歷史多來源事件回補與 KG 回測管線</w:t>
             </w:r>
           </w:p>
         </w:tc>
@@ -1165,7 +1165,7 @@
                 <w:b w:val="0"/>
                 <w:sz w:val="20"/>
               </w:rPr>
-              <w:t>八檔共享模型與 TSLA 專屬模型</w:t>
+              <w:t>模型快取精簡發布與 40 MB 安全門檻</w:t>
             </w:r>
           </w:p>
         </w:tc>
@@ -2024,6 +2024,33 @@
     </w:p>
     <w:p>
       <w:pPr>
+        <w:spacing w:before="200" w:after="120"/>
+      </w:pPr>
+      <w:r>
+        <w:rPr>
+          <w:rFonts w:ascii="Heiti TC" w:hAnsi="Heiti TC" w:eastAsia="Heiti TC" w:cs="Heiti TC"/>
+          <w:b w:val="0"/>
+          <w:sz w:val="26"/>
+        </w:rPr>
+        <w:t>2026-10-21｜官方事件層、基本面歷史修復與平衡回補</w:t>
+      </w:r>
+    </w:p>
+    <w:p>
+      <w:pPr>
+        <w:pStyle w:val="ListBullet"/>
+        <w:spacing w:after="60" w:line="276" w:lineRule="auto"/>
+      </w:pPr>
+      <w:r>
+        <w:rPr>
+          <w:rFonts w:ascii="Heiti TC" w:hAnsi="Heiti TC" w:eastAsia="Heiti TC" w:cs="Heiti TC"/>
+          <w:b w:val="0"/>
+          <w:sz w:val="22"/>
+        </w:rPr>
+        <w:t>官方資料必須保留來源、事件或觀測日期、發布時間依據、原始值、數值與修訂狀態。沒有精確發布時間的資料不得被當作當時已知訊號。</w:t>
+      </w:r>
+    </w:p>
+    <w:p>
+      <w:pPr>
         <w:spacing w:before="280" w:after="120"/>
       </w:pPr>
       <w:r>
@@ -3019,6 +3046,33 @@
     </w:p>
     <w:p>
       <w:pPr>
+        <w:spacing w:before="200" w:after="120"/>
+      </w:pPr>
+      <w:r>
+        <w:rPr>
+          <w:rFonts w:ascii="Heiti TC" w:hAnsi="Heiti TC" w:eastAsia="Heiti TC" w:cs="Heiti TC"/>
+          <w:b w:val="0"/>
+          <w:sz w:val="26"/>
+        </w:rPr>
+        <w:t>2026-10-21｜官方事件層、基本面歷史修復與平衡回補</w:t>
+      </w:r>
+    </w:p>
+    <w:p>
+      <w:pPr>
+        <w:pStyle w:val="ListBullet"/>
+        <w:spacing w:after="60" w:line="276" w:lineRule="auto"/>
+      </w:pPr>
+      <w:r>
+        <w:rPr>
+          <w:rFonts w:ascii="Heiti TC" w:hAnsi="Heiti TC" w:eastAsia="Heiti TC" w:cs="Heiti TC"/>
+          <w:b w:val="0"/>
+          <w:sz w:val="22"/>
+        </w:rPr>
+        <w:t>使用者確認執行官方事件資料層、252 個基本面缺口診斷與市場環境平衡回補。BLS/BEA 沒有精確發布時間的舊觀測只保存，不進入 point-in-time 回測。</w:t>
+      </w:r>
+    </w:p>
+    <w:p>
+      <w:pPr>
         <w:spacing w:before="280" w:after="120"/>
       </w:pPr>
       <w:r>
@@ -3667,6 +3721,33 @@
           <w:sz w:val="22"/>
         </w:rPr>
         <w:t>已執行：KG 品質控制台、官方來源優先搜尋與寫入層去重。首次實測新增 73 筆證據，完整 KG 樣本增至 30，未來洩漏 0、重複事件 0。</w:t>
+      </w:r>
+    </w:p>
+    <w:p>
+      <w:pPr>
+        <w:spacing w:before="200" w:after="120"/>
+      </w:pPr>
+      <w:r>
+        <w:rPr>
+          <w:rFonts w:ascii="Heiti TC" w:hAnsi="Heiti TC" w:eastAsia="Heiti TC" w:cs="Heiti TC"/>
+          <w:b w:val="0"/>
+          <w:sz w:val="26"/>
+        </w:rPr>
+        <w:t>2026-10-21｜官方事件層、基本面歷史修復與平衡回補</w:t>
+      </w:r>
+    </w:p>
+    <w:p>
+      <w:pPr>
+        <w:pStyle w:val="ListBullet"/>
+        <w:spacing w:after="60" w:line="276" w:lineRule="auto"/>
+      </w:pPr>
+      <w:r>
+        <w:rPr>
+          <w:rFonts w:ascii="Heiti TC" w:hAnsi="Heiti TC" w:eastAsia="Heiti TC" w:cs="Heiti TC"/>
+          <w:b w:val="0"/>
+          <w:sz w:val="22"/>
+        </w:rPr>
+        <w:t>已執行：SEC/Fed 精確日期事件可進入歷史證據；BLS/BEA 保存為 current official vintage。SEC 基本面完整樣本增至 326，官方範圍外 142 筆不再等待，部分可用 32 筆。</w:t>
       </w:r>
     </w:p>
     <w:p>
@@ -7611,6 +7692,169 @@
           </w:p>
         </w:tc>
       </w:tr>
+      <w:tr>
+        <w:tc>
+          <w:tcPr>
+            <w:tcW w:type="dxa" w:w="1040"/>
+          </w:tcPr>
+          <w:p>
+            <w:pPr>
+              <w:jc w:val="left"/>
+            </w:pPr>
+            <w:r>
+              <w:rPr>
+                <w:rFonts w:ascii="Heiti TC" w:hAnsi="Heiti TC" w:eastAsia="Heiti TC" w:cs="Heiti TC"/>
+                <w:b w:val="0"/>
+                <w:sz w:val="20"/>
+              </w:rPr>
+              <w:t>D-024</w:t>
+            </w:r>
+          </w:p>
+        </w:tc>
+        <w:tc>
+          <w:tcPr>
+            <w:tcW w:type="dxa" w:w="1040"/>
+          </w:tcPr>
+          <w:p>
+            <w:pPr>
+              <w:jc w:val="left"/>
+            </w:pPr>
+            <w:r>
+              <w:rPr>
+                <w:rFonts w:ascii="Heiti TC" w:hAnsi="Heiti TC" w:eastAsia="Heiti TC" w:cs="Heiti TC"/>
+                <w:b w:val="0"/>
+                <w:sz w:val="20"/>
+              </w:rPr>
+              <w:t>2026-10-21</w:t>
+            </w:r>
+          </w:p>
+        </w:tc>
+        <w:tc>
+          <w:tcPr>
+            <w:tcW w:type="dxa" w:w="1040"/>
+          </w:tcPr>
+          <w:p>
+            <w:pPr>
+              <w:jc w:val="left"/>
+            </w:pPr>
+            <w:r>
+              <w:rPr>
+                <w:rFonts w:ascii="Heiti TC" w:hAnsi="Heiti TC" w:eastAsia="Heiti TC" w:cs="Heiti TC"/>
+                <w:b w:val="0"/>
+                <w:sz w:val="20"/>
+              </w:rPr>
+              <w:t>已執行</w:t>
+            </w:r>
+          </w:p>
+        </w:tc>
+        <w:tc>
+          <w:tcPr>
+            <w:tcW w:type="dxa" w:w="1040"/>
+          </w:tcPr>
+          <w:p>
+            <w:pPr>
+              <w:jc w:val="left"/>
+            </w:pPr>
+            <w:r>
+              <w:rPr>
+                <w:rFonts w:ascii="Heiti TC" w:hAnsi="Heiti TC" w:eastAsia="Heiti TC" w:cs="Heiti TC"/>
+                <w:b w:val="0"/>
+                <w:sz w:val="20"/>
+              </w:rPr>
+              <w:t>資料工程</w:t>
+            </w:r>
+          </w:p>
+        </w:tc>
+        <w:tc>
+          <w:tcPr>
+            <w:tcW w:type="dxa" w:w="1040"/>
+          </w:tcPr>
+          <w:p>
+            <w:pPr>
+              <w:jc w:val="left"/>
+            </w:pPr>
+            <w:r>
+              <w:rPr>
+                <w:rFonts w:ascii="Heiti TC" w:hAnsi="Heiti TC" w:eastAsia="Heiti TC" w:cs="Heiti TC"/>
+                <w:b w:val="0"/>
+                <w:sz w:val="20"/>
+              </w:rPr>
+              <w:t>官方事件層、基本面歷史修復與平衡回補</w:t>
+            </w:r>
+          </w:p>
+        </w:tc>
+        <w:tc>
+          <w:tcPr>
+            <w:tcW w:type="dxa" w:w="1040"/>
+          </w:tcPr>
+          <w:p>
+            <w:pPr>
+              <w:jc w:val="left"/>
+            </w:pPr>
+            <w:r>
+              <w:rPr>
+                <w:rFonts w:ascii="Heiti TC" w:hAnsi="Heiti TC" w:eastAsia="Heiti TC" w:cs="Heiti TC"/>
+                <w:b w:val="0"/>
+                <w:sz w:val="20"/>
+              </w:rPr>
+              <w:t>建立 SEC、Fed、BLS、BEA 官方事件與觀測層；修正 SEC 歷史 XBRL concept 遺漏；基本面缺口改為可補、部分可用或官方範圍外；歷史回補依各市場環境合格樣本數由少至多排序，每日上限由 8 調為 12。</w:t>
+            </w:r>
+          </w:p>
+        </w:tc>
+        <w:tc>
+          <w:tcPr>
+            <w:tcW w:type="dxa" w:w="1040"/>
+          </w:tcPr>
+          <w:p>
+            <w:pPr>
+              <w:jc w:val="left"/>
+            </w:pPr>
+            <w:r>
+              <w:rPr>
+                <w:rFonts w:ascii="Heiti TC" w:hAnsi="Heiti TC" w:eastAsia="Heiti TC" w:cs="Heiti TC"/>
+                <w:b w:val="0"/>
+                <w:sz w:val="20"/>
+              </w:rPr>
+              <w:t>提高 point-in-time 官方證據覆蓋，避免舊 XBRL 欄位被誤判為缺值，並修正高波動樣本過度集中的問題。</w:t>
+            </w:r>
+          </w:p>
+        </w:tc>
+        <w:tc>
+          <w:tcPr>
+            <w:tcW w:type="dxa" w:w="1040"/>
+          </w:tcPr>
+          <w:p>
+            <w:pPr>
+              <w:jc w:val="left"/>
+            </w:pPr>
+            <w:r>
+              <w:rPr>
+                <w:rFonts w:ascii="Heiti TC" w:hAnsi="Heiti TC" w:eastAsia="Heiti TC" w:cs="Heiti TC"/>
+                <w:b w:val="0"/>
+                <w:sz w:val="20"/>
+              </w:rPr>
+              <w:t>官方事件層、SEC 基本面、KG 回測資格、歷史回補排程、Streamlit 品質控制台</w:t>
+            </w:r>
+          </w:p>
+        </w:tc>
+        <w:tc>
+          <w:tcPr>
+            <w:tcW w:type="dxa" w:w="1040"/>
+          </w:tcPr>
+          <w:p>
+            <w:pPr>
+              <w:jc w:val="left"/>
+            </w:pPr>
+            <w:r>
+              <w:rPr>
+                <w:rFonts w:ascii="Heiti TC" w:hAnsi="Heiti TC" w:eastAsia="Heiti TC" w:cs="Heiti TC"/>
+                <w:b w:val="0"/>
+                <w:sz w:val="20"/>
+              </w:rPr>
+            </w:r>
+          </w:p>
+        </w:tc>
+      </w:tr>
     </w:tbl>
     <w:p>
       <w:pPr>
@@ -9170,6 +9414,80 @@
                 <w:sz w:val="20"/>
               </w:rPr>
               <w:t>讓歷史回補是否可用能被直接檢查，並降低 Google News 歷史索引不完整、重複報導與單一媒體偏差。</w:t>
+            </w:r>
+          </w:p>
+        </w:tc>
+        <w:tc>
+          <w:tcPr>
+            <w:tcW w:type="dxa" w:w="2340"/>
+          </w:tcPr>
+          <w:p>
+            <w:pPr>
+              <w:jc w:val="left"/>
+            </w:pPr>
+            <w:r>
+              <w:rPr>
+                <w:rFonts w:ascii="Heiti TC" w:hAnsi="Heiti TC" w:eastAsia="Heiti TC" w:cs="Heiti TC"/>
+                <w:b w:val="0"/>
+                <w:sz w:val="20"/>
+              </w:rPr>
+              <w:t>Codex 已確認決策</w:t>
+            </w:r>
+          </w:p>
+        </w:tc>
+      </w:tr>
+      <w:tr>
+        <w:tc>
+          <w:tcPr>
+            <w:tcW w:type="dxa" w:w="2340"/>
+          </w:tcPr>
+          <w:p>
+            <w:pPr>
+              <w:jc w:val="left"/>
+            </w:pPr>
+            <w:r>
+              <w:rPr>
+                <w:rFonts w:ascii="Heiti TC" w:hAnsi="Heiti TC" w:eastAsia="Heiti TC" w:cs="Heiti TC"/>
+                <w:b w:val="0"/>
+                <w:sz w:val="20"/>
+              </w:rPr>
+              <w:t>2026-10-21</w:t>
+            </w:r>
+          </w:p>
+        </w:tc>
+        <w:tc>
+          <w:tcPr>
+            <w:tcW w:type="dxa" w:w="2340"/>
+          </w:tcPr>
+          <w:p>
+            <w:pPr>
+              <w:jc w:val="left"/>
+            </w:pPr>
+            <w:r>
+              <w:rPr>
+                <w:rFonts w:ascii="Heiti TC" w:hAnsi="Heiti TC" w:eastAsia="Heiti TC" w:cs="Heiti TC"/>
+                <w:b w:val="0"/>
+                <w:sz w:val="20"/>
+              </w:rPr>
+              <w:t>官方事件層、基本面歷史修復與平衡回補</w:t>
+            </w:r>
+          </w:p>
+        </w:tc>
+        <w:tc>
+          <w:tcPr>
+            <w:tcW w:type="dxa" w:w="2340"/>
+          </w:tcPr>
+          <w:p>
+            <w:pPr>
+              <w:jc w:val="left"/>
+            </w:pPr>
+            <w:r>
+              <w:rPr>
+                <w:rFonts w:ascii="Heiti TC" w:hAnsi="Heiti TC" w:eastAsia="Heiti TC" w:cs="Heiti TC"/>
+                <w:b w:val="0"/>
+                <w:sz w:val="20"/>
+              </w:rPr>
+              <w:t>提高 point-in-time 官方證據覆蓋，避免舊 XBRL 欄位被誤判為缺值，並修正高波動樣本過度集中的問題。</w:t>
             </w:r>
           </w:p>
         </w:tc>

</xml_diff>